<commit_message>
docs: refresh slides 2-39 scripts from latest KAITO llm-d deck
Signed-off-by: andyzhangx <xiazhang@microsoft.com>
</commit_message>
<xml_diff>
--- a/llm/pd-disaggregation/kubecon-na-2026-pd-disaggregation-kaito-llmd.docx
+++ b/llm/pd-disaggregation/kubecon-na-2026-pd-disaggregation-kaito-llmd.docx
@@ -177,7 +177,7 @@
         <w:rPr>
           <w:b w:val="0"/>
         </w:rPr>
-        <w:t xml:space="preserve">Here’s the agenda. We’ll start with inference basics, what are the prefill and decode processes, and why it makes sense to separate them. Then, , I will  introduce </w:t>
+        <w:t xml:space="preserve">Here’s the agenda. We’ll start with inference basics, what are the prefill and decode processes, and why it makes sense to separate them. Then, I will  introduce </w:t>
       </w:r>
       <w:r>
         <w:rPr>
@@ -206,9 +206,15 @@
       </w:pPr>
       <w:r>
         <w:rPr>
-          <w:b w:val="0"/>
-        </w:rPr>
-        <w:t xml:space="preserve">Here is an example for prefill process. </w:t>
+          <w:b/>
+        </w:rPr>
+        <w:t>Here is an example for prefill process</w:t>
+      </w:r>
+      <w:r>
+        <w:rPr>
+          <w:b w:val="0"/>
+        </w:rPr>
+        <w:t xml:space="preserve">. </w:t>
       </w:r>
       <w:r>
         <w:rPr>
@@ -342,7 +348,13 @@
         <w:rPr>
           <w:b w:val="0"/>
         </w:rPr>
-        <w:t xml:space="preserve">We want answers to start quickly—and keep going smoothly. </w:t>
+        <w:t xml:space="preserve">So for </w:t>
+      </w:r>
+      <w:r>
+        <w:rPr>
+          <w:b w:val="0"/>
+        </w:rPr>
+        <w:t>one request, there two latency targets.</w:t>
       </w:r>
     </w:p>
     <w:p>
@@ -353,25 +365,13 @@
         <w:rPr>
           <w:b w:val="0"/>
         </w:rPr>
-        <w:t xml:space="preserve">Prefill determines </w:t>
-      </w:r>
-      <w:r>
-        <w:rPr>
-          <w:b w:val="0"/>
-        </w:rPr>
-        <w:t xml:space="preserve">how soon the answer starts, so it determines </w:t>
-      </w:r>
-      <w:r>
-        <w:rPr>
-          <w:b w:val="0"/>
-        </w:rPr>
-        <w:t xml:space="preserve">time to first token, TTFT, and </w:t>
-      </w:r>
-      <w:r>
-        <w:rPr>
-          <w:b w:val="0"/>
-        </w:rPr>
-        <w:t>Prefill processes the input and is often compute-bound.</w:t>
+        <w:t xml:space="preserve">We want answers to start quickly—and keep going smoothly, </w:t>
+      </w:r>
+      <w:r>
+        <w:rPr>
+          <w:b/>
+        </w:rPr>
+        <w:t>that’s our goal.</w:t>
       </w:r>
     </w:p>
     <w:p>
@@ -382,31 +382,25 @@
         <w:rPr>
           <w:b w:val="0"/>
         </w:rPr>
-        <w:t xml:space="preserve">Decode determines whether the answer keeps flowing, </w:t>
-      </w:r>
-      <w:r>
-        <w:rPr>
-          <w:b w:val="0"/>
-        </w:rPr>
-        <w:t xml:space="preserve">so it determines </w:t>
-      </w:r>
-      <w:r>
-        <w:rPr>
-          <w:b w:val="0"/>
-        </w:rPr>
-        <w:t xml:space="preserve">inter-token, ITL, and decode is often </w:t>
-      </w:r>
-      <w:r>
-        <w:rPr>
-          <w:b w:val="0"/>
-        </w:rPr>
-        <w:t>memory bandwidth bound</w:t>
-      </w:r>
-      <w:r>
-        <w:rPr>
-          <w:b w:val="0"/>
-        </w:rPr>
-        <w:t xml:space="preserve">. Queueing and delivery matter too. </w:t>
+        <w:t xml:space="preserve">Prefill determines </w:t>
+      </w:r>
+      <w:r>
+        <w:rPr>
+          <w:b w:val="0"/>
+        </w:rPr>
+        <w:t xml:space="preserve">how soon the answer starts, so it determines </w:t>
+      </w:r>
+      <w:r>
+        <w:rPr>
+          <w:b w:val="0"/>
+        </w:rPr>
+        <w:t xml:space="preserve">time to first token, TTFT, and </w:t>
+      </w:r>
+      <w:r>
+        <w:rPr>
+          <w:b w:val="0"/>
+        </w:rPr>
+        <w:t>Prefill processes the input and is often compute-bound.</w:t>
       </w:r>
     </w:p>
     <w:p>
@@ -417,26 +411,50 @@
         <w:rPr>
           <w:b w:val="0"/>
         </w:rPr>
-        <w:t xml:space="preserve">Our goal is to serve more requests while meeting both latency targets. SLO goodput means the number of requests per second that meet both targets. </w:t>
+        <w:t xml:space="preserve">Decode determines whether the answer keeps flowing, </w:t>
+      </w:r>
+      <w:r>
+        <w:rPr>
+          <w:b w:val="0"/>
+        </w:rPr>
+        <w:t xml:space="preserve">so it determines </w:t>
+      </w:r>
+      <w:r>
+        <w:rPr>
+          <w:b w:val="0"/>
+        </w:rPr>
+        <w:t xml:space="preserve">inter-token, ITL, and decode is often </w:t>
+      </w:r>
+      <w:r>
+        <w:rPr>
+          <w:b w:val="0"/>
+        </w:rPr>
+        <w:t>memory bandwidth bound</w:t>
+      </w:r>
+      <w:r>
+        <w:rPr>
+          <w:b w:val="0"/>
+        </w:rPr>
+        <w:t xml:space="preserve">. Queueing and delivery matter too. </w:t>
       </w:r>
     </w:p>
     <w:p>
       <w:pPr>
-        <w:pStyle w:val="Heading1"/>
-      </w:pPr>
-      <w:r>
-        <w:t>Slide 8 — One shared pool ties two capacity decisions together</w:t>
+        <w:keepLines/>
+      </w:pPr>
+      <w:r>
+        <w:rPr>
+          <w:b w:val="0"/>
+        </w:rPr>
+        <w:t xml:space="preserve">Our goal is to serve more requests while meeting both latency targets. SLO goodput means the number of requests per second that meet both targets. </w:t>
       </w:r>
     </w:p>
     <w:p>
       <w:pPr>
-        <w:keepLines/>
-      </w:pPr>
-      <w:r>
-        <w:rPr>
-          <w:b w:val="0"/>
-        </w:rPr>
-        <w:t>One shared pool ties two capacity decisions together</w:t>
+        <w:pStyle w:val="Heading1"/>
+      </w:pPr>
+      <w:r>
+        <w:t>Slide 8 — One shared pool ties two capacity decisions together</w:t>
       </w:r>
     </w:p>
     <w:p>
@@ -447,19 +465,7 @@
         <w:rPr>
           <w:b w:val="0"/>
         </w:rPr>
-        <w:t xml:space="preserve">A shared pool is simple, but prefill bursts compete with active decoding. </w:t>
-      </w:r>
-      <w:r>
-        <w:rPr>
-          <w:b/>
-        </w:rPr>
-        <w:t>Every worker handles both phases</w:t>
-      </w:r>
-      <w:r>
-        <w:rPr>
-          <w:b w:val="0"/>
-        </w:rPr>
-        <w:t>. One deployment scales both phases together.</w:t>
+        <w:t>One shared pool ties two capacity decisions together</w:t>
       </w:r>
     </w:p>
     <w:p>
@@ -470,26 +476,62 @@
         <w:rPr>
           <w:b w:val="0"/>
         </w:rPr>
-        <w:t xml:space="preserve">Where is the trade-off? Prompt bursts can disrupt token delivery. Adding a replica adds both phases, even if only one is busy. We must decide how to run each phase and how much shared capacity to add. </w:t>
+        <w:t xml:space="preserve">A shared pool is simple, but prefill bursts compete with active decoding. </w:t>
+      </w:r>
+      <w:r>
+        <w:rPr>
+          <w:b/>
+        </w:rPr>
+        <w:t>Every worker handles both phases</w:t>
+      </w:r>
+      <w:r>
+        <w:rPr>
+          <w:b w:val="0"/>
+        </w:rPr>
+        <w:t>. One deployment scales both phases together.</w:t>
       </w:r>
     </w:p>
     <w:p>
       <w:pPr>
-        <w:pStyle w:val="Heading1"/>
-      </w:pPr>
-      <w:r>
-        <w:t>Slide 9 — Long prefills can interrupt token delivery</w:t>
+        <w:keepLines/>
+      </w:pPr>
+      <w:r>
+        <w:rPr>
+          <w:b w:val="0"/>
+        </w:rPr>
+        <w:t xml:space="preserve">Where is the trade-off? Prompt bursts can disrupt token delivery. </w:t>
+      </w:r>
+      <w:r>
+        <w:rPr>
+          <w:b w:val="0"/>
+        </w:rPr>
+        <w:t xml:space="preserve">We scale the whole replica, even when only prefill or decode needs more </w:t>
+      </w:r>
+      <w:r>
+        <w:rPr>
+          <w:b w:val="0"/>
+        </w:rPr>
+        <w:t>capacity.</w:t>
+      </w:r>
+      <w:r>
+        <w:rPr>
+          <w:b w:val="0"/>
+        </w:rPr>
+        <w:t>We</w:t>
+      </w:r>
+      <w:r>
+        <w:rPr>
+          <w:b w:val="0"/>
+        </w:rPr>
+        <w:t xml:space="preserve"> must decide how to run each phase and how much shared capacity to add. </w:t>
       </w:r>
     </w:p>
     <w:p>
       <w:pPr>
-        <w:keepLines/>
-      </w:pPr>
-      <w:r>
-        <w:rPr>
-          <w:b w:val="0"/>
-        </w:rPr>
-        <w:t>Long prefills can interrupt token delivery.</w:t>
+        <w:pStyle w:val="Heading1"/>
+      </w:pPr>
+      <w:r>
+        <w:t>Slide 9 — Long prefills can interrupt token delivery</w:t>
       </w:r>
     </w:p>
     <w:p>
@@ -500,13 +542,7 @@
         <w:rPr>
           <w:b w:val="0"/>
         </w:rPr>
-        <w:t xml:space="preserve">In this slide, </w:t>
-      </w:r>
-      <w:r>
-        <w:rPr>
-          <w:b w:val="0"/>
-        </w:rPr>
-        <w:t xml:space="preserve">D is ongoing decode. P is prefill for a new request. Where should P run? </w:t>
+        <w:t>Long prefills can interrupt token delivery.</w:t>
       </w:r>
     </w:p>
     <w:p>
@@ -517,19 +553,13 @@
         <w:rPr>
           <w:b w:val="0"/>
         </w:rPr>
-        <w:t xml:space="preserve">On the shared GPU graph, </w:t>
-      </w:r>
-      <w:r>
-        <w:rPr>
-          <w:b/>
-        </w:rPr>
-        <w:t xml:space="preserve">there are one prefill task and 4 ongoing decoding tasks, you could see </w:t>
-      </w:r>
-      <w:r>
-        <w:rPr>
-          <w:b w:val="0"/>
-        </w:rPr>
-        <w:t xml:space="preserve">that prefill can pause decode. </w:t>
+        <w:t xml:space="preserve">In this slide, </w:t>
+      </w:r>
+      <w:r>
+        <w:rPr>
+          <w:b w:val="0"/>
+        </w:rPr>
+        <w:t xml:space="preserve">D is ongoing decode. P is prefill for a new request. Where should P run? </w:t>
       </w:r>
     </w:p>
     <w:p>
@@ -540,37 +570,19 @@
         <w:rPr>
           <w:b w:val="0"/>
         </w:rPr>
-        <w:t xml:space="preserve">On the separate GPUs </w:t>
-      </w:r>
-      <w:r>
-        <w:rPr>
-          <w:b w:val="0"/>
-        </w:rPr>
-        <w:t>graph</w:t>
-      </w:r>
-      <w:r>
-        <w:rPr>
-          <w:b w:val="0"/>
-        </w:rPr>
-        <w:t xml:space="preserve">, </w:t>
+        <w:t xml:space="preserve">On the shared GPU graph, </w:t>
       </w:r>
       <w:r>
         <w:rPr>
           <w:b/>
         </w:rPr>
-        <w:t>prefill and decode runs on different GPU nodes</w:t>
-      </w:r>
-      <w:r>
-        <w:rPr>
-          <w:b w:val="0"/>
-        </w:rPr>
-        <w:t xml:space="preserve">, and decode can continue while prefill runs elsewhere. The new request still needs a KV handoff in </w:t>
-      </w:r>
-      <w:r>
-        <w:rPr>
-          <w:b w:val="0"/>
-        </w:rPr>
-        <w:t>separate GPUs scenario.</w:t>
+        <w:t xml:space="preserve">there are one prefill task and 4 ongoing decoding workers, you could see </w:t>
+      </w:r>
+      <w:r>
+        <w:rPr>
+          <w:b w:val="0"/>
+        </w:rPr>
+        <w:t xml:space="preserve">that prefill can pause decode. </w:t>
       </w:r>
     </w:p>
     <w:p>
@@ -581,44 +593,80 @@
         <w:rPr>
           <w:b w:val="0"/>
         </w:rPr>
-        <w:t>So</w:t>
+        <w:t xml:space="preserve">On the separate GPUs </w:t>
+      </w:r>
+      <w:r>
+        <w:rPr>
+          <w:b w:val="0"/>
+        </w:rPr>
+        <w:t>graph</w:t>
+      </w:r>
+      <w:r>
+        <w:rPr>
+          <w:b w:val="0"/>
+        </w:rPr>
+        <w:t xml:space="preserve">, </w:t>
       </w:r>
       <w:r>
         <w:rPr>
           <w:b/>
         </w:rPr>
-        <w:t xml:space="preserve"> </w:t>
-      </w:r>
-      <w:r>
-        <w:rPr>
-          <w:b w:val="0"/>
-        </w:rPr>
-        <w:t>Separate GPUs remove this execution conflict, but not every source of latency since it requires KV handoff between nodes.</w:t>
+        <w:t>prefill and decode runs on different GPU nodes</w:t>
+      </w:r>
+      <w:r>
+        <w:rPr>
+          <w:b w:val="0"/>
+        </w:rPr>
+        <w:t xml:space="preserve">, and decode can continue while prefill runs elsewhere. The new request still needs a KV handoff </w:t>
+      </w:r>
+      <w:r>
+        <w:rPr>
+          <w:b/>
+        </w:rPr>
+        <w:t xml:space="preserve">between prefill and decode runtimes </w:t>
+      </w:r>
+      <w:r>
+        <w:rPr>
+          <w:b w:val="0"/>
+        </w:rPr>
+        <w:t xml:space="preserve">in </w:t>
+      </w:r>
+      <w:r>
+        <w:rPr>
+          <w:b w:val="0"/>
+        </w:rPr>
+        <w:t>separate GPUs scenario.</w:t>
       </w:r>
     </w:p>
     <w:p>
       <w:pPr>
-        <w:pStyle w:val="Heading1"/>
-      </w:pPr>
-      <w:r>
-        <w:t>Slide 10 — Prefill and decode batch different work</w:t>
+        <w:keepLines/>
+      </w:pPr>
+      <w:r>
+        <w:rPr>
+          <w:b w:val="0"/>
+        </w:rPr>
+        <w:t>So</w:t>
+      </w:r>
+      <w:r>
+        <w:rPr>
+          <w:b/>
+        </w:rPr>
+        <w:t xml:space="preserve"> </w:t>
+      </w:r>
+      <w:r>
+        <w:rPr>
+          <w:b w:val="0"/>
+        </w:rPr>
+        <w:t>Separate GPUs remove this execution conflict, but not every source of latency since it requires KV handoff between nodes.</w:t>
       </w:r>
     </w:p>
     <w:p>
       <w:pPr>
-        <w:keepLines/>
-      </w:pPr>
-      <w:r>
-        <w:rPr>
-          <w:b w:val="0"/>
-        </w:rPr>
-        <w:t xml:space="preserve">Prefill and decode batch different work, </w:t>
-      </w:r>
-      <w:r>
-        <w:rPr>
-          <w:b w:val="0"/>
-        </w:rPr>
-        <w:t xml:space="preserve">Prefill batches prompt positions; decode batches independent requests. </w:t>
+        <w:pStyle w:val="Heading1"/>
+      </w:pPr>
+      <w:r>
+        <w:t>Slide 10 — Prefill and decode batch different work</w:t>
       </w:r>
     </w:p>
     <w:p>
@@ -629,19 +677,13 @@
         <w:rPr>
           <w:b w:val="0"/>
         </w:rPr>
-        <w:t xml:space="preserve">On the left, prefill processes the prompt’s tokens in parallel. It can also batch multiple prompts together for efficiency. </w:t>
-      </w:r>
-      <w:r>
-        <w:rPr>
-          <w:b/>
-        </w:rPr>
-        <w:t>But within each prompt, every token can only attend to itself and the tokens before it</w:t>
-      </w:r>
-      <w:r>
-        <w:rPr>
-          <w:b/>
-        </w:rPr>
-        <w:t>, that’s called causal attention.</w:t>
+        <w:t xml:space="preserve">Prefill and decode batch different work, </w:t>
+      </w:r>
+      <w:r>
+        <w:rPr>
+          <w:b w:val="0"/>
+        </w:rPr>
+        <w:t xml:space="preserve">Prefill batches prompt positions; decode batches independent requests. </w:t>
       </w:r>
     </w:p>
     <w:p>
@@ -652,31 +694,31 @@
         <w:rPr>
           <w:b w:val="0"/>
         </w:rPr>
-        <w:t xml:space="preserve">On the right </w:t>
-      </w:r>
-      <w:r>
-        <w:rPr>
-          <w:b w:val="0"/>
-        </w:rPr>
-        <w:t>graph</w:t>
-      </w:r>
-      <w:r>
-        <w:rPr>
-          <w:b w:val="0"/>
-        </w:rPr>
-        <w:t xml:space="preserve">, decode consumes one new token per active request, </w:t>
+        <w:t>On the left</w:t>
+      </w:r>
+      <w:r>
+        <w:rPr>
+          <w:b w:val="0"/>
+        </w:rPr>
+        <w:t xml:space="preserve"> graph</w:t>
+      </w:r>
+      <w:r>
+        <w:rPr>
+          <w:b w:val="0"/>
+        </w:rPr>
+        <w:t xml:space="preserve">, prefill processes the prompt’s tokens in parallel. It can also batch multiple prompts together for efficiency. </w:t>
       </w:r>
       <w:r>
         <w:rPr>
           <w:b/>
         </w:rPr>
-        <w:t>read its past KV cache</w:t>
-      </w:r>
-      <w:r>
-        <w:rPr>
-          <w:b w:val="0"/>
-        </w:rPr>
-        <w:t xml:space="preserve">, then select its next output token. </w:t>
+        <w:t>But within each prompt, every token can only attend to itself and the tokens before it</w:t>
+      </w:r>
+      <w:r>
+        <w:rPr>
+          <w:b/>
+        </w:rPr>
+        <w:t>, that’s called causal attention.</w:t>
       </w:r>
     </w:p>
     <w:p>
@@ -687,38 +729,50 @@
         <w:rPr>
           <w:b w:val="0"/>
         </w:rPr>
-        <w:t>Prefill gets parallel work from prompt length; decode gets it from active requests. More decode concurrency can raise ITL. Stay within latency and KV-memory budgets.</w:t>
+        <w:t xml:space="preserve">On the right </w:t>
+      </w:r>
+      <w:r>
+        <w:rPr>
+          <w:b w:val="0"/>
+        </w:rPr>
+        <w:t>graph</w:t>
+      </w:r>
+      <w:r>
+        <w:rPr>
+          <w:b w:val="0"/>
+        </w:rPr>
+        <w:t xml:space="preserve">, decode consumes one new token per active request, </w:t>
+      </w:r>
+      <w:r>
+        <w:rPr>
+          <w:b/>
+        </w:rPr>
+        <w:t>read its past KV cache</w:t>
+      </w:r>
+      <w:r>
+        <w:rPr>
+          <w:b w:val="0"/>
+        </w:rPr>
+        <w:t xml:space="preserve">, then select its next output token. </w:t>
       </w:r>
     </w:p>
     <w:p>
       <w:pPr>
-        <w:pStyle w:val="Heading1"/>
-      </w:pPr>
-      <w:r>
-        <w:t>Slide 11 — Separate GPU pools let us tune each phase independently</w:t>
+        <w:keepLines/>
+      </w:pPr>
+      <w:r>
+        <w:rPr>
+          <w:b w:val="0"/>
+        </w:rPr>
+        <w:t>Prefill gets parallel work from prompt length; decode gets it from active requests. More decode concurrency can raise ITL. Stay within latency and KV-memory budgets.</w:t>
       </w:r>
     </w:p>
     <w:p>
       <w:pPr>
-        <w:keepLines/>
-      </w:pPr>
-      <w:r>
-        <w:rPr>
-          <w:b w:val="0"/>
-        </w:rPr>
-        <w:t xml:space="preserve">Separate GPU pools let us tune each phase independently. </w:t>
-      </w:r>
-      <w:r>
-        <w:rPr>
-          <w:b w:val="0"/>
-        </w:rPr>
-        <w:t xml:space="preserve">The </w:t>
-      </w:r>
-      <w:r>
-        <w:rPr>
-          <w:b w:val="0"/>
-        </w:rPr>
-        <w:t>real benefit is scaling prefill and decode independently to match demand—not simply splitting them into two deployments.</w:t>
+        <w:pStyle w:val="Heading1"/>
+      </w:pPr>
+      <w:r>
+        <w:t>Slide 11 — Separate GPU pools let us tune each phase independently</w:t>
       </w:r>
     </w:p>
     <w:p>
@@ -729,50 +783,62 @@
         <w:rPr>
           <w:b w:val="0"/>
         </w:rPr>
-        <w:t xml:space="preserve">Prefill is often compute-bound. Tune its capacity and parallelism to get better TTFT. On the other hand, decode is often </w:t>
-      </w:r>
-      <w:r>
-        <w:rPr>
-          <w:b w:val="0"/>
-        </w:rPr>
-        <w:t>memory-</w:t>
-      </w:r>
-      <w:r>
-        <w:rPr>
-          <w:b w:val="0"/>
-        </w:rPr>
-        <w:t xml:space="preserve">bandwidth-bound. Tune its capacity and batching to get better ITL. </w:t>
-      </w:r>
-      <w:r>
-        <w:rPr>
-          <w:b/>
-        </w:rPr>
-        <w:t>Different latency targets and resource needs can call for different replicas, tensor parallelism and batching policies</w:t>
-      </w:r>
-      <w:r>
-        <w:rPr>
-          <w:b w:val="0"/>
-        </w:rPr>
-        <w:t>. Split only if the gains outweigh KV transfer, extra weight copies and operating costs.</w:t>
+        <w:t xml:space="preserve">Separate GPU pools let us tune each phase independently. </w:t>
+      </w:r>
+      <w:r>
+        <w:rPr>
+          <w:b w:val="0"/>
+        </w:rPr>
+        <w:t xml:space="preserve">The </w:t>
+      </w:r>
+      <w:r>
+        <w:rPr>
+          <w:b w:val="0"/>
+        </w:rPr>
+        <w:t>real benefit is scaling prefill and decode independently to match demand—not simply splitting them into two deployments.</w:t>
       </w:r>
     </w:p>
     <w:p>
       <w:pPr>
-        <w:pStyle w:val="Heading1"/>
-      </w:pPr>
-      <w:r>
-        <w:t>Slide 12 — The hard part is the Kubernetes wiring to support P/D</w:t>
+        <w:keepLines/>
+      </w:pPr>
+      <w:r>
+        <w:rPr>
+          <w:b w:val="0"/>
+        </w:rPr>
+        <w:t xml:space="preserve">Prefill is often compute-bound. Tune its capacity and parallelism to get better TTFT. On the other hand, decode is often </w:t>
+      </w:r>
+      <w:r>
+        <w:rPr>
+          <w:b w:val="0"/>
+        </w:rPr>
+        <w:t>memory-</w:t>
+      </w:r>
+      <w:r>
+        <w:rPr>
+          <w:b w:val="0"/>
+        </w:rPr>
+        <w:t xml:space="preserve">bandwidth-bound. Tune its capacity and batching to get better ITL. </w:t>
+      </w:r>
+      <w:r>
+        <w:rPr>
+          <w:b/>
+        </w:rPr>
+        <w:t>Different latency targets and resource needs can call for different replicas, tensor parallelism and batching policies</w:t>
+      </w:r>
+      <w:r>
+        <w:rPr>
+          <w:b w:val="0"/>
+        </w:rPr>
+        <w:t>. Split only if the gains outweigh KV transfer, extra weight copies and operating costs.</w:t>
       </w:r>
     </w:p>
     <w:p>
       <w:pPr>
-        <w:keepLines/>
-      </w:pPr>
-      <w:r>
-        <w:rPr>
-          <w:b w:val="0"/>
-        </w:rPr>
-        <w:t>The hard part is the Kubernetes wiring to support prefill and decode disaggregation.</w:t>
+        <w:pStyle w:val="Heading1"/>
+      </w:pPr>
+      <w:r>
+        <w:t>Slide 12 — The hard part is the Kubernetes wiring to support P/D</w:t>
       </w:r>
     </w:p>
     <w:p>
@@ -783,7 +849,7 @@
         <w:rPr>
           <w:b w:val="0"/>
         </w:rPr>
-        <w:t>Two pools still have to work together as one model service. The EPP, or Endpoint Picker, picks workers. KV transfer settings must match. The decode-side proxy coordinates requests. We must keep pods ready as replicas change.</w:t>
+        <w:t>The hard part is the Kubernetes wiring to support prefill and decode disaggregation.</w:t>
       </w:r>
     </w:p>
     <w:p>
@@ -794,27 +860,24 @@
         <w:rPr>
           <w:b w:val="0"/>
         </w:rPr>
-        <w:t xml:space="preserve">Routing, KV transfer, labels, ports and readiness must stay in sync, </w:t>
-      </w:r>
-      <w:r>
-        <w:rPr>
-          <w:b w:val="0"/>
-        </w:rPr>
-        <w:t>even when pods restart or we scale. That is why the hard part is the Kubernetes wiring.</w:t>
-      </w:r>
-      <w:r>
-        <w:rPr>
-          <w:b/>
-        </w:rPr>
-        <w:t xml:space="preserve"> </w:t>
+        <w:t>Two pools still have to work together as one model service. The EPP, or Endpoint Picker, picks workers. KV transfer settings must match. The decode-side proxy coordinates requests. We must keep pods ready as replicas change.</w:t>
       </w:r>
     </w:p>
     <w:p>
       <w:pPr>
-        <w:pStyle w:val="Heading1"/>
-      </w:pPr>
-      <w:r>
-        <w:t>Slide 13 — Production Distributed Inference Architecture</w:t>
+        <w:keepLines/>
+      </w:pPr>
+      <w:r>
+        <w:rPr>
+          <w:b w:val="0"/>
+        </w:rPr>
+        <w:t xml:space="preserve">Routing, KV transfer, labels, ports and readiness must stay in sync, </w:t>
+      </w:r>
+      <w:r>
+        <w:rPr>
+          <w:b w:val="0"/>
+        </w:rPr>
+        <w:t xml:space="preserve">even when pods restart or we scale. </w:t>
       </w:r>
     </w:p>
     <w:p>
@@ -823,20 +886,17 @@
       </w:pPr>
       <w:r>
         <w:rPr>
-          <w:b w:val="0"/>
-        </w:rPr>
-        <w:t>So, this slide shows the big picture.</w:t>
+          <w:b/>
+        </w:rPr>
+        <w:t xml:space="preserve">There are lots of things to combine, that is why the hard part is the Kubernetes wiring. </w:t>
       </w:r>
     </w:p>
     <w:p>
       <w:pPr>
-        <w:keepLines/>
-      </w:pPr>
-      <w:r>
-        <w:rPr>
-          <w:b w:val="0"/>
-        </w:rPr>
-        <w:t>Running an LLM takes more than just a model and a GPU. We also need to route requests, manage workloads, and scale when traffic changes.</w:t>
+        <w:pStyle w:val="Heading1"/>
+      </w:pPr>
+      <w:r>
+        <w:t>Slide 13 — Production Distributed Inference Architecture</w:t>
       </w:r>
     </w:p>
     <w:p>
@@ -847,31 +907,7 @@
         <w:rPr>
           <w:b w:val="0"/>
         </w:rPr>
-        <w:t xml:space="preserve">That’s where </w:t>
-      </w:r>
-      <w:r>
-        <w:rPr>
-          <w:b/>
-        </w:rPr>
-        <w:t xml:space="preserve">KAITO and </w:t>
-      </w:r>
-      <w:r>
-        <w:rPr>
-          <w:b/>
-        </w:rPr>
-        <w:t>llm</w:t>
-      </w:r>
-      <w:r>
-        <w:rPr>
-          <w:b/>
-        </w:rPr>
-        <w:t xml:space="preserve">-d </w:t>
-      </w:r>
-      <w:r>
-        <w:rPr>
-          <w:b w:val="0"/>
-        </w:rPr>
-        <w:t>come in—the orchestration layer in the middle.</w:t>
+        <w:t>So, this slide shows the big picture.</w:t>
       </w:r>
     </w:p>
     <w:p>
@@ -882,31 +918,7 @@
         <w:rPr>
           <w:b w:val="0"/>
         </w:rPr>
-        <w:t xml:space="preserve">Below that, </w:t>
-      </w:r>
-      <w:r>
-        <w:rPr>
-          <w:b/>
-        </w:rPr>
-        <w:t>vLLM</w:t>
-      </w:r>
-      <w:r>
-        <w:rPr>
-          <w:b w:val="0"/>
-        </w:rPr>
-        <w:t xml:space="preserve"> runs the model, and the </w:t>
-      </w:r>
-      <w:r>
-        <w:rPr>
-          <w:b/>
-        </w:rPr>
-        <w:t xml:space="preserve">KV cache </w:t>
-      </w:r>
-      <w:r>
-        <w:rPr>
-          <w:b w:val="0"/>
-        </w:rPr>
-        <w:t>helps us reuse work instead of doing it again. Kubernetes provides the infrastructure underneath.</w:t>
+        <w:t>Running an inference workload takes more than just a model and a GPU. We also need to route requests, manage workloads, and scale when traffic changes.</w:t>
       </w:r>
     </w:p>
     <w:p>
@@ -917,7 +929,31 @@
         <w:rPr>
           <w:b w:val="0"/>
         </w:rPr>
-        <w:t>We also need things like security and monitoring around the whole system.</w:t>
+        <w:t xml:space="preserve">That’s where </w:t>
+      </w:r>
+      <w:r>
+        <w:rPr>
+          <w:b/>
+        </w:rPr>
+        <w:t xml:space="preserve">KAITO and </w:t>
+      </w:r>
+      <w:r>
+        <w:rPr>
+          <w:b/>
+        </w:rPr>
+        <w:t>llm</w:t>
+      </w:r>
+      <w:r>
+        <w:rPr>
+          <w:b/>
+        </w:rPr>
+        <w:t xml:space="preserve">-d </w:t>
+      </w:r>
+      <w:r>
+        <w:rPr>
+          <w:b w:val="0"/>
+        </w:rPr>
+        <w:t>come in—the orchestration layer in the middle.</w:t>
       </w:r>
     </w:p>
     <w:p>
@@ -928,7 +964,31 @@
         <w:rPr>
           <w:b w:val="0"/>
         </w:rPr>
-        <w:t>The main takeaway is simple: all these pieces need to work together.</w:t>
+        <w:t xml:space="preserve">Below that, </w:t>
+      </w:r>
+      <w:r>
+        <w:rPr>
+          <w:b/>
+        </w:rPr>
+        <w:t>vLLM</w:t>
+      </w:r>
+      <w:r>
+        <w:rPr>
+          <w:b w:val="0"/>
+        </w:rPr>
+        <w:t xml:space="preserve"> runs the model, and the </w:t>
+      </w:r>
+      <w:r>
+        <w:rPr>
+          <w:b/>
+        </w:rPr>
+        <w:t xml:space="preserve">KV cache </w:t>
+      </w:r>
+      <w:r>
+        <w:rPr>
+          <w:b w:val="0"/>
+        </w:rPr>
+        <w:t>helps us reuse work instead of doing it again. Kubernetes provides the infrastructure underneath.</w:t>
       </w:r>
     </w:p>
     <w:p>
@@ -939,27 +999,18 @@
         <w:rPr>
           <w:b w:val="0"/>
         </w:rPr>
-        <w:t xml:space="preserve">Today, we’ll focus on how KAITO and </w:t>
-      </w:r>
-      <w:r>
-        <w:rPr>
-          <w:b w:val="0"/>
-        </w:rPr>
-        <w:t>llm</w:t>
-      </w:r>
-      <w:r>
-        <w:rPr>
-          <w:b w:val="0"/>
-        </w:rPr>
-        <w:t>-d help with that. Let’s look at some of the open-source options.</w:t>
+        <w:t>We also need things like security and monitoring around the whole system.</w:t>
       </w:r>
     </w:p>
     <w:p>
       <w:pPr>
-        <w:pStyle w:val="Heading1"/>
-      </w:pPr>
-      <w:r>
-        <w:t>Slide 14 — Open-source P/D has several paths, not one winner</w:t>
+        <w:keepLines/>
+      </w:pPr>
+      <w:r>
+        <w:rPr>
+          <w:b w:val="0"/>
+        </w:rPr>
+        <w:t>The main takeaway is simple: all these pieces need to work together.</w:t>
       </w:r>
     </w:p>
     <w:p>
@@ -970,128 +1021,44 @@
         <w:rPr>
           <w:b w:val="0"/>
         </w:rPr>
-        <w:t xml:space="preserve">Open-source P/D has several paths, not one winner. </w:t>
-      </w:r>
-      <w:r>
-        <w:rPr>
-          <w:b w:val="0"/>
-        </w:rPr>
-        <w:t>The following table presents examples, not a ranking. Some approaches can be used together.</w:t>
+        <w:t xml:space="preserve">Today, we’ll focus on how KAITO and </w:t>
+      </w:r>
+      <w:r>
+        <w:rPr>
+          <w:b w:val="0"/>
+        </w:rPr>
+        <w:t>llm</w:t>
+      </w:r>
+      <w:r>
+        <w:rPr>
+          <w:b w:val="0"/>
+        </w:rPr>
+        <w:t>-d help with that. Let’s look at some of the open-source options.</w:t>
       </w:r>
     </w:p>
     <w:p>
       <w:pPr>
-        <w:keepLines/>
-      </w:pPr>
-      <w:r>
-        <w:rPr>
-          <w:b/>
-        </w:rPr>
-        <w:t xml:space="preserve">The middle column </w:t>
-      </w:r>
-      <w:r>
-        <w:rPr>
-          <w:b w:val="0"/>
-        </w:rPr>
-        <w:t xml:space="preserve">shows the serving and routing path; </w:t>
-      </w:r>
-      <w:r>
-        <w:rPr>
-          <w:b/>
-        </w:rPr>
-        <w:t xml:space="preserve">the right column </w:t>
-      </w:r>
-      <w:r>
-        <w:rPr>
-          <w:b w:val="0"/>
-        </w:rPr>
-        <w:t xml:space="preserve">shows what users configure in Kubernetes. Dynamo, </w:t>
-      </w:r>
-      <w:r>
-        <w:rPr>
-          <w:b w:val="0"/>
-        </w:rPr>
-        <w:t>llm</w:t>
-      </w:r>
-      <w:r>
-        <w:rPr>
-          <w:b w:val="0"/>
-        </w:rPr>
-        <w:t xml:space="preserve">-d, </w:t>
-      </w:r>
-      <w:r>
-        <w:rPr>
-          <w:b w:val="0"/>
-        </w:rPr>
-        <w:t>AIBrix</w:t>
-      </w:r>
-      <w:r>
-        <w:rPr>
-          <w:b w:val="0"/>
-        </w:rPr>
-        <w:t xml:space="preserve">, </w:t>
-      </w:r>
-      <w:r>
-        <w:rPr>
-          <w:b w:val="0"/>
-        </w:rPr>
-        <w:t>KServe</w:t>
-      </w:r>
-      <w:r>
-        <w:rPr>
-          <w:b w:val="0"/>
-        </w:rPr>
-        <w:t xml:space="preserve">, Ray Serve and </w:t>
-      </w:r>
-      <w:r>
-        <w:rPr>
-          <w:b w:val="0"/>
-        </w:rPr>
-        <w:t>vLLM</w:t>
-      </w:r>
-      <w:r>
-        <w:rPr>
-          <w:b w:val="0"/>
-        </w:rPr>
-        <w:t xml:space="preserve"> Production Stack offer different combinations. </w:t>
-      </w:r>
-      <w:r>
-        <w:rPr>
-          <w:b/>
-        </w:rPr>
-        <w:t>Declarative APIs already exist</w:t>
-      </w:r>
-      <w:r>
-        <w:rPr>
-          <w:b w:val="0"/>
-        </w:rPr>
-        <w:t xml:space="preserve">. P/D deployment options already exist. KAITO aims to make them easier to use. </w:t>
-      </w:r>
-      <w:r>
-        <w:rPr>
-          <w:b/>
-        </w:rPr>
-        <w:t xml:space="preserve">For KAITO users, they want less manual configuration to maintain. Let’s start with </w:t>
-      </w:r>
-      <w:r>
-        <w:rPr>
-          <w:b/>
-        </w:rPr>
-        <w:t>llm</w:t>
-      </w:r>
-      <w:r>
-        <w:rPr>
-          <w:b/>
-        </w:rPr>
-        <w:t>-d.</w:t>
+        <w:pStyle w:val="Heading1"/>
+      </w:pPr>
+      <w:r>
+        <w:t>Slide 14 — Open-source P/D has several paths, not one winner</w:t>
       </w:r>
     </w:p>
     <w:p>
       <w:pPr>
-        <w:pStyle w:val="Heading1"/>
-      </w:pPr>
-      <w:r>
-        <w:t>Slide 15 — llm-d: a distributed inference stack</w:t>
+        <w:keepLines/>
+      </w:pPr>
+      <w:r>
+        <w:rPr>
+          <w:b w:val="0"/>
+        </w:rPr>
+        <w:t xml:space="preserve">Open-source P/D has several paths, not one winner. </w:t>
+      </w:r>
+      <w:r>
+        <w:rPr>
+          <w:b w:val="0"/>
+        </w:rPr>
+        <w:t>The following table presents examples, not a ranking. Some approaches can be used together.</w:t>
       </w:r>
     </w:p>
     <w:p>
@@ -1100,105 +1067,93 @@
       </w:pPr>
       <w:r>
         <w:rPr>
-          <w:b w:val="0"/>
-        </w:rPr>
-        <w:t xml:space="preserve">llm-d is a Kubernetes-native framework for high-performance distributed inference. </w:t>
-      </w:r>
-      <w:r>
-        <w:rPr>
-          <w:b w:val="0"/>
-        </w:rPr>
-        <w:t xml:space="preserve">It joined the CNCF Sandbox in March 2026. </w:t>
-      </w:r>
-      <w:r>
-        <w:rPr>
           <w:b/>
         </w:rPr>
-        <w:t>It does not replace vLLM, gateways, or storage systems; it composes them</w:t>
-      </w:r>
-      <w:r>
-        <w:rPr>
-          <w:b w:val="0"/>
-        </w:rPr>
-        <w:t xml:space="preserve">. </w:t>
+        <w:t xml:space="preserve">The middle column </w:t>
+      </w:r>
+      <w:r>
+        <w:rPr>
+          <w:b w:val="0"/>
+        </w:rPr>
+        <w:t xml:space="preserve">shows the serving and routing path; </w:t>
       </w:r>
       <w:r>
         <w:rPr>
           <w:b/>
         </w:rPr>
-        <w:t>Its value is organized</w:t>
+        <w:t xml:space="preserve">the right column </w:t>
+      </w:r>
+      <w:r>
+        <w:rPr>
+          <w:b w:val="0"/>
+        </w:rPr>
+        <w:t xml:space="preserve">shows what users configure in Kubernetes. Dynamo, </w:t>
+      </w:r>
+      <w:r>
+        <w:rPr>
+          <w:b w:val="0"/>
+        </w:rPr>
+        <w:t>llm</w:t>
+      </w:r>
+      <w:r>
+        <w:rPr>
+          <w:b w:val="0"/>
+        </w:rPr>
+        <w:t xml:space="preserve">-d, </w:t>
+      </w:r>
+      <w:r>
+        <w:rPr>
+          <w:b w:val="0"/>
+        </w:rPr>
+        <w:t>AIBrix</w:t>
+      </w:r>
+      <w:r>
+        <w:rPr>
+          <w:b w:val="0"/>
+        </w:rPr>
+        <w:t xml:space="preserve">, </w:t>
+      </w:r>
+      <w:r>
+        <w:rPr>
+          <w:b w:val="0"/>
+        </w:rPr>
+        <w:t>KServe</w:t>
+      </w:r>
+      <w:r>
+        <w:rPr>
+          <w:b w:val="0"/>
+        </w:rPr>
+        <w:t xml:space="preserve">, Ray Serve and </w:t>
+      </w:r>
+      <w:r>
+        <w:rPr>
+          <w:b w:val="0"/>
+        </w:rPr>
+        <w:t>vLLM</w:t>
+      </w:r>
+      <w:r>
+        <w:rPr>
+          <w:b w:val="0"/>
+        </w:rPr>
+        <w:t xml:space="preserve"> Production Stack offer different combinations. P/D deployment options already exist. KAITO aims to make them easier to use. </w:t>
       </w:r>
       <w:r>
         <w:rPr>
           <w:b/>
         </w:rPr>
-        <w:t xml:space="preserve"> into </w:t>
+        <w:t xml:space="preserve">For KAITO users, they want less manual configuration to maintain. Let’s start with </w:t>
       </w:r>
       <w:r>
         <w:rPr>
           <w:b/>
         </w:rPr>
-        <w:t>three ideas</w:t>
-      </w:r>
-      <w:r>
-        <w:rPr>
-          <w:b w:val="0"/>
-        </w:rPr>
-        <w:t>:</w:t>
-      </w:r>
-      <w:r>
-        <w:rPr>
-          <w:b w:val="0"/>
-        </w:rPr>
-        <w:t xml:space="preserve"> first </w:t>
-      </w:r>
-      <w:r>
-        <w:rPr>
-          <w:b w:val="0"/>
-        </w:rPr>
-        <w:t xml:space="preserve">modular architecture: </w:t>
-      </w:r>
-      <w:r>
-        <w:rPr>
-          <w:b w:val="0"/>
-        </w:rPr>
-        <w:t xml:space="preserve">Gateway API connects inference routing to Kubernetes, second, </w:t>
-      </w:r>
-      <w:r>
-        <w:rPr>
-          <w:b w:val="0"/>
-        </w:rPr>
-        <w:t xml:space="preserve">Extensible components: </w:t>
-      </w:r>
-      <w:r>
-        <w:rPr>
-          <w:b w:val="0"/>
-        </w:rPr>
-        <w:t>combine runtimes, routing plugins and KV transport,</w:t>
-      </w:r>
-      <w:r>
-        <w:rPr>
-          <w:b w:val="0"/>
-        </w:rPr>
-        <w:t xml:space="preserve"> </w:t>
-      </w:r>
-      <w:r>
-        <w:rPr>
-          <w:b w:val="0"/>
-        </w:rPr>
-        <w:t xml:space="preserve">third, </w:t>
-      </w:r>
-      <w:r>
-        <w:rPr>
-          <w:b w:val="0"/>
-        </w:rPr>
-        <w:t xml:space="preserve">Well-lit paths, there are </w:t>
-      </w:r>
-      <w:r>
-        <w:rPr>
-          <w:b w:val="0"/>
-        </w:rPr>
-        <w:t>tested deployment patterns make trade-offs clear.</w:t>
+        <w:t>llm</w:t>
+      </w:r>
+      <w:r>
+        <w:rPr>
+          <w:b/>
+        </w:rPr>
+        <w:t>-d.</w:t>
       </w:r>
     </w:p>
     <w:p>
@@ -1206,7 +1161,7 @@
         <w:pStyle w:val="Heading1"/>
       </w:pPr>
       <w:r>
-        <w:t>Slide 16 — llm-d: capabilities for distributed inference</w:t>
+        <w:t>Slide 15 — llm-d: a distributed inference stack</w:t>
       </w:r>
     </w:p>
     <w:p>
@@ -1217,72 +1172,111 @@
         <w:rPr>
           <w:b w:val="0"/>
         </w:rPr>
-        <w:t xml:space="preserve">These are reusable capabilities, not a performance guarantee. </w:t>
-      </w:r>
-      <w:r>
-        <w:rPr>
-          <w:b w:val="0"/>
-        </w:rPr>
-        <w:t>llm</w:t>
-      </w:r>
-      <w:r>
-        <w:rPr>
-          <w:b w:val="0"/>
-        </w:rPr>
-        <w:t xml:space="preserve">-d builds on the serving runtime, not replace it. And we combine reusable </w:t>
-      </w:r>
-      <w:r>
-        <w:rPr>
-          <w:b w:val="0"/>
-        </w:rPr>
-        <w:t>llm</w:t>
-      </w:r>
-      <w:r>
-        <w:rPr>
-          <w:b w:val="0"/>
-        </w:rPr>
-        <w:t xml:space="preserve">-d </w:t>
-      </w:r>
-      <w:r>
-        <w:rPr>
-          <w:b w:val="0"/>
-        </w:rPr>
-        <w:t xml:space="preserve">components, </w:t>
-      </w:r>
-      <w:r>
-        <w:rPr>
-          <w:b w:val="0"/>
-        </w:rPr>
-        <w:t>Deployment paths explain the trade-offs.</w:t>
+        <w:t xml:space="preserve">llm-d is a Kubernetes-native framework for high-performance distributed inference. </w:t>
+      </w:r>
+      <w:r>
+        <w:rPr>
+          <w:b w:val="0"/>
+        </w:rPr>
+        <w:t xml:space="preserve">It joined the CNCF Sandbox in March 2026. </w:t>
+      </w:r>
+      <w:r>
+        <w:rPr>
+          <w:b/>
+        </w:rPr>
+        <w:t>It does not replace vLLM, gateways, or storage systems; it composes them</w:t>
+      </w:r>
+      <w:r>
+        <w:rPr>
+          <w:b w:val="0"/>
+        </w:rPr>
+        <w:t xml:space="preserve">. </w:t>
+      </w:r>
+      <w:r>
+        <w:rPr>
+          <w:b/>
+        </w:rPr>
+        <w:t>Its value is organized</w:t>
+      </w:r>
+      <w:r>
+        <w:rPr>
+          <w:b/>
+        </w:rPr>
+        <w:t xml:space="preserve"> into </w:t>
+      </w:r>
+      <w:r>
+        <w:rPr>
+          <w:b/>
+        </w:rPr>
+        <w:t>three ideas</w:t>
+      </w:r>
+      <w:r>
+        <w:rPr>
+          <w:b w:val="0"/>
+        </w:rPr>
+        <w:t>:</w:t>
+      </w:r>
+      <w:r>
+        <w:rPr>
+          <w:b w:val="0"/>
+        </w:rPr>
+        <w:t xml:space="preserve"> first </w:t>
+      </w:r>
+      <w:r>
+        <w:rPr>
+          <w:b w:val="0"/>
+        </w:rPr>
+        <w:t xml:space="preserve">modular architecture: </w:t>
+      </w:r>
+      <w:r>
+        <w:rPr>
+          <w:b w:val="0"/>
+        </w:rPr>
+        <w:t xml:space="preserve">Gateway API connects inference routing to Kubernetes, second, </w:t>
+      </w:r>
+      <w:r>
+        <w:rPr>
+          <w:b w:val="0"/>
+        </w:rPr>
+        <w:t xml:space="preserve">Extensible components: </w:t>
+      </w:r>
+      <w:r>
+        <w:rPr>
+          <w:b w:val="0"/>
+        </w:rPr>
+        <w:t>combine runtimes, routing plugins and KV transport,</w:t>
+      </w:r>
+      <w:r>
+        <w:rPr>
+          <w:b w:val="0"/>
+        </w:rPr>
+        <w:t xml:space="preserve"> </w:t>
+      </w:r>
+      <w:r>
+        <w:rPr>
+          <w:b w:val="0"/>
+        </w:rPr>
+        <w:t xml:space="preserve">third, </w:t>
+      </w:r>
+      <w:r>
+        <w:rPr>
+          <w:b w:val="0"/>
+        </w:rPr>
+        <w:t xml:space="preserve">Well-lit paths, there are </w:t>
+      </w:r>
+      <w:r>
+        <w:rPr>
+          <w:b w:val="0"/>
+        </w:rPr>
+        <w:t>tested deployment patterns make trade-offs clear.</w:t>
       </w:r>
     </w:p>
     <w:p>
       <w:pPr>
-        <w:keepLines/>
-      </w:pPr>
-      <w:r>
-        <w:rPr>
-          <w:b w:val="0"/>
-        </w:rPr>
-        <w:t xml:space="preserve">There are mainly </w:t>
-      </w:r>
-      <w:r>
-        <w:rPr>
-          <w:b w:val="0"/>
-        </w:rPr>
-        <w:t xml:space="preserve">four areas of capability for </w:t>
-      </w:r>
-      <w:r>
-        <w:rPr>
-          <w:b w:val="0"/>
-        </w:rPr>
-        <w:t>llm</w:t>
-      </w:r>
-      <w:r>
-        <w:rPr>
-          <w:b w:val="0"/>
-        </w:rPr>
-        <w:t>-d projects:</w:t>
+        <w:pStyle w:val="Heading1"/>
+      </w:pPr>
+      <w:r>
+        <w:t>Slide 16 — llm-d: capabilities for distributed inference</w:t>
       </w:r>
     </w:p>
     <w:p>
@@ -1293,93 +1287,72 @@
         <w:rPr>
           <w:b w:val="0"/>
         </w:rPr>
-        <w:t xml:space="preserve">first: </w:t>
-      </w:r>
-      <w:r>
-        <w:rPr>
-          <w:b w:val="0"/>
-        </w:rPr>
-        <w:t xml:space="preserve">State-of-the-art </w:t>
-      </w:r>
-      <w:r>
-        <w:rPr>
-          <w:b w:val="0"/>
-        </w:rPr>
-        <w:t>MoE</w:t>
-      </w:r>
-      <w:r>
-        <w:rPr>
-          <w:b w:val="0"/>
-        </w:rPr>
-        <w:t xml:space="preserve"> serving, </w:t>
-      </w:r>
-      <w:r>
-        <w:rPr>
-          <w:b/>
-        </w:rPr>
-        <w:t xml:space="preserve">Here, </w:t>
-      </w:r>
-      <w:r>
-        <w:rPr>
-          <w:b/>
-        </w:rPr>
-        <w:t>MoE</w:t>
-      </w:r>
-      <w:r>
-        <w:rPr>
-          <w:b/>
-        </w:rPr>
-        <w:t xml:space="preserve"> stands for Mixture of Experts, which is widely used in mainstream LLMs. </w:t>
-      </w:r>
-      <w:r>
-        <w:rPr>
-          <w:b w:val="0"/>
-        </w:rPr>
-        <w:t>Expert parallelism spreads expert computation across GPUs, second, p</w:t>
-      </w:r>
-      <w:r>
-        <w:rPr>
-          <w:b w:val="0"/>
-        </w:rPr>
-        <w:t>refill/decode disaggregation, w</w:t>
-      </w:r>
-      <w:r>
-        <w:rPr>
-          <w:b w:val="0"/>
-        </w:rPr>
-        <w:t xml:space="preserve">e separate the phases and transfer KV between roles. Third, </w:t>
-      </w:r>
-      <w:r>
-        <w:rPr>
-          <w:b w:val="0"/>
-        </w:rPr>
-        <w:t xml:space="preserve">State-aware scheduling: </w:t>
-      </w:r>
-      <w:r>
-        <w:rPr>
-          <w:b w:val="0"/>
-        </w:rPr>
-        <w:t>Routing plugins use cache and load signals to pick workers. Last is a</w:t>
-      </w:r>
-      <w:r>
-        <w:rPr>
-          <w:b w:val="0"/>
-        </w:rPr>
-        <w:t>utoscaling architecture: w</w:t>
-      </w:r>
-      <w:r>
-        <w:rPr>
-          <w:b w:val="0"/>
-        </w:rPr>
-        <w:t>orkload signals and SLOs guide capacity; each integration chooses its policy.</w:t>
+        <w:t xml:space="preserve">These are reusable capabilities, not a performance guarantee. </w:t>
+      </w:r>
+      <w:r>
+        <w:rPr>
+          <w:b w:val="0"/>
+        </w:rPr>
+        <w:t>llm</w:t>
+      </w:r>
+      <w:r>
+        <w:rPr>
+          <w:b w:val="0"/>
+        </w:rPr>
+        <w:t xml:space="preserve">-d builds on the serving runtime, not replace it. And we combine reusable </w:t>
+      </w:r>
+      <w:r>
+        <w:rPr>
+          <w:b w:val="0"/>
+        </w:rPr>
+        <w:t>llm</w:t>
+      </w:r>
+      <w:r>
+        <w:rPr>
+          <w:b w:val="0"/>
+        </w:rPr>
+        <w:t xml:space="preserve">-d </w:t>
+      </w:r>
+      <w:r>
+        <w:rPr>
+          <w:b w:val="0"/>
+        </w:rPr>
+        <w:t xml:space="preserve">components, </w:t>
+      </w:r>
+      <w:r>
+        <w:rPr>
+          <w:b w:val="0"/>
+        </w:rPr>
+        <w:t>Deployment paths explain the trade-offs.</w:t>
       </w:r>
     </w:p>
     <w:p>
       <w:pPr>
-        <w:pStyle w:val="Heading1"/>
-      </w:pPr>
-      <w:r>
-        <w:t>Slide 17 — llm-d “well-lit paths”</w:t>
+        <w:keepLines/>
+      </w:pPr>
+      <w:r>
+        <w:rPr>
+          <w:b w:val="0"/>
+        </w:rPr>
+        <w:t xml:space="preserve">There are mainly </w:t>
+      </w:r>
+      <w:r>
+        <w:rPr>
+          <w:b w:val="0"/>
+        </w:rPr>
+        <w:t xml:space="preserve">four areas of capability for </w:t>
+      </w:r>
+      <w:r>
+        <w:rPr>
+          <w:b w:val="0"/>
+        </w:rPr>
+        <w:t>llm</w:t>
+      </w:r>
+      <w:r>
+        <w:rPr>
+          <w:b w:val="0"/>
+        </w:rPr>
+        <w:t>-d projects:</w:t>
       </w:r>
     </w:p>
     <w:p>
@@ -1390,18 +1363,93 @@
         <w:rPr>
           <w:b w:val="0"/>
         </w:rPr>
-        <w:t>llm-d calls these “well-lit paths”—tested ways to deploy, with clear guidance on what works well and what the limitations are.</w:t>
+        <w:t xml:space="preserve">first: </w:t>
+      </w:r>
+      <w:r>
+        <w:rPr>
+          <w:b w:val="0"/>
+        </w:rPr>
+        <w:t xml:space="preserve">State-of-the-art </w:t>
+      </w:r>
+      <w:r>
+        <w:rPr>
+          <w:b w:val="0"/>
+        </w:rPr>
+        <w:t>MoE</w:t>
+      </w:r>
+      <w:r>
+        <w:rPr>
+          <w:b w:val="0"/>
+        </w:rPr>
+        <w:t xml:space="preserve"> serving, </w:t>
+      </w:r>
+      <w:r>
+        <w:rPr>
+          <w:b/>
+        </w:rPr>
+        <w:t xml:space="preserve">Here, </w:t>
+      </w:r>
+      <w:r>
+        <w:rPr>
+          <w:b/>
+        </w:rPr>
+        <w:t>MoE</w:t>
+      </w:r>
+      <w:r>
+        <w:rPr>
+          <w:b/>
+        </w:rPr>
+        <w:t xml:space="preserve"> stands for Mixture of Experts, which is widely used in mainstream LLMs. </w:t>
+      </w:r>
+      <w:r>
+        <w:rPr>
+          <w:b w:val="0"/>
+        </w:rPr>
+        <w:t>Expert parallelism spreads expert computation across GPUs, second, p</w:t>
+      </w:r>
+      <w:r>
+        <w:rPr>
+          <w:b w:val="0"/>
+        </w:rPr>
+        <w:t>refill/decode disaggregation, w</w:t>
+      </w:r>
+      <w:r>
+        <w:rPr>
+          <w:b w:val="0"/>
+        </w:rPr>
+        <w:t xml:space="preserve">e separate the phases and transfer KV between roles. Third, </w:t>
+      </w:r>
+      <w:r>
+        <w:rPr>
+          <w:b w:val="0"/>
+        </w:rPr>
+        <w:t xml:space="preserve">State-aware scheduling: </w:t>
+      </w:r>
+      <w:r>
+        <w:rPr>
+          <w:b w:val="0"/>
+        </w:rPr>
+        <w:t>Routing plugins use cache and load signals to pick workers. Last is a</w:t>
+      </w:r>
+      <w:r>
+        <w:rPr>
+          <w:b w:val="0"/>
+        </w:rPr>
+        <w:t>utoscaling architecture: w</w:t>
+      </w:r>
+      <w:r>
+        <w:rPr>
+          <w:b w:val="0"/>
+        </w:rPr>
+        <w:t>orkload signals and SLOs guide capacity; each integration chooses its policy.</w:t>
       </w:r>
     </w:p>
     <w:p>
       <w:pPr>
-        <w:keepLines/>
-      </w:pPr>
-      <w:r>
-        <w:rPr>
-          <w:b w:val="0"/>
-        </w:rPr>
-        <w:t>Intelligent scheduling determines where should this request run</w:t>
+        <w:pStyle w:val="Heading1"/>
+      </w:pPr>
+      <w:r>
+        <w:t>Slide 17 — llm-d “well-lit paths”</w:t>
       </w:r>
     </w:p>
     <w:p>
@@ -1412,7 +1460,19 @@
         <w:rPr>
           <w:b w:val="0"/>
         </w:rPr>
-        <w:t>KV cache management determines where should reusable state live?</w:t>
+        <w:t>llm-d calls these “well-lit paths”—</w:t>
+      </w:r>
+      <w:r>
+        <w:rPr>
+          <w:b w:val="0"/>
+        </w:rPr>
+        <w:t xml:space="preserve">these are </w:t>
+      </w:r>
+      <w:r>
+        <w:rPr>
+          <w:b w:val="0"/>
+        </w:rPr>
+        <w:t>tested ways to deploy, with clear guidance on what works well and what the limitations are.</w:t>
       </w:r>
     </w:p>
     <w:p>
@@ -1423,19 +1483,7 @@
         <w:rPr>
           <w:b w:val="0"/>
         </w:rPr>
-        <w:t xml:space="preserve">Wide expert parallelism determines how should a large </w:t>
-      </w:r>
-      <w:r>
-        <w:rPr>
-          <w:b w:val="0"/>
-        </w:rPr>
-        <w:t>MoE</w:t>
-      </w:r>
-      <w:r>
-        <w:rPr>
-          <w:b w:val="0"/>
-        </w:rPr>
-        <w:t xml:space="preserve"> model run across GPUs?</w:t>
+        <w:t>Intelligent scheduling determines where this request should run</w:t>
       </w:r>
     </w:p>
     <w:p>
@@ -1446,7 +1494,7 @@
         <w:rPr>
           <w:b w:val="0"/>
         </w:rPr>
-        <w:t>P/D disaggregation determines how should prompt and generation capacity differ?</w:t>
+        <w:t>KV cache management determines where should reusable state live?</w:t>
       </w:r>
     </w:p>
     <w:p>
@@ -1455,17 +1503,32 @@
       </w:pPr>
       <w:r>
         <w:rPr>
-          <w:b/>
-        </w:rPr>
-        <w:t>These paths can work together, but we don’t need all of them at once. Results depend on the hardware. Today, we’ll focus on P/D disaggregation and use KAITO to manage the workloads.</w:t>
+          <w:b w:val="0"/>
+        </w:rPr>
+        <w:t xml:space="preserve">Wide expert parallelism determines how should a large </w:t>
+      </w:r>
+      <w:r>
+        <w:rPr>
+          <w:b w:val="0"/>
+        </w:rPr>
+        <w:t>MoE</w:t>
+      </w:r>
+      <w:r>
+        <w:rPr>
+          <w:b w:val="0"/>
+        </w:rPr>
+        <w:t xml:space="preserve"> model run across GPUs?</w:t>
       </w:r>
     </w:p>
     <w:p>
       <w:pPr>
-        <w:pStyle w:val="Heading1"/>
-      </w:pPr>
-      <w:r>
-        <w:t>Slide 18 — What is KAITO (Kubernetes AI Toolchain Operator)?</w:t>
+        <w:keepLines/>
+      </w:pPr>
+      <w:r>
+        <w:rPr>
+          <w:b w:val="0"/>
+        </w:rPr>
+        <w:t>P/D disaggregation determines how should prompt and generation capacity differ?</w:t>
       </w:r>
     </w:p>
     <w:p>
@@ -1474,70 +1537,46 @@
       </w:pPr>
       <w:r>
         <w:rPr>
-          <w:b w:val="0"/>
-        </w:rPr>
-        <w:t xml:space="preserve">Next, what is KAITO, </w:t>
-      </w:r>
-      <w:r>
-        <w:rPr>
-          <w:b w:val="0"/>
-        </w:rPr>
-        <w:t>KAITO is</w:t>
-      </w:r>
-      <w:r>
-        <w:rPr>
-          <w:b w:val="0"/>
-        </w:rPr>
-        <w:t xml:space="preserve"> a </w:t>
-      </w:r>
-      <w:r>
-        <w:rPr>
-          <w:b w:val="0"/>
-        </w:rPr>
-        <w:t xml:space="preserve">Kubernetes AI Toolchain Operator, which </w:t>
-      </w:r>
-      <w:r>
-        <w:rPr>
-          <w:b w:val="0"/>
-        </w:rPr>
-        <w:t>automates LLM inference, fine-tuning and RAG with Kubernetes operators. It is also a CNCF Sandbox project.</w:t>
+          <w:b/>
+        </w:rPr>
+        <w:t>These paths can work together, but we don’t need all of them at once. Results depend on the hardware. Today, we’ll focus on P/D disaggregation and use KAITO to manage the workloads.</w:t>
       </w:r>
     </w:p>
     <w:p>
       <w:pPr>
-        <w:keepLines/>
-      </w:pPr>
-      <w:r>
-        <w:rPr>
-          <w:b/>
-        </w:rPr>
-        <w:t xml:space="preserve">With KAITO, you only need to </w:t>
-      </w:r>
-      <w:r>
-        <w:rPr>
-          <w:b w:val="0"/>
-        </w:rPr>
-        <w:t xml:space="preserve">specify a model name and GPU VM SKU. KAITO sizes the nodes to fit the model’s memory requirements, handles model setup and caching, manages inference workloads and rolling updates on Kubernetes, and uses KEDA to automatically scale </w:t>
-      </w:r>
-      <w:r>
-        <w:rPr>
-          <w:b w:val="0"/>
-        </w:rPr>
-        <w:t xml:space="preserve">inference </w:t>
-      </w:r>
-      <w:r>
-        <w:rPr>
-          <w:b w:val="0"/>
-        </w:rPr>
-        <w:t>workloads.</w:t>
+        <w:pStyle w:val="Heading1"/>
+      </w:pPr>
+      <w:r>
+        <w:t>Slide 18 — What is KAITO (Kubernetes AI Toolchain Operator)?</w:t>
       </w:r>
     </w:p>
     <w:p>
       <w:pPr>
-        <w:pStyle w:val="Heading1"/>
-      </w:pPr>
-      <w:r>
-        <w:t>Slide 19 — KAITO workload example</w:t>
+        <w:keepLines/>
+      </w:pPr>
+      <w:r>
+        <w:rPr>
+          <w:b w:val="0"/>
+        </w:rPr>
+        <w:t xml:space="preserve">Next, what is KAITO, </w:t>
+      </w:r>
+      <w:r>
+        <w:rPr>
+          <w:b w:val="0"/>
+        </w:rPr>
+        <w:t xml:space="preserve">KAITO stands for </w:t>
+      </w:r>
+      <w:r>
+        <w:rPr>
+          <w:b w:val="0"/>
+        </w:rPr>
+        <w:t xml:space="preserve">Kubernetes AI Toolchain Operator, which </w:t>
+      </w:r>
+      <w:r>
+        <w:rPr>
+          <w:b w:val="0"/>
+        </w:rPr>
+        <w:t>automates LLM inference, fine-tuning and RAG with Kubernetes operators. It is also a CNCF Sandbox project.</w:t>
       </w:r>
     </w:p>
     <w:p>
@@ -1546,50 +1585,35 @@
       </w:pPr>
       <w:r>
         <w:rPr>
-          <w:b w:val="0"/>
-        </w:rPr>
-        <w:t xml:space="preserve">Here is a KAITO </w:t>
-      </w:r>
-      <w:r>
-        <w:rPr>
-          <w:b w:val="0"/>
-        </w:rPr>
-        <w:t xml:space="preserve">inference workload example, user only needs to </w:t>
-      </w:r>
-      <w:r>
-        <w:rPr>
-          <w:b w:val="0"/>
-        </w:rPr>
-        <w:t>specify the model name, GPU instance type and replica count.</w:t>
+          <w:b/>
+        </w:rPr>
+        <w:t xml:space="preserve">With KAITO, you only need to </w:t>
+      </w:r>
+      <w:r>
+        <w:rPr>
+          <w:b w:val="0"/>
+        </w:rPr>
+        <w:t xml:space="preserve">specify a model name and GPU VM SKU. KAITO sizes the nodes to fit the model’s memory requirements, handles model setup and caching, manages inference workloads and rolling updates on Kubernetes, and uses KEDA to automatically scale </w:t>
+      </w:r>
+      <w:r>
+        <w:rPr>
+          <w:b w:val="0"/>
+        </w:rPr>
+        <w:t xml:space="preserve">inference </w:t>
+      </w:r>
+      <w:r>
+        <w:rPr>
+          <w:b w:val="0"/>
+        </w:rPr>
+        <w:t>workloads.</w:t>
       </w:r>
     </w:p>
     <w:p>
       <w:pPr>
-        <w:keepLines/>
-      </w:pPr>
-      <w:r>
-        <w:rPr>
-          <w:b w:val="0"/>
-        </w:rPr>
-        <w:t xml:space="preserve">In this example, user specifies a qwen3 model name which is a </w:t>
-      </w:r>
-      <w:r>
-        <w:rPr>
-          <w:b w:val="0"/>
-        </w:rPr>
-        <w:t>huggingface</w:t>
-      </w:r>
-      <w:r>
-        <w:rPr>
-          <w:b w:val="0"/>
-        </w:rPr>
-        <w:t xml:space="preserve"> model id and specifies A100 GPU instance type with 3 replicas, </w:t>
-      </w:r>
-      <w:r>
-        <w:rPr>
-          <w:b/>
-        </w:rPr>
-        <w:t xml:space="preserve">three replicas does not necessarily mean three GPUs; each replica’s GPU and node needs depend on the model and runtime settings. </w:t>
+        <w:pStyle w:val="Heading1"/>
+      </w:pPr>
+      <w:r>
+        <w:t>Slide 19 — KAITO workload example</w:t>
       </w:r>
     </w:p>
     <w:p>
@@ -1598,23 +1622,50 @@
       </w:pPr>
       <w:r>
         <w:rPr>
-          <w:b/>
-        </w:rPr>
-        <w:t xml:space="preserve">KAITO does all the rest of work, like provisioning the required GPU nodes </w:t>
-      </w:r>
-      <w:r>
-        <w:rPr>
-          <w:b/>
-        </w:rPr>
-        <w:t>to fit the model’s memory requirements, handles model setup and caching, manages inference workloads and rolling updates on Kubernetes, and uses KEDA to automatically scale workloads.</w:t>
+          <w:b w:val="0"/>
+        </w:rPr>
+        <w:t xml:space="preserve">Here is a KAITO </w:t>
+      </w:r>
+      <w:r>
+        <w:rPr>
+          <w:b w:val="0"/>
+        </w:rPr>
+        <w:t xml:space="preserve">inference workload example, user only needs to </w:t>
+      </w:r>
+      <w:r>
+        <w:rPr>
+          <w:b w:val="0"/>
+        </w:rPr>
+        <w:t>specify the model name, GPU instance type and replica count.</w:t>
       </w:r>
     </w:p>
     <w:p>
       <w:pPr>
-        <w:pStyle w:val="Heading1"/>
-      </w:pPr>
-      <w:r>
-        <w:t>Slide 20 — KAITO works out the initial GPU node count</w:t>
+        <w:keepLines/>
+      </w:pPr>
+      <w:r>
+        <w:rPr>
+          <w:b w:val="0"/>
+        </w:rPr>
+        <w:t xml:space="preserve">In this example, user specifies a qwen3 model name which is a </w:t>
+      </w:r>
+      <w:r>
+        <w:rPr>
+          <w:b w:val="0"/>
+        </w:rPr>
+        <w:t>huggingface</w:t>
+      </w:r>
+      <w:r>
+        <w:rPr>
+          <w:b w:val="0"/>
+        </w:rPr>
+        <w:t xml:space="preserve"> model id and specifies A100 GPU instance type with 3 replicas, </w:t>
+      </w:r>
+      <w:r>
+        <w:rPr>
+          <w:b/>
+        </w:rPr>
+        <w:t xml:space="preserve">three replicas does not necessarily mean three GPUs; each replica’s GPU and node needs depend on the model and runtime settings. </w:t>
       </w:r>
     </w:p>
     <w:p>
@@ -1625,24 +1676,21 @@
         <w:rPr>
           <w:b/>
         </w:rPr>
-        <w:t>This slide shows how does the KAITO do the math.</w:t>
+        <w:t xml:space="preserve">KAITO does all the rest of work, like provisioning the required GPU nodes </w:t>
+      </w:r>
+      <w:r>
+        <w:rPr>
+          <w:b/>
+        </w:rPr>
+        <w:t>to fit the model’s memory requirements, handles model setup and caching, manages inference workloads and rolling updates on Kubernetes.</w:t>
       </w:r>
     </w:p>
     <w:p>
       <w:pPr>
-        <w:keepLines/>
-      </w:pPr>
-      <w:r>
-        <w:rPr>
-          <w:b w:val="0"/>
-        </w:rPr>
-        <w:t xml:space="preserve">User </w:t>
-      </w:r>
-      <w:r>
-        <w:rPr>
-          <w:b w:val="0"/>
-        </w:rPr>
-        <w:t>specifies a model name and GPU SKU. KAITO estimates how many nodes the model needs.</w:t>
+        <w:pStyle w:val="Heading1"/>
+      </w:pPr>
+      <w:r>
+        <w:t>Slide 20 — KAITO works out the initial GPU node count</w:t>
       </w:r>
     </w:p>
     <w:p>
@@ -1651,9 +1699,21 @@
       </w:pPr>
       <w:r>
         <w:rPr>
-          <w:b w:val="0"/>
-        </w:rPr>
-        <w:t>KAITO reserves memory for overhead and KV cache, then fits the weights into the remaining GPU memory.</w:t>
+          <w:b/>
+        </w:rPr>
+        <w:t>This slide shows how KAITO do</w:t>
+      </w:r>
+      <w:r>
+        <w:rPr>
+          <w:b/>
+        </w:rPr>
+        <w:t>es</w:t>
+      </w:r>
+      <w:r>
+        <w:rPr>
+          <w:b/>
+        </w:rPr>
+        <w:t xml:space="preserve"> the math.</w:t>
       </w:r>
     </w:p>
     <w:p>
@@ -1664,27 +1724,24 @@
         <w:rPr>
           <w:b w:val="0"/>
         </w:rPr>
-        <w:t xml:space="preserve">KAITO saves the result as </w:t>
-      </w:r>
-      <w:r>
-        <w:rPr>
-          <w:b w:val="0"/>
-        </w:rPr>
-        <w:t>status.targetNodeCount</w:t>
-      </w:r>
-      <w:r>
-        <w:rPr>
-          <w:b w:val="0"/>
-        </w:rPr>
-        <w:t xml:space="preserve">. This path uses tensor parallelism within nodes and pipeline parallelism across nodes. It sizes memory, not traffic capacity. </w:t>
+        <w:t xml:space="preserve">User </w:t>
+      </w:r>
+      <w:r>
+        <w:rPr>
+          <w:b w:val="0"/>
+        </w:rPr>
+        <w:t>specifies a model name and GPU SKU. KAITO estimates how many nodes the model needs.</w:t>
       </w:r>
     </w:p>
     <w:p>
       <w:pPr>
-        <w:pStyle w:val="Heading1"/>
-      </w:pPr>
-      <w:r>
-        <w:t>Slide 21 — Why bring llm-d into KAITO?</w:t>
+        <w:keepLines/>
+      </w:pPr>
+      <w:r>
+        <w:rPr>
+          <w:b w:val="0"/>
+        </w:rPr>
+        <w:t>KAITO reserves memory for overhead and KV cache, then fits the weights into the remaining GPU memory.</w:t>
       </w:r>
     </w:p>
     <w:p>
@@ -1695,19 +1752,25 @@
         <w:rPr>
           <w:b w:val="0"/>
         </w:rPr>
-        <w:t xml:space="preserve">So why do we bring </w:t>
-      </w:r>
-      <w:r>
-        <w:rPr>
-          <w:b w:val="0"/>
-        </w:rPr>
-        <w:t>llm</w:t>
-      </w:r>
-      <w:r>
-        <w:rPr>
-          <w:b w:val="0"/>
-        </w:rPr>
-        <w:t>-d into KAITO?</w:t>
+        <w:t xml:space="preserve">KAITO saves the result as </w:t>
+      </w:r>
+      <w:r>
+        <w:rPr>
+          <w:b w:val="0"/>
+        </w:rPr>
+        <w:t>status.targetNodeCount</w:t>
+      </w:r>
+      <w:r>
+        <w:rPr>
+          <w:b w:val="0"/>
+        </w:rPr>
+        <w:t xml:space="preserve">. This path uses tensor parallelism within nodes and pipeline parallelism across nodes. It sizes memory, </w:t>
+      </w:r>
+      <w:r>
+        <w:rPr>
+          <w:b w:val="0"/>
+        </w:rPr>
+        <w:t>not how much traffic it can handle.</w:t>
       </w:r>
       <w:r>
         <w:rPr>
@@ -1718,45 +1781,39 @@
     </w:p>
     <w:p>
       <w:pPr>
-        <w:keepLines/>
-      </w:pPr>
-      <w:r>
-        <w:rPr>
-          <w:b w:val="0"/>
-        </w:rPr>
-        <w:t xml:space="preserve">We want P/D routing without replacing KAITO’s Kubernetes operating model. KAITO manages deployment and lifecycle. </w:t>
-      </w:r>
-      <w:r>
-        <w:rPr>
-          <w:b w:val="0"/>
-        </w:rPr>
-        <w:t>llm</w:t>
-      </w:r>
-      <w:r>
-        <w:rPr>
-          <w:b w:val="0"/>
-        </w:rPr>
-        <w:t xml:space="preserve">-d adds endpoint selection and request routing. </w:t>
-      </w:r>
-      <w:r>
-        <w:rPr>
-          <w:b/>
-        </w:rPr>
-        <w:t>vLLM</w:t>
-      </w:r>
-      <w:r>
-        <w:rPr>
-          <w:b/>
-        </w:rPr>
-        <w:t xml:space="preserve"> runs the prefill and decode phases, and NIXL moves KV.</w:t>
+        <w:pStyle w:val="Heading1"/>
+      </w:pPr>
+      <w:r>
+        <w:t>Slide 21 — Why bring llm-d into KAITO?</w:t>
       </w:r>
     </w:p>
     <w:p>
       <w:pPr>
-        <w:pStyle w:val="Heading1"/>
-      </w:pPr>
-      <w:r>
-        <w:t>Slide 22 — Where KAITO and llm-d fit</w:t>
+        <w:keepLines/>
+      </w:pPr>
+      <w:r>
+        <w:rPr>
+          <w:b w:val="0"/>
+        </w:rPr>
+        <w:t xml:space="preserve">So why do we bring </w:t>
+      </w:r>
+      <w:r>
+        <w:rPr>
+          <w:b w:val="0"/>
+        </w:rPr>
+        <w:t>llm</w:t>
+      </w:r>
+      <w:r>
+        <w:rPr>
+          <w:b w:val="0"/>
+        </w:rPr>
+        <w:t>-d into KAITO?</w:t>
+      </w:r>
+      <w:r>
+        <w:rPr>
+          <w:b w:val="0"/>
+        </w:rPr>
+        <w:t xml:space="preserve"> </w:t>
       </w:r>
     </w:p>
     <w:p>
@@ -1767,18 +1824,132 @@
         <w:rPr>
           <w:b w:val="0"/>
         </w:rPr>
-        <w:t>This is a map of responsibilities, not a required installation checklist. Applications call the inference API. The gateway handles ingress, auth and traffic policy. KAITO manages lifecycle; llm-d selects endpoints.</w:t>
+        <w:t xml:space="preserve">We want P/D routing without replacing KAITO’s Kubernetes operating model. KAITO manages deployment and lifecycle. </w:t>
+      </w:r>
+      <w:r>
+        <w:rPr>
+          <w:b w:val="0"/>
+        </w:rPr>
+        <w:t>llm</w:t>
+      </w:r>
+      <w:r>
+        <w:rPr>
+          <w:b w:val="0"/>
+        </w:rPr>
+        <w:t xml:space="preserve">-d adds endpoint selection and request routing. </w:t>
+      </w:r>
+      <w:r>
+        <w:rPr>
+          <w:b/>
+        </w:rPr>
+        <w:t>vLLM</w:t>
+      </w:r>
+      <w:r>
+        <w:rPr>
+          <w:b/>
+        </w:rPr>
+        <w:t xml:space="preserve"> runs the prefill and decode phases, and NIXL moves KV.</w:t>
       </w:r>
     </w:p>
     <w:p>
       <w:pPr>
+        <w:pStyle w:val="Heading1"/>
+      </w:pPr>
+      <w:r>
+        <w:t>Slide 22 — Where KAITO and llm-d fit</w:t>
+      </w:r>
+    </w:p>
+    <w:p>
+      <w:pPr>
         <w:keepLines/>
       </w:pPr>
       <w:r>
         <w:rPr>
           <w:b w:val="0"/>
         </w:rPr>
-        <w:t>vLLM runs prefill, decode and batching. NIXL moves KV; cache systems reuse or offload it. The infrastructure supports the stack. We will follow the roles, request routing, KV transfer and capacity control.</w:t>
+        <w:t xml:space="preserve">So where </w:t>
+      </w:r>
+      <w:r>
+        <w:rPr>
+          <w:b w:val="0"/>
+        </w:rPr>
+        <w:t>KAITO</w:t>
+      </w:r>
+      <w:r>
+        <w:rPr>
+          <w:b w:val="0"/>
+        </w:rPr>
+        <w:t xml:space="preserve"> and </w:t>
+      </w:r>
+      <w:r>
+        <w:rPr>
+          <w:b w:val="0"/>
+        </w:rPr>
+        <w:t>llm</w:t>
+      </w:r>
+      <w:r>
+        <w:rPr>
+          <w:b w:val="0"/>
+        </w:rPr>
+        <w:t>-d</w:t>
+      </w:r>
+      <w:r>
+        <w:rPr>
+          <w:b w:val="0"/>
+        </w:rPr>
+        <w:t xml:space="preserve"> fit.</w:t>
+      </w:r>
+    </w:p>
+    <w:p>
+      <w:pPr>
+        <w:keepLines/>
+      </w:pPr>
+      <w:r>
+        <w:rPr>
+          <w:b w:val="0"/>
+        </w:rPr>
+        <w:t xml:space="preserve">This is a map of responsibilities, not a required installation checklist. Applications call the inference API. The gateway handles ingress, auth and traffic policy. KAITO manages lifecycle; </w:t>
+      </w:r>
+      <w:r>
+        <w:rPr>
+          <w:b w:val="0"/>
+        </w:rPr>
+        <w:t>llm</w:t>
+      </w:r>
+      <w:r>
+        <w:rPr>
+          <w:b w:val="0"/>
+        </w:rPr>
+        <w:t>-d selects endpoints.</w:t>
+      </w:r>
+    </w:p>
+    <w:p>
+      <w:pPr>
+        <w:keepLines/>
+      </w:pPr>
+      <w:r>
+        <w:rPr>
+          <w:b w:val="0"/>
+        </w:rPr>
+        <w:t>vLLM</w:t>
+      </w:r>
+      <w:r>
+        <w:rPr>
+          <w:b w:val="0"/>
+        </w:rPr>
+        <w:t xml:space="preserve"> runs prefill, decode and batching. NIXL moves KV; cache systems reuse or offload it. </w:t>
+      </w:r>
+      <w:r>
+        <w:rPr>
+          <w:b/>
+        </w:rPr>
+        <w:t>And we depend on Kubernetes to provide</w:t>
+      </w:r>
+      <w:r>
+        <w:rPr>
+          <w:b w:val="0"/>
+        </w:rPr>
+        <w:t xml:space="preserve"> the whole infrastructure to support the stack. We will follow the roles, request routing, KV transfer and capacity control.</w:t>
       </w:r>
     </w:p>
     <w:p>

</xml_diff>

<commit_message>
docs: refresh slides 2-33 scripts from latest KAITO llm-d deck
Signed-off-by: andyzhangx <xiazhang@microsoft.com>
</commit_message>
<xml_diff>
--- a/llm/pd-disaggregation/kubecon-na-2026-pd-disaggregation-kaito-llmd.docx
+++ b/llm/pd-disaggregation/kubecon-na-2026-pd-disaggregation-kaito-llmd.docx
@@ -7,7 +7,7 @@
         <w:pStyle w:val="Title"/>
       </w:pPr>
       <w:r>
-        <w:t>KubeCon North America 2026 — Speaker Scripts (Slides 2–39)</w:t>
+        <w:t>KubeCon North America 2026 — Speaker Scripts (Slides 2–33)</w:t>
       </w:r>
     </w:p>
     <w:p>
@@ -348,7 +348,7 @@
         <w:rPr>
           <w:b w:val="0"/>
         </w:rPr>
-        <w:t xml:space="preserve">So for </w:t>
+        <w:t xml:space="preserve">Apparently for </w:t>
       </w:r>
       <w:r>
         <w:rPr>
@@ -454,7 +454,7 @@
         <w:pStyle w:val="Heading1"/>
       </w:pPr>
       <w:r>
-        <w:t>Slide 8 — One shared pool ties two capacity decisions together</w:t>
+        <w:t>Slide 8 — Long prefills can interrupt token delivery</w:t>
       </w:r>
     </w:p>
     <w:p>
@@ -465,7 +465,7 @@
         <w:rPr>
           <w:b w:val="0"/>
         </w:rPr>
-        <w:t>One shared pool ties two capacity decisions together</w:t>
+        <w:t>Long prefills can interrupt token delivery.</w:t>
       </w:r>
     </w:p>
     <w:p>
@@ -476,19 +476,13 @@
         <w:rPr>
           <w:b w:val="0"/>
         </w:rPr>
-        <w:t xml:space="preserve">A shared pool is simple, but prefill bursts compete with active decoding. </w:t>
-      </w:r>
-      <w:r>
-        <w:rPr>
-          <w:b/>
-        </w:rPr>
-        <w:t>Every worker handles both phases</w:t>
-      </w:r>
-      <w:r>
-        <w:rPr>
-          <w:b w:val="0"/>
-        </w:rPr>
-        <w:t>. One deployment scales both phases together.</w:t>
+        <w:t xml:space="preserve">In this slide, </w:t>
+      </w:r>
+      <w:r>
+        <w:rPr>
+          <w:b w:val="0"/>
+        </w:rPr>
+        <w:t xml:space="preserve">D is ongoing decode. P is prefill for a new request. Where should P run? </w:t>
       </w:r>
     </w:p>
     <w:p>
@@ -499,39 +493,72 @@
         <w:rPr>
           <w:b w:val="0"/>
         </w:rPr>
-        <w:t xml:space="preserve">Where is the trade-off? Prompt bursts can disrupt token delivery. </w:t>
-      </w:r>
-      <w:r>
-        <w:rPr>
-          <w:b w:val="0"/>
-        </w:rPr>
-        <w:t xml:space="preserve">We scale the whole replica, even when only prefill or decode needs more </w:t>
-      </w:r>
-      <w:r>
-        <w:rPr>
-          <w:b w:val="0"/>
-        </w:rPr>
-        <w:t>capacity.</w:t>
-      </w:r>
-      <w:r>
-        <w:rPr>
-          <w:b w:val="0"/>
-        </w:rPr>
-        <w:t>We</w:t>
-      </w:r>
-      <w:r>
-        <w:rPr>
-          <w:b w:val="0"/>
-        </w:rPr>
-        <w:t xml:space="preserve"> must decide how to run each phase and how much shared capacity to add. </w:t>
+        <w:t xml:space="preserve">On the shared GPU graph, </w:t>
+      </w:r>
+      <w:r>
+        <w:rPr>
+          <w:b/>
+        </w:rPr>
+        <w:t xml:space="preserve">there are one prefill task and 4 ongoing decoding workers, you could see </w:t>
+      </w:r>
+      <w:r>
+        <w:rPr>
+          <w:b w:val="0"/>
+        </w:rPr>
+        <w:t xml:space="preserve">that prefill can pause decode. </w:t>
       </w:r>
     </w:p>
     <w:p>
       <w:pPr>
-        <w:pStyle w:val="Heading1"/>
-      </w:pPr>
-      <w:r>
-        <w:t>Slide 9 — Long prefills can interrupt token delivery</w:t>
+        <w:keepLines/>
+      </w:pPr>
+      <w:r>
+        <w:rPr>
+          <w:b w:val="0"/>
+        </w:rPr>
+        <w:t xml:space="preserve">On the separate GPUs </w:t>
+      </w:r>
+      <w:r>
+        <w:rPr>
+          <w:b w:val="0"/>
+        </w:rPr>
+        <w:t>graph</w:t>
+      </w:r>
+      <w:r>
+        <w:rPr>
+          <w:b w:val="0"/>
+        </w:rPr>
+        <w:t xml:space="preserve">, </w:t>
+      </w:r>
+      <w:r>
+        <w:rPr>
+          <w:b/>
+        </w:rPr>
+        <w:t>prefill and decode runs on different GPU nodes</w:t>
+      </w:r>
+      <w:r>
+        <w:rPr>
+          <w:b w:val="0"/>
+        </w:rPr>
+        <w:t xml:space="preserve">, and decode can continue while prefill runs elsewhere. The new request still needs a KV handoff </w:t>
+      </w:r>
+      <w:r>
+        <w:rPr>
+          <w:b/>
+        </w:rPr>
+        <w:t xml:space="preserve">between prefill and decode runtimes </w:t>
+      </w:r>
+      <w:r>
+        <w:rPr>
+          <w:b w:val="0"/>
+        </w:rPr>
+        <w:t xml:space="preserve">in </w:t>
+      </w:r>
+      <w:r>
+        <w:rPr>
+          <w:b w:val="0"/>
+        </w:rPr>
+        <w:t>separate GPUs scenario.</w:t>
       </w:r>
     </w:p>
     <w:p>
@@ -542,24 +569,27 @@
         <w:rPr>
           <w:b w:val="0"/>
         </w:rPr>
-        <w:t>Long prefills can interrupt token delivery.</w:t>
+        <w:t>So</w:t>
+      </w:r>
+      <w:r>
+        <w:rPr>
+          <w:b/>
+        </w:rPr>
+        <w:t xml:space="preserve"> </w:t>
+      </w:r>
+      <w:r>
+        <w:rPr>
+          <w:b w:val="0"/>
+        </w:rPr>
+        <w:t>Separate GPUs remove this execution conflict, but not every source of latency since it requires KV handoff between nodes.</w:t>
       </w:r>
     </w:p>
     <w:p>
       <w:pPr>
-        <w:keepLines/>
-      </w:pPr>
-      <w:r>
-        <w:rPr>
-          <w:b w:val="0"/>
-        </w:rPr>
-        <w:t xml:space="preserve">In this slide, </w:t>
-      </w:r>
-      <w:r>
-        <w:rPr>
-          <w:b w:val="0"/>
-        </w:rPr>
-        <w:t xml:space="preserve">D is ongoing decode. P is prefill for a new request. Where should P run? </w:t>
+        <w:pStyle w:val="Heading1"/>
+      </w:pPr>
+      <w:r>
+        <w:t>Slide 9 — Prefill and decode batch different work</w:t>
       </w:r>
     </w:p>
     <w:p>
@@ -570,19 +600,13 @@
         <w:rPr>
           <w:b w:val="0"/>
         </w:rPr>
-        <w:t xml:space="preserve">On the shared GPU graph, </w:t>
-      </w:r>
-      <w:r>
-        <w:rPr>
-          <w:b/>
-        </w:rPr>
-        <w:t xml:space="preserve">there are one prefill task and 4 ongoing decoding workers, you could see </w:t>
-      </w:r>
-      <w:r>
-        <w:rPr>
-          <w:b w:val="0"/>
-        </w:rPr>
-        <w:t xml:space="preserve">that prefill can pause decode. </w:t>
+        <w:t xml:space="preserve">Prefill and decode batch different work, </w:t>
+      </w:r>
+      <w:r>
+        <w:rPr>
+          <w:b w:val="0"/>
+        </w:rPr>
+        <w:t xml:space="preserve">Prefill batches prompt positions; decode batches independent requests. </w:t>
       </w:r>
     </w:p>
     <w:p>
@@ -593,49 +617,31 @@
         <w:rPr>
           <w:b w:val="0"/>
         </w:rPr>
-        <w:t xml:space="preserve">On the separate GPUs </w:t>
-      </w:r>
-      <w:r>
-        <w:rPr>
-          <w:b w:val="0"/>
-        </w:rPr>
-        <w:t>graph</w:t>
-      </w:r>
-      <w:r>
-        <w:rPr>
-          <w:b w:val="0"/>
-        </w:rPr>
-        <w:t xml:space="preserve">, </w:t>
+        <w:t>On the left</w:t>
+      </w:r>
+      <w:r>
+        <w:rPr>
+          <w:b w:val="0"/>
+        </w:rPr>
+        <w:t xml:space="preserve"> graph</w:t>
+      </w:r>
+      <w:r>
+        <w:rPr>
+          <w:b w:val="0"/>
+        </w:rPr>
+        <w:t xml:space="preserve">, prefill processes the prompt’s tokens in parallel. It can also batch multiple prompts together for efficiency. </w:t>
       </w:r>
       <w:r>
         <w:rPr>
           <w:b/>
         </w:rPr>
-        <w:t>prefill and decode runs on different GPU nodes</w:t>
-      </w:r>
-      <w:r>
-        <w:rPr>
-          <w:b w:val="0"/>
-        </w:rPr>
-        <w:t xml:space="preserve">, and decode can continue while prefill runs elsewhere. The new request still needs a KV handoff </w:t>
+        <w:t>But within each prompt, every token can only attend to itself and the tokens before it</w:t>
       </w:r>
       <w:r>
         <w:rPr>
           <w:b/>
         </w:rPr>
-        <w:t xml:space="preserve">between prefill and decode runtimes </w:t>
-      </w:r>
-      <w:r>
-        <w:rPr>
-          <w:b w:val="0"/>
-        </w:rPr>
-        <w:t xml:space="preserve">in </w:t>
-      </w:r>
-      <w:r>
-        <w:rPr>
-          <w:b w:val="0"/>
-        </w:rPr>
-        <w:t>separate GPUs scenario.</w:t>
+        <w:t>, that’s called causal attention.</w:t>
       </w:r>
     </w:p>
     <w:p>
@@ -646,44 +652,50 @@
         <w:rPr>
           <w:b w:val="0"/>
         </w:rPr>
-        <w:t>So</w:t>
+        <w:t xml:space="preserve">On the right </w:t>
+      </w:r>
+      <w:r>
+        <w:rPr>
+          <w:b w:val="0"/>
+        </w:rPr>
+        <w:t>graph</w:t>
+      </w:r>
+      <w:r>
+        <w:rPr>
+          <w:b w:val="0"/>
+        </w:rPr>
+        <w:t xml:space="preserve">, decode consumes one new token per active request, </w:t>
       </w:r>
       <w:r>
         <w:rPr>
           <w:b/>
         </w:rPr>
-        <w:t xml:space="preserve"> </w:t>
-      </w:r>
-      <w:r>
-        <w:rPr>
-          <w:b w:val="0"/>
-        </w:rPr>
-        <w:t>Separate GPUs remove this execution conflict, but not every source of latency since it requires KV handoff between nodes.</w:t>
+        <w:t>read its past KV cache</w:t>
+      </w:r>
+      <w:r>
+        <w:rPr>
+          <w:b w:val="0"/>
+        </w:rPr>
+        <w:t xml:space="preserve">, then select its next output token. </w:t>
       </w:r>
     </w:p>
     <w:p>
       <w:pPr>
-        <w:pStyle w:val="Heading1"/>
-      </w:pPr>
-      <w:r>
-        <w:t>Slide 10 — Prefill and decode batch different work</w:t>
+        <w:keepLines/>
+      </w:pPr>
+      <w:r>
+        <w:rPr>
+          <w:b w:val="0"/>
+        </w:rPr>
+        <w:t>Prefill gets parallel work from prompt length; decode gets it from active requests. More decode concurrency can raise ITL. Stay within latency and KV-memory budgets.</w:t>
       </w:r>
     </w:p>
     <w:p>
       <w:pPr>
-        <w:keepLines/>
-      </w:pPr>
-      <w:r>
-        <w:rPr>
-          <w:b w:val="0"/>
-        </w:rPr>
-        <w:t xml:space="preserve">Prefill and decode batch different work, </w:t>
-      </w:r>
-      <w:r>
-        <w:rPr>
-          <w:b w:val="0"/>
-        </w:rPr>
-        <w:t xml:space="preserve">Prefill batches prompt positions; decode batches independent requests. </w:t>
+        <w:pStyle w:val="Heading1"/>
+      </w:pPr>
+      <w:r>
+        <w:t>Slide 10 — Separate GPU pools let us tune each phase independently</w:t>
       </w:r>
     </w:p>
     <w:p>
@@ -694,31 +706,19 @@
         <w:rPr>
           <w:b w:val="0"/>
         </w:rPr>
-        <w:t>On the left</w:t>
-      </w:r>
-      <w:r>
-        <w:rPr>
-          <w:b w:val="0"/>
-        </w:rPr>
-        <w:t xml:space="preserve"> graph</w:t>
-      </w:r>
-      <w:r>
-        <w:rPr>
-          <w:b w:val="0"/>
-        </w:rPr>
-        <w:t xml:space="preserve">, prefill processes the prompt’s tokens in parallel. It can also batch multiple prompts together for efficiency. </w:t>
-      </w:r>
-      <w:r>
-        <w:rPr>
-          <w:b/>
-        </w:rPr>
-        <w:t>But within each prompt, every token can only attend to itself and the tokens before it</w:t>
-      </w:r>
-      <w:r>
-        <w:rPr>
-          <w:b/>
-        </w:rPr>
-        <w:t>, that’s called causal attention.</w:t>
+        <w:t xml:space="preserve">Separate GPU pools let us tune each phase independently. </w:t>
+      </w:r>
+      <w:r>
+        <w:rPr>
+          <w:b w:val="0"/>
+        </w:rPr>
+        <w:t xml:space="preserve">The </w:t>
+      </w:r>
+      <w:r>
+        <w:rPr>
+          <w:b w:val="0"/>
+        </w:rPr>
+        <w:t>real benefit is scaling prefill and decode independently to match demand—not simply splitting them into two deployments.</w:t>
       </w:r>
     </w:p>
     <w:p>
@@ -729,50 +729,50 @@
         <w:rPr>
           <w:b w:val="0"/>
         </w:rPr>
-        <w:t xml:space="preserve">On the right </w:t>
-      </w:r>
-      <w:r>
-        <w:rPr>
-          <w:b w:val="0"/>
-        </w:rPr>
-        <w:t>graph</w:t>
-      </w:r>
-      <w:r>
-        <w:rPr>
-          <w:b w:val="0"/>
-        </w:rPr>
-        <w:t xml:space="preserve">, decode consumes one new token per active request, </w:t>
+        <w:t xml:space="preserve">Prefill is often compute-bound. Tune its capacity and parallelism to get better TTFT. On the other hand, decode is often </w:t>
+      </w:r>
+      <w:r>
+        <w:rPr>
+          <w:b w:val="0"/>
+        </w:rPr>
+        <w:t>memory-</w:t>
+      </w:r>
+      <w:r>
+        <w:rPr>
+          <w:b w:val="0"/>
+        </w:rPr>
+        <w:t xml:space="preserve">bandwidth-bound. Tune its capacity and batching to get better ITL. </w:t>
       </w:r>
       <w:r>
         <w:rPr>
           <w:b/>
         </w:rPr>
-        <w:t>read its past KV cache</w:t>
-      </w:r>
-      <w:r>
-        <w:rPr>
-          <w:b w:val="0"/>
-        </w:rPr>
-        <w:t xml:space="preserve">, then select its next output token. </w:t>
+        <w:t>Different latency targets and resource needs can call for different replicas, tensor parallelism and batching policies</w:t>
+      </w:r>
+      <w:r>
+        <w:rPr>
+          <w:b w:val="0"/>
+        </w:rPr>
+        <w:t>. Split only if the gains outweigh KV transfer, extra weight copies and operating costs.</w:t>
       </w:r>
     </w:p>
     <w:p>
       <w:pPr>
-        <w:keepLines/>
-      </w:pPr>
-      <w:r>
-        <w:rPr>
-          <w:b w:val="0"/>
-        </w:rPr>
-        <w:t>Prefill gets parallel work from prompt length; decode gets it from active requests. More decode concurrency can raise ITL. Stay within latency and KV-memory budgets.</w:t>
+        <w:pStyle w:val="Heading1"/>
+      </w:pPr>
+      <w:r>
+        <w:t>Slide 11 — The hard part is the Kubernetes wiring to support P/D</w:t>
       </w:r>
     </w:p>
     <w:p>
       <w:pPr>
-        <w:pStyle w:val="Heading1"/>
-      </w:pPr>
-      <w:r>
-        <w:t>Slide 11 — Separate GPU pools let us tune each phase independently</w:t>
+        <w:keepLines/>
+      </w:pPr>
+      <w:r>
+        <w:rPr>
+          <w:b w:val="0"/>
+        </w:rPr>
+        <w:t>The hard part is the Kubernetes wiring to support prefill and decode disaggregation.</w:t>
       </w:r>
     </w:p>
     <w:p>
@@ -783,19 +783,7 @@
         <w:rPr>
           <w:b w:val="0"/>
         </w:rPr>
-        <w:t xml:space="preserve">Separate GPU pools let us tune each phase independently. </w:t>
-      </w:r>
-      <w:r>
-        <w:rPr>
-          <w:b w:val="0"/>
-        </w:rPr>
-        <w:t xml:space="preserve">The </w:t>
-      </w:r>
-      <w:r>
-        <w:rPr>
-          <w:b w:val="0"/>
-        </w:rPr>
-        <w:t>real benefit is scaling prefill and decode independently to match demand—not simply splitting them into two deployments.</w:t>
+        <w:t>Two pools still have to work together as one model service. The EPP, or Endpoint Picker, picks workers. KV transfer settings must match. The decode-side proxy coordinates requests. We must keep pods ready as replicas change.</w:t>
       </w:r>
     </w:p>
     <w:p>
@@ -806,50 +794,32 @@
         <w:rPr>
           <w:b w:val="0"/>
         </w:rPr>
-        <w:t xml:space="preserve">Prefill is often compute-bound. Tune its capacity and parallelism to get better TTFT. On the other hand, decode is often </w:t>
-      </w:r>
-      <w:r>
-        <w:rPr>
-          <w:b w:val="0"/>
-        </w:rPr>
-        <w:t>memory-</w:t>
-      </w:r>
-      <w:r>
-        <w:rPr>
-          <w:b w:val="0"/>
-        </w:rPr>
-        <w:t xml:space="preserve">bandwidth-bound. Tune its capacity and batching to get better ITL. </w:t>
-      </w:r>
-      <w:r>
-        <w:rPr>
-          <w:b/>
-        </w:rPr>
-        <w:t>Different latency targets and resource needs can call for different replicas, tensor parallelism and batching policies</w:t>
-      </w:r>
-      <w:r>
-        <w:rPr>
-          <w:b w:val="0"/>
-        </w:rPr>
-        <w:t>. Split only if the gains outweigh KV transfer, extra weight copies and operating costs.</w:t>
+        <w:t xml:space="preserve">Routing, KV transfer, labels, ports and readiness must stay in sync, </w:t>
+      </w:r>
+      <w:r>
+        <w:rPr>
+          <w:b w:val="0"/>
+        </w:rPr>
+        <w:t xml:space="preserve">even when pods restart or we scale. </w:t>
       </w:r>
     </w:p>
     <w:p>
       <w:pPr>
-        <w:pStyle w:val="Heading1"/>
-      </w:pPr>
-      <w:r>
-        <w:t>Slide 12 — The hard part is the Kubernetes wiring to support P/D</w:t>
+        <w:keepLines/>
+      </w:pPr>
+      <w:r>
+        <w:rPr>
+          <w:b/>
+        </w:rPr>
+        <w:t xml:space="preserve">There are lots of things to combine, that is why the hard part is the Kubernetes wiring. </w:t>
       </w:r>
     </w:p>
     <w:p>
       <w:pPr>
-        <w:keepLines/>
-      </w:pPr>
-      <w:r>
-        <w:rPr>
-          <w:b w:val="0"/>
-        </w:rPr>
-        <w:t>The hard part is the Kubernetes wiring to support prefill and decode disaggregation.</w:t>
+        <w:pStyle w:val="Heading1"/>
+      </w:pPr>
+      <w:r>
+        <w:t>Slide 12 — Production Distributed Inference Architecture</w:t>
       </w:r>
     </w:p>
     <w:p>
@@ -860,7 +830,7 @@
         <w:rPr>
           <w:b w:val="0"/>
         </w:rPr>
-        <w:t>Two pools still have to work together as one model service. The EPP, or Endpoint Picker, picks workers. KV transfer settings must match. The decode-side proxy coordinates requests. We must keep pods ready as replicas change.</w:t>
+        <w:t>So, this slide shows the big picture.</w:t>
       </w:r>
     </w:p>
     <w:p>
@@ -871,13 +841,7 @@
         <w:rPr>
           <w:b w:val="0"/>
         </w:rPr>
-        <w:t xml:space="preserve">Routing, KV transfer, labels, ports and readiness must stay in sync, </w:t>
-      </w:r>
-      <w:r>
-        <w:rPr>
-          <w:b w:val="0"/>
-        </w:rPr>
-        <w:t xml:space="preserve">even when pods restart or we scale. </w:t>
+        <w:t>Running an inference workload takes more than just a model and a GPU. We also need to route requests, manage workloads, and scale when traffic changes.</w:t>
       </w:r>
     </w:p>
     <w:p>
@@ -886,17 +850,68 @@
       </w:pPr>
       <w:r>
         <w:rPr>
+          <w:b w:val="0"/>
+        </w:rPr>
+        <w:t xml:space="preserve">That’s where </w:t>
+      </w:r>
+      <w:r>
+        <w:rPr>
           <w:b/>
         </w:rPr>
-        <w:t xml:space="preserve">There are lots of things to combine, that is why the hard part is the Kubernetes wiring. </w:t>
+        <w:t xml:space="preserve">KAITO and </w:t>
+      </w:r>
+      <w:r>
+        <w:rPr>
+          <w:b/>
+        </w:rPr>
+        <w:t>llm</w:t>
+      </w:r>
+      <w:r>
+        <w:rPr>
+          <w:b/>
+        </w:rPr>
+        <w:t xml:space="preserve">-d </w:t>
+      </w:r>
+      <w:r>
+        <w:rPr>
+          <w:b w:val="0"/>
+        </w:rPr>
+        <w:t>come in—the orchestration layer in the middle.</w:t>
       </w:r>
     </w:p>
     <w:p>
       <w:pPr>
-        <w:pStyle w:val="Heading1"/>
-      </w:pPr>
-      <w:r>
-        <w:t>Slide 13 — Production Distributed Inference Architecture</w:t>
+        <w:keepLines/>
+      </w:pPr>
+      <w:r>
+        <w:rPr>
+          <w:b w:val="0"/>
+        </w:rPr>
+        <w:t xml:space="preserve">Below that, </w:t>
+      </w:r>
+      <w:r>
+        <w:rPr>
+          <w:b/>
+        </w:rPr>
+        <w:t>vLLM</w:t>
+      </w:r>
+      <w:r>
+        <w:rPr>
+          <w:b w:val="0"/>
+        </w:rPr>
+        <w:t xml:space="preserve"> runs the model, and the </w:t>
+      </w:r>
+      <w:r>
+        <w:rPr>
+          <w:b/>
+        </w:rPr>
+        <w:t xml:space="preserve">KV cache </w:t>
+      </w:r>
+      <w:r>
+        <w:rPr>
+          <w:b w:val="0"/>
+        </w:rPr>
+        <w:t>helps us reuse work instead of doing it again. Kubernetes provides the infrastructure underneath.</w:t>
       </w:r>
     </w:p>
     <w:p>
@@ -907,7 +922,7 @@
         <w:rPr>
           <w:b w:val="0"/>
         </w:rPr>
-        <w:t>So, this slide shows the big picture.</w:t>
+        <w:t>We also need things like security and monitoring around the whole system.</w:t>
       </w:r>
     </w:p>
     <w:p>
@@ -918,7 +933,7 @@
         <w:rPr>
           <w:b w:val="0"/>
         </w:rPr>
-        <w:t>Running an inference workload takes more than just a model and a GPU. We also need to route requests, manage workloads, and scale when traffic changes.</w:t>
+        <w:t>The main takeaway is simple: all these pieces need to work together.</w:t>
       </w:r>
     </w:p>
     <w:p>
@@ -929,66 +944,27 @@
         <w:rPr>
           <w:b w:val="0"/>
         </w:rPr>
-        <w:t xml:space="preserve">That’s where </w:t>
-      </w:r>
-      <w:r>
-        <w:rPr>
-          <w:b/>
-        </w:rPr>
-        <w:t xml:space="preserve">KAITO and </w:t>
-      </w:r>
-      <w:r>
-        <w:rPr>
-          <w:b/>
+        <w:t xml:space="preserve">Today, we’ll focus on how KAITO and </w:t>
+      </w:r>
+      <w:r>
+        <w:rPr>
+          <w:b w:val="0"/>
         </w:rPr>
         <w:t>llm</w:t>
       </w:r>
       <w:r>
         <w:rPr>
-          <w:b/>
-        </w:rPr>
-        <w:t xml:space="preserve">-d </w:t>
-      </w:r>
-      <w:r>
-        <w:rPr>
-          <w:b w:val="0"/>
-        </w:rPr>
-        <w:t>come in—the orchestration layer in the middle.</w:t>
+          <w:b w:val="0"/>
+        </w:rPr>
+        <w:t>-d help with that. Let’s look at some of the open-source options.</w:t>
       </w:r>
     </w:p>
     <w:p>
       <w:pPr>
-        <w:keepLines/>
-      </w:pPr>
-      <w:r>
-        <w:rPr>
-          <w:b w:val="0"/>
-        </w:rPr>
-        <w:t xml:space="preserve">Below that, </w:t>
-      </w:r>
-      <w:r>
-        <w:rPr>
-          <w:b/>
-        </w:rPr>
-        <w:t>vLLM</w:t>
-      </w:r>
-      <w:r>
-        <w:rPr>
-          <w:b w:val="0"/>
-        </w:rPr>
-        <w:t xml:space="preserve"> runs the model, and the </w:t>
-      </w:r>
-      <w:r>
-        <w:rPr>
-          <w:b/>
-        </w:rPr>
-        <w:t xml:space="preserve">KV cache </w:t>
-      </w:r>
-      <w:r>
-        <w:rPr>
-          <w:b w:val="0"/>
-        </w:rPr>
-        <w:t>helps us reuse work instead of doing it again. Kubernetes provides the infrastructure underneath.</w:t>
+        <w:pStyle w:val="Heading1"/>
+      </w:pPr>
+      <w:r>
+        <w:t>Slide 13 — Open-source P/D has several paths, not one winner</w:t>
       </w:r>
     </w:p>
     <w:p>
@@ -999,7 +975,13 @@
         <w:rPr>
           <w:b w:val="0"/>
         </w:rPr>
-        <w:t>We also need things like security and monitoring around the whole system.</w:t>
+        <w:t xml:space="preserve">Open-source P/D has several paths, not one winner. </w:t>
+      </w:r>
+      <w:r>
+        <w:rPr>
+          <w:b w:val="0"/>
+        </w:rPr>
+        <w:t>The following table presents examples, not a ranking. Some approaches can be used together.</w:t>
       </w:r>
     </w:p>
     <w:p>
@@ -1008,57 +990,216 @@
       </w:pPr>
       <w:r>
         <w:rPr>
-          <w:b w:val="0"/>
-        </w:rPr>
-        <w:t>The main takeaway is simple: all these pieces need to work together.</w:t>
+          <w:b/>
+        </w:rPr>
+        <w:t xml:space="preserve">The middle column </w:t>
+      </w:r>
+      <w:r>
+        <w:rPr>
+          <w:b w:val="0"/>
+        </w:rPr>
+        <w:t xml:space="preserve">shows the serving and routing path; </w:t>
+      </w:r>
+      <w:r>
+        <w:rPr>
+          <w:b/>
+        </w:rPr>
+        <w:t xml:space="preserve">the right column </w:t>
+      </w:r>
+      <w:r>
+        <w:rPr>
+          <w:b w:val="0"/>
+        </w:rPr>
+        <w:t xml:space="preserve">shows what users configure in Kubernetes. Dynamo, </w:t>
+      </w:r>
+      <w:r>
+        <w:rPr>
+          <w:b w:val="0"/>
+        </w:rPr>
+        <w:t>llm</w:t>
+      </w:r>
+      <w:r>
+        <w:rPr>
+          <w:b w:val="0"/>
+        </w:rPr>
+        <w:t xml:space="preserve">-d, </w:t>
+      </w:r>
+      <w:r>
+        <w:rPr>
+          <w:b w:val="0"/>
+        </w:rPr>
+        <w:t>AIBrix</w:t>
+      </w:r>
+      <w:r>
+        <w:rPr>
+          <w:b w:val="0"/>
+        </w:rPr>
+        <w:t xml:space="preserve">, </w:t>
+      </w:r>
+      <w:r>
+        <w:rPr>
+          <w:b w:val="0"/>
+        </w:rPr>
+        <w:t>KServe</w:t>
+      </w:r>
+      <w:r>
+        <w:rPr>
+          <w:b w:val="0"/>
+        </w:rPr>
+        <w:t xml:space="preserve">, Ray Serve and </w:t>
+      </w:r>
+      <w:r>
+        <w:rPr>
+          <w:b w:val="0"/>
+        </w:rPr>
+        <w:t>vLLM</w:t>
+      </w:r>
+      <w:r>
+        <w:rPr>
+          <w:b w:val="0"/>
+        </w:rPr>
+        <w:t xml:space="preserve"> Production Stack offer different combinations. P/D deployment options already exist. KAITO aims to make them easier to use. </w:t>
+      </w:r>
+      <w:r>
+        <w:rPr>
+          <w:b/>
+        </w:rPr>
+        <w:t xml:space="preserve">For KAITO users, they want less manual configuration to maintain. Let’s start with </w:t>
+      </w:r>
+      <w:r>
+        <w:rPr>
+          <w:b/>
+        </w:rPr>
+        <w:t>llm</w:t>
+      </w:r>
+      <w:r>
+        <w:rPr>
+          <w:b/>
+        </w:rPr>
+        <w:t>-d.</w:t>
       </w:r>
     </w:p>
     <w:p>
       <w:pPr>
-        <w:keepLines/>
-      </w:pPr>
-      <w:r>
-        <w:rPr>
-          <w:b w:val="0"/>
-        </w:rPr>
-        <w:t xml:space="preserve">Today, we’ll focus on how KAITO and </w:t>
-      </w:r>
-      <w:r>
-        <w:rPr>
-          <w:b w:val="0"/>
-        </w:rPr>
-        <w:t>llm</w:t>
-      </w:r>
-      <w:r>
-        <w:rPr>
-          <w:b w:val="0"/>
-        </w:rPr>
-        <w:t>-d help with that. Let’s look at some of the open-source options.</w:t>
+        <w:pStyle w:val="Heading1"/>
+      </w:pPr>
+      <w:r>
+        <w:t>Slide 14 — llm-d: a distributed inference stack</w:t>
       </w:r>
     </w:p>
     <w:p>
       <w:pPr>
-        <w:pStyle w:val="Heading1"/>
-      </w:pPr>
-      <w:r>
-        <w:t>Slide 14 — Open-source P/D has several paths, not one winner</w:t>
+        <w:keepLines/>
+      </w:pPr>
+      <w:r>
+        <w:rPr>
+          <w:b w:val="0"/>
+        </w:rPr>
+        <w:t xml:space="preserve">llm-d is a Kubernetes-native framework for high-performance distributed inference. </w:t>
+      </w:r>
+      <w:r>
+        <w:rPr>
+          <w:b w:val="0"/>
+        </w:rPr>
+        <w:t xml:space="preserve">It joined the CNCF Sandbox in March 2026. </w:t>
+      </w:r>
+      <w:r>
+        <w:rPr>
+          <w:b/>
+        </w:rPr>
+        <w:t>It does not replace vLLM, gateways, or storage systems; it composes them</w:t>
+      </w:r>
+      <w:r>
+        <w:rPr>
+          <w:b w:val="0"/>
+        </w:rPr>
+        <w:t xml:space="preserve">. </w:t>
+      </w:r>
+      <w:r>
+        <w:rPr>
+          <w:b/>
+        </w:rPr>
+        <w:t>Its value is organized</w:t>
+      </w:r>
+      <w:r>
+        <w:rPr>
+          <w:b/>
+        </w:rPr>
+        <w:t xml:space="preserve"> into </w:t>
+      </w:r>
+      <w:r>
+        <w:rPr>
+          <w:b/>
+        </w:rPr>
+        <w:t>three ideas</w:t>
+      </w:r>
+      <w:r>
+        <w:rPr>
+          <w:b w:val="0"/>
+        </w:rPr>
+        <w:t>:</w:t>
+      </w:r>
+      <w:r>
+        <w:rPr>
+          <w:b w:val="0"/>
+        </w:rPr>
+        <w:t xml:space="preserve"> first </w:t>
+      </w:r>
+      <w:r>
+        <w:rPr>
+          <w:b w:val="0"/>
+        </w:rPr>
+        <w:t xml:space="preserve">modular architecture: </w:t>
+      </w:r>
+      <w:r>
+        <w:rPr>
+          <w:b w:val="0"/>
+        </w:rPr>
+        <w:t xml:space="preserve">Gateway API connects inference routing to Kubernetes, second, </w:t>
+      </w:r>
+      <w:r>
+        <w:rPr>
+          <w:b w:val="0"/>
+        </w:rPr>
+        <w:t xml:space="preserve">Extensible components: </w:t>
+      </w:r>
+      <w:r>
+        <w:rPr>
+          <w:b w:val="0"/>
+        </w:rPr>
+        <w:t>combine runtimes, routing plugins and KV transport,</w:t>
+      </w:r>
+      <w:r>
+        <w:rPr>
+          <w:b w:val="0"/>
+        </w:rPr>
+        <w:t xml:space="preserve"> </w:t>
+      </w:r>
+      <w:r>
+        <w:rPr>
+          <w:b w:val="0"/>
+        </w:rPr>
+        <w:t xml:space="preserve">third, </w:t>
+      </w:r>
+      <w:r>
+        <w:rPr>
+          <w:b w:val="0"/>
+        </w:rPr>
+        <w:t xml:space="preserve">Well-lit paths, there are </w:t>
+      </w:r>
+      <w:r>
+        <w:rPr>
+          <w:b w:val="0"/>
+        </w:rPr>
+        <w:t>tested deployment patterns make trade-offs clear.</w:t>
       </w:r>
     </w:p>
     <w:p>
       <w:pPr>
-        <w:keepLines/>
-      </w:pPr>
-      <w:r>
-        <w:rPr>
-          <w:b w:val="0"/>
-        </w:rPr>
-        <w:t xml:space="preserve">Open-source P/D has several paths, not one winner. </w:t>
-      </w:r>
-      <w:r>
-        <w:rPr>
-          <w:b w:val="0"/>
-        </w:rPr>
-        <w:t>The following table presents examples, not a ranking. Some approaches can be used together.</w:t>
+        <w:pStyle w:val="Heading1"/>
+      </w:pPr>
+      <w:r>
+        <w:t>Slide 15 — llm-d: capabilities for distributed inference</w:t>
       </w:r>
     </w:p>
     <w:p>
@@ -1067,27 +1208,9 @@
       </w:pPr>
       <w:r>
         <w:rPr>
-          <w:b/>
-        </w:rPr>
-        <w:t xml:space="preserve">The middle column </w:t>
-      </w:r>
-      <w:r>
-        <w:rPr>
-          <w:b w:val="0"/>
-        </w:rPr>
-        <w:t xml:space="preserve">shows the serving and routing path; </w:t>
-      </w:r>
-      <w:r>
-        <w:rPr>
-          <w:b/>
-        </w:rPr>
-        <w:t xml:space="preserve">the right column </w:t>
-      </w:r>
-      <w:r>
-        <w:rPr>
-          <w:b w:val="0"/>
-        </w:rPr>
-        <w:t xml:space="preserve">shows what users configure in Kubernetes. Dynamo, </w:t>
+          <w:b w:val="0"/>
+        </w:rPr>
+        <w:t xml:space="preserve">These are reusable capabilities, not a performance guarantee. </w:t>
       </w:r>
       <w:r>
         <w:rPr>
@@ -1099,69 +1222,60 @@
         <w:rPr>
           <w:b w:val="0"/>
         </w:rPr>
-        <w:t xml:space="preserve">-d, </w:t>
-      </w:r>
-      <w:r>
-        <w:rPr>
-          <w:b w:val="0"/>
-        </w:rPr>
-        <w:t>AIBrix</w:t>
-      </w:r>
-      <w:r>
-        <w:rPr>
-          <w:b w:val="0"/>
-        </w:rPr>
-        <w:t xml:space="preserve">, </w:t>
-      </w:r>
-      <w:r>
-        <w:rPr>
-          <w:b w:val="0"/>
-        </w:rPr>
-        <w:t>KServe</w:t>
-      </w:r>
-      <w:r>
-        <w:rPr>
-          <w:b w:val="0"/>
-        </w:rPr>
-        <w:t xml:space="preserve">, Ray Serve and </w:t>
-      </w:r>
-      <w:r>
-        <w:rPr>
-          <w:b w:val="0"/>
-        </w:rPr>
-        <w:t>vLLM</w:t>
-      </w:r>
-      <w:r>
-        <w:rPr>
-          <w:b w:val="0"/>
-        </w:rPr>
-        <w:t xml:space="preserve"> Production Stack offer different combinations. P/D deployment options already exist. KAITO aims to make them easier to use. </w:t>
-      </w:r>
-      <w:r>
-        <w:rPr>
-          <w:b/>
-        </w:rPr>
-        <w:t xml:space="preserve">For KAITO users, they want less manual configuration to maintain. Let’s start with </w:t>
-      </w:r>
-      <w:r>
-        <w:rPr>
-          <w:b/>
+        <w:t xml:space="preserve">-d builds on the serving runtime, not replace it. And we combine reusable </w:t>
+      </w:r>
+      <w:r>
+        <w:rPr>
+          <w:b w:val="0"/>
         </w:rPr>
         <w:t>llm</w:t>
       </w:r>
       <w:r>
         <w:rPr>
-          <w:b/>
-        </w:rPr>
-        <w:t>-d.</w:t>
+          <w:b w:val="0"/>
+        </w:rPr>
+        <w:t xml:space="preserve">-d </w:t>
+      </w:r>
+      <w:r>
+        <w:rPr>
+          <w:b w:val="0"/>
+        </w:rPr>
+        <w:t xml:space="preserve">components, </w:t>
+      </w:r>
+      <w:r>
+        <w:rPr>
+          <w:b w:val="0"/>
+        </w:rPr>
+        <w:t>Deployment paths explain the trade-offs.</w:t>
       </w:r>
     </w:p>
     <w:p>
       <w:pPr>
-        <w:pStyle w:val="Heading1"/>
-      </w:pPr>
-      <w:r>
-        <w:t>Slide 15 — llm-d: a distributed inference stack</w:t>
+        <w:keepLines/>
+      </w:pPr>
+      <w:r>
+        <w:rPr>
+          <w:b w:val="0"/>
+        </w:rPr>
+        <w:t xml:space="preserve">There are mainly </w:t>
+      </w:r>
+      <w:r>
+        <w:rPr>
+          <w:b w:val="0"/>
+        </w:rPr>
+        <w:t xml:space="preserve">four areas of capability for </w:t>
+      </w:r>
+      <w:r>
+        <w:rPr>
+          <w:b w:val="0"/>
+        </w:rPr>
+        <w:t>llm</w:t>
+      </w:r>
+      <w:r>
+        <w:rPr>
+          <w:b w:val="0"/>
+        </w:rPr>
+        <w:t>-d projects:</w:t>
       </w:r>
     </w:p>
     <w:p>
@@ -1172,103 +1286,67 @@
         <w:rPr>
           <w:b w:val="0"/>
         </w:rPr>
-        <w:t xml:space="preserve">llm-d is a Kubernetes-native framework for high-performance distributed inference. </w:t>
-      </w:r>
-      <w:r>
-        <w:rPr>
-          <w:b w:val="0"/>
-        </w:rPr>
-        <w:t xml:space="preserve">It joined the CNCF Sandbox in March 2026. </w:t>
-      </w:r>
-      <w:r>
-        <w:rPr>
-          <w:b/>
-        </w:rPr>
-        <w:t>It does not replace vLLM, gateways, or storage systems; it composes them</w:t>
-      </w:r>
-      <w:r>
-        <w:rPr>
-          <w:b w:val="0"/>
-        </w:rPr>
-        <w:t xml:space="preserve">. </w:t>
-      </w:r>
-      <w:r>
-        <w:rPr>
-          <w:b/>
-        </w:rPr>
-        <w:t>Its value is organized</w:t>
-      </w:r>
-      <w:r>
-        <w:rPr>
-          <w:b/>
-        </w:rPr>
-        <w:t xml:space="preserve"> into </w:t>
-      </w:r>
-      <w:r>
-        <w:rPr>
-          <w:b/>
-        </w:rPr>
-        <w:t>three ideas</w:t>
-      </w:r>
-      <w:r>
-        <w:rPr>
-          <w:b w:val="0"/>
-        </w:rPr>
-        <w:t>:</w:t>
-      </w:r>
-      <w:r>
-        <w:rPr>
-          <w:b w:val="0"/>
-        </w:rPr>
-        <w:t xml:space="preserve"> first </w:t>
-      </w:r>
-      <w:r>
-        <w:rPr>
-          <w:b w:val="0"/>
-        </w:rPr>
-        <w:t xml:space="preserve">modular architecture: </w:t>
-      </w:r>
-      <w:r>
-        <w:rPr>
-          <w:b w:val="0"/>
-        </w:rPr>
-        <w:t xml:space="preserve">Gateway API connects inference routing to Kubernetes, second, </w:t>
-      </w:r>
-      <w:r>
-        <w:rPr>
-          <w:b w:val="0"/>
-        </w:rPr>
-        <w:t xml:space="preserve">Extensible components: </w:t>
-      </w:r>
-      <w:r>
-        <w:rPr>
-          <w:b w:val="0"/>
-        </w:rPr>
-        <w:t>combine runtimes, routing plugins and KV transport,</w:t>
-      </w:r>
-      <w:r>
-        <w:rPr>
-          <w:b w:val="0"/>
-        </w:rPr>
-        <w:t xml:space="preserve"> </w:t>
-      </w:r>
-      <w:r>
-        <w:rPr>
-          <w:b w:val="0"/>
-        </w:rPr>
-        <w:t xml:space="preserve">third, </w:t>
-      </w:r>
-      <w:r>
-        <w:rPr>
-          <w:b w:val="0"/>
-        </w:rPr>
-        <w:t xml:space="preserve">Well-lit paths, there are </w:t>
-      </w:r>
-      <w:r>
-        <w:rPr>
-          <w:b w:val="0"/>
-        </w:rPr>
-        <w:t>tested deployment patterns make trade-offs clear.</w:t>
+        <w:t xml:space="preserve">first: </w:t>
+      </w:r>
+      <w:r>
+        <w:rPr>
+          <w:b w:val="0"/>
+        </w:rPr>
+        <w:t xml:space="preserve">State-of-the-art </w:t>
+      </w:r>
+      <w:r>
+        <w:rPr>
+          <w:b w:val="0"/>
+        </w:rPr>
+        <w:t>MoE</w:t>
+      </w:r>
+      <w:r>
+        <w:rPr>
+          <w:b w:val="0"/>
+        </w:rPr>
+        <w:t xml:space="preserve"> serving, </w:t>
+      </w:r>
+      <w:r>
+        <w:rPr>
+          <w:b w:val="0"/>
+        </w:rPr>
+        <w:t>Expert parallelism spreads expert computation across GPUs, second, p</w:t>
+      </w:r>
+      <w:r>
+        <w:rPr>
+          <w:b w:val="0"/>
+        </w:rPr>
+        <w:t>refill/decode disaggregation, w</w:t>
+      </w:r>
+      <w:r>
+        <w:rPr>
+          <w:b w:val="0"/>
+        </w:rPr>
+        <w:t xml:space="preserve">e separate the phases and transfer KV between roles. Third, </w:t>
+      </w:r>
+      <w:r>
+        <w:rPr>
+          <w:b w:val="0"/>
+        </w:rPr>
+        <w:t xml:space="preserve">State-aware scheduling: </w:t>
+      </w:r>
+      <w:r>
+        <w:rPr>
+          <w:b w:val="0"/>
+        </w:rPr>
+        <w:t>Routing plugins use cache and load signals to pick workers. Last is a</w:t>
+      </w:r>
+      <w:r>
+        <w:rPr>
+          <w:b w:val="0"/>
+        </w:rPr>
+        <w:t>utoscaling architecture: w</w:t>
+      </w:r>
+      <w:r>
+        <w:rPr>
+          <w:b w:val="0"/>
+        </w:rPr>
+        <w:t>orkload signals and SLOs guide capacity; each integration chooses its policy.</w:t>
       </w:r>
     </w:p>
     <w:p>
@@ -1276,7 +1354,7 @@
         <w:pStyle w:val="Heading1"/>
       </w:pPr>
       <w:r>
-        <w:t>Slide 16 — llm-d: capabilities for distributed inference</w:t>
+        <w:t>Slide 16 — What is KAITO (Kubernetes AI Toolchain Operator)?</w:t>
       </w:r>
     </w:p>
     <w:p>
@@ -1287,43 +1365,25 @@
         <w:rPr>
           <w:b w:val="0"/>
         </w:rPr>
-        <w:t xml:space="preserve">These are reusable capabilities, not a performance guarantee. </w:t>
-      </w:r>
-      <w:r>
-        <w:rPr>
-          <w:b w:val="0"/>
-        </w:rPr>
-        <w:t>llm</w:t>
-      </w:r>
-      <w:r>
-        <w:rPr>
-          <w:b w:val="0"/>
-        </w:rPr>
-        <w:t xml:space="preserve">-d builds on the serving runtime, not replace it. And we combine reusable </w:t>
-      </w:r>
-      <w:r>
-        <w:rPr>
-          <w:b w:val="0"/>
-        </w:rPr>
-        <w:t>llm</w:t>
-      </w:r>
-      <w:r>
-        <w:rPr>
-          <w:b w:val="0"/>
-        </w:rPr>
-        <w:t xml:space="preserve">-d </w:t>
-      </w:r>
-      <w:r>
-        <w:rPr>
-          <w:b w:val="0"/>
-        </w:rPr>
-        <w:t xml:space="preserve">components, </w:t>
-      </w:r>
-      <w:r>
-        <w:rPr>
-          <w:b w:val="0"/>
-        </w:rPr>
-        <w:t>Deployment paths explain the trade-offs.</w:t>
+        <w:t xml:space="preserve">Next, what is KAITO, </w:t>
+      </w:r>
+      <w:r>
+        <w:rPr>
+          <w:b w:val="0"/>
+        </w:rPr>
+        <w:t xml:space="preserve">KAITO stands for </w:t>
+      </w:r>
+      <w:r>
+        <w:rPr>
+          <w:b w:val="0"/>
+        </w:rPr>
+        <w:t xml:space="preserve">Kubernetes AI Toolchain Operator, which </w:t>
+      </w:r>
+      <w:r>
+        <w:rPr>
+          <w:b w:val="0"/>
+        </w:rPr>
+        <w:t>automates LLM inference, fine-tuning and RAG with Kubernetes operators. It is also a CNCF Sandbox project.</w:t>
       </w:r>
     </w:p>
     <w:p>
@@ -1332,124 +1392,58 @@
       </w:pPr>
       <w:r>
         <w:rPr>
-          <w:b w:val="0"/>
-        </w:rPr>
-        <w:t xml:space="preserve">There are mainly </w:t>
-      </w:r>
-      <w:r>
-        <w:rPr>
-          <w:b w:val="0"/>
-        </w:rPr>
-        <w:t xml:space="preserve">four areas of capability for </w:t>
-      </w:r>
-      <w:r>
-        <w:rPr>
-          <w:b w:val="0"/>
-        </w:rPr>
-        <w:t>llm</w:t>
-      </w:r>
-      <w:r>
-        <w:rPr>
-          <w:b w:val="0"/>
-        </w:rPr>
-        <w:t>-d projects:</w:t>
+          <w:b/>
+        </w:rPr>
+        <w:t xml:space="preserve">With KAITO, you only need to </w:t>
+      </w:r>
+      <w:r>
+        <w:rPr>
+          <w:b w:val="0"/>
+        </w:rPr>
+        <w:t xml:space="preserve">specify a model name and GPU VM SKU. KAITO sizes the nodes to fit the model’s memory requirements, handles model setup and caching, manages inference workloads and rolling updates on Kubernetes, and uses KEDA to automatically scale </w:t>
+      </w:r>
+      <w:r>
+        <w:rPr>
+          <w:b w:val="0"/>
+        </w:rPr>
+        <w:t xml:space="preserve">inference </w:t>
+      </w:r>
+      <w:r>
+        <w:rPr>
+          <w:b w:val="0"/>
+        </w:rPr>
+        <w:t>workloads.</w:t>
       </w:r>
     </w:p>
     <w:p>
       <w:pPr>
-        <w:keepLines/>
-      </w:pPr>
-      <w:r>
-        <w:rPr>
-          <w:b w:val="0"/>
-        </w:rPr>
-        <w:t xml:space="preserve">first: </w:t>
-      </w:r>
-      <w:r>
-        <w:rPr>
-          <w:b w:val="0"/>
-        </w:rPr>
-        <w:t xml:space="preserve">State-of-the-art </w:t>
-      </w:r>
-      <w:r>
-        <w:rPr>
-          <w:b w:val="0"/>
-        </w:rPr>
-        <w:t>MoE</w:t>
-      </w:r>
-      <w:r>
-        <w:rPr>
-          <w:b w:val="0"/>
-        </w:rPr>
-        <w:t xml:space="preserve"> serving, </w:t>
-      </w:r>
-      <w:r>
-        <w:rPr>
-          <w:b/>
-        </w:rPr>
-        <w:t xml:space="preserve">Here, </w:t>
-      </w:r>
-      <w:r>
-        <w:rPr>
-          <w:b/>
-        </w:rPr>
-        <w:t>MoE</w:t>
-      </w:r>
-      <w:r>
-        <w:rPr>
-          <w:b/>
-        </w:rPr>
-        <w:t xml:space="preserve"> stands for Mixture of Experts, which is widely used in mainstream LLMs. </w:t>
-      </w:r>
-      <w:r>
-        <w:rPr>
-          <w:b w:val="0"/>
-        </w:rPr>
-        <w:t>Expert parallelism spreads expert computation across GPUs, second, p</w:t>
-      </w:r>
-      <w:r>
-        <w:rPr>
-          <w:b w:val="0"/>
-        </w:rPr>
-        <w:t>refill/decode disaggregation, w</w:t>
-      </w:r>
-      <w:r>
-        <w:rPr>
-          <w:b w:val="0"/>
-        </w:rPr>
-        <w:t xml:space="preserve">e separate the phases and transfer KV between roles. Third, </w:t>
-      </w:r>
-      <w:r>
-        <w:rPr>
-          <w:b w:val="0"/>
-        </w:rPr>
-        <w:t xml:space="preserve">State-aware scheduling: </w:t>
-      </w:r>
-      <w:r>
-        <w:rPr>
-          <w:b w:val="0"/>
-        </w:rPr>
-        <w:t>Routing plugins use cache and load signals to pick workers. Last is a</w:t>
-      </w:r>
-      <w:r>
-        <w:rPr>
-          <w:b w:val="0"/>
-        </w:rPr>
-        <w:t>utoscaling architecture: w</w:t>
-      </w:r>
-      <w:r>
-        <w:rPr>
-          <w:b w:val="0"/>
-        </w:rPr>
-        <w:t>orkload signals and SLOs guide capacity; each integration chooses its policy.</w:t>
+        <w:pStyle w:val="Heading1"/>
+      </w:pPr>
+      <w:r>
+        <w:t>Slide 17 — KAITO workload example</w:t>
       </w:r>
     </w:p>
     <w:p>
       <w:pPr>
-        <w:pStyle w:val="Heading1"/>
-      </w:pPr>
-      <w:r>
-        <w:t>Slide 17 — llm-d “well-lit paths”</w:t>
+        <w:keepLines/>
+      </w:pPr>
+      <w:r>
+        <w:rPr>
+          <w:b w:val="0"/>
+        </w:rPr>
+        <w:t xml:space="preserve">Here is a KAITO </w:t>
+      </w:r>
+      <w:r>
+        <w:rPr>
+          <w:b w:val="0"/>
+        </w:rPr>
+        <w:t xml:space="preserve">inference workload example, user only needs to </w:t>
+      </w:r>
+      <w:r>
+        <w:rPr>
+          <w:b w:val="0"/>
+        </w:rPr>
+        <w:t>specify the model name, GPU instance type and replica count.</w:t>
       </w:r>
     </w:p>
     <w:p>
@@ -1460,19 +1454,25 @@
         <w:rPr>
           <w:b w:val="0"/>
         </w:rPr>
-        <w:t>llm-d calls these “well-lit paths”—</w:t>
-      </w:r>
-      <w:r>
-        <w:rPr>
-          <w:b w:val="0"/>
-        </w:rPr>
-        <w:t xml:space="preserve">these are </w:t>
-      </w:r>
-      <w:r>
-        <w:rPr>
-          <w:b w:val="0"/>
-        </w:rPr>
-        <w:t>tested ways to deploy, with clear guidance on what works well and what the limitations are.</w:t>
+        <w:t xml:space="preserve">In this example, user specifies a qwen3 model name which is a </w:t>
+      </w:r>
+      <w:r>
+        <w:rPr>
+          <w:b w:val="0"/>
+        </w:rPr>
+        <w:t>huggingface</w:t>
+      </w:r>
+      <w:r>
+        <w:rPr>
+          <w:b w:val="0"/>
+        </w:rPr>
+        <w:t xml:space="preserve"> model id and specifies A100 GPU instance type with 3 replicas, </w:t>
+      </w:r>
+      <w:r>
+        <w:rPr>
+          <w:b/>
+        </w:rPr>
+        <w:t xml:space="preserve">three replicas does not necessarily mean three GPUs; each replica’s GPU and node needs depend on the model and runtime settings. </w:t>
       </w:r>
     </w:p>
     <w:p>
@@ -1481,20 +1481,23 @@
       </w:pPr>
       <w:r>
         <w:rPr>
-          <w:b w:val="0"/>
-        </w:rPr>
-        <w:t>Intelligent scheduling determines where this request should run</w:t>
+          <w:b/>
+        </w:rPr>
+        <w:t xml:space="preserve">KAITO does all the rest of work, like provisioning the required GPU nodes </w:t>
+      </w:r>
+      <w:r>
+        <w:rPr>
+          <w:b/>
+        </w:rPr>
+        <w:t>to fit the model’s memory requirements, handles model setup and caching, manages inference workloads and rolling updates on Kubernetes.</w:t>
       </w:r>
     </w:p>
     <w:p>
       <w:pPr>
-        <w:keepLines/>
-      </w:pPr>
-      <w:r>
-        <w:rPr>
-          <w:b w:val="0"/>
-        </w:rPr>
-        <w:t>KV cache management determines where should reusable state live?</w:t>
+        <w:pStyle w:val="Heading1"/>
+      </w:pPr>
+      <w:r>
+        <w:t>Slide 18 — KAITO works out the initial GPU node count</w:t>
       </w:r>
     </w:p>
     <w:p>
@@ -1503,21 +1506,21 @@
       </w:pPr>
       <w:r>
         <w:rPr>
-          <w:b w:val="0"/>
-        </w:rPr>
-        <w:t xml:space="preserve">Wide expert parallelism determines how should a large </w:t>
-      </w:r>
-      <w:r>
-        <w:rPr>
-          <w:b w:val="0"/>
-        </w:rPr>
-        <w:t>MoE</w:t>
-      </w:r>
-      <w:r>
-        <w:rPr>
-          <w:b w:val="0"/>
-        </w:rPr>
-        <w:t xml:space="preserve"> model run across GPUs?</w:t>
+          <w:b/>
+        </w:rPr>
+        <w:t>This slide shows how KAITO do</w:t>
+      </w:r>
+      <w:r>
+        <w:rPr>
+          <w:b/>
+        </w:rPr>
+        <w:t>es</w:t>
+      </w:r>
+      <w:r>
+        <w:rPr>
+          <w:b/>
+        </w:rPr>
+        <w:t xml:space="preserve"> the math.</w:t>
       </w:r>
     </w:p>
     <w:p>
@@ -1528,7 +1531,13 @@
         <w:rPr>
           <w:b w:val="0"/>
         </w:rPr>
-        <w:t>P/D disaggregation determines how should prompt and generation capacity differ?</w:t>
+        <w:t xml:space="preserve">User </w:t>
+      </w:r>
+      <w:r>
+        <w:rPr>
+          <w:b w:val="0"/>
+        </w:rPr>
+        <w:t>specifies a model name and GPU SKU. KAITO estimates how many nodes the model needs.</w:t>
       </w:r>
     </w:p>
     <w:p>
@@ -1537,46 +1546,52 @@
       </w:pPr>
       <w:r>
         <w:rPr>
-          <w:b/>
-        </w:rPr>
-        <w:t>These paths can work together, but we don’t need all of them at once. Results depend on the hardware. Today, we’ll focus on P/D disaggregation and use KAITO to manage the workloads.</w:t>
+          <w:b w:val="0"/>
+        </w:rPr>
+        <w:t>KAITO reserves memory for overhead and KV cache, then fits the weights into the remaining GPU memory.</w:t>
       </w:r>
     </w:p>
     <w:p>
       <w:pPr>
-        <w:pStyle w:val="Heading1"/>
-      </w:pPr>
-      <w:r>
-        <w:t>Slide 18 — What is KAITO (Kubernetes AI Toolchain Operator)?</w:t>
+        <w:keepLines/>
+      </w:pPr>
+      <w:r>
+        <w:rPr>
+          <w:b w:val="0"/>
+        </w:rPr>
+        <w:t xml:space="preserve">KAITO saves the result as </w:t>
+      </w:r>
+      <w:r>
+        <w:rPr>
+          <w:b w:val="0"/>
+        </w:rPr>
+        <w:t>status.targetNodeCount</w:t>
+      </w:r>
+      <w:r>
+        <w:rPr>
+          <w:b w:val="0"/>
+        </w:rPr>
+        <w:t xml:space="preserve">. This path uses tensor parallelism within nodes and pipeline parallelism across nodes. It sizes memory, </w:t>
+      </w:r>
+      <w:r>
+        <w:rPr>
+          <w:b w:val="0"/>
+        </w:rPr>
+        <w:t>not how much traffic it can handle.</w:t>
+      </w:r>
+      <w:r>
+        <w:rPr>
+          <w:b w:val="0"/>
+        </w:rPr>
+        <w:t xml:space="preserve"> </w:t>
       </w:r>
     </w:p>
     <w:p>
       <w:pPr>
-        <w:keepLines/>
-      </w:pPr>
-      <w:r>
-        <w:rPr>
-          <w:b w:val="0"/>
-        </w:rPr>
-        <w:t xml:space="preserve">Next, what is KAITO, </w:t>
-      </w:r>
-      <w:r>
-        <w:rPr>
-          <w:b w:val="0"/>
-        </w:rPr>
-        <w:t xml:space="preserve">KAITO stands for </w:t>
-      </w:r>
-      <w:r>
-        <w:rPr>
-          <w:b w:val="0"/>
-        </w:rPr>
-        <w:t xml:space="preserve">Kubernetes AI Toolchain Operator, which </w:t>
-      </w:r>
-      <w:r>
-        <w:rPr>
-          <w:b w:val="0"/>
-        </w:rPr>
-        <w:t>automates LLM inference, fine-tuning and RAG with Kubernetes operators. It is also a CNCF Sandbox project.</w:t>
+        <w:pStyle w:val="Heading1"/>
+      </w:pPr>
+      <w:r>
+        <w:t>Slide 19 — One shared pool ties two capacity decisions together</w:t>
       </w:r>
     </w:p>
     <w:p>
@@ -1585,35 +1600,32 @@
       </w:pPr>
       <w:r>
         <w:rPr>
-          <w:b/>
-        </w:rPr>
-        <w:t xml:space="preserve">With KAITO, you only need to </w:t>
-      </w:r>
-      <w:r>
-        <w:rPr>
-          <w:b w:val="0"/>
-        </w:rPr>
-        <w:t xml:space="preserve">specify a model name and GPU VM SKU. KAITO sizes the nodes to fit the model’s memory requirements, handles model setup and caching, manages inference workloads and rolling updates on Kubernetes, and uses KEDA to automatically scale </w:t>
-      </w:r>
-      <w:r>
-        <w:rPr>
-          <w:b w:val="0"/>
-        </w:rPr>
-        <w:t xml:space="preserve">inference </w:t>
-      </w:r>
-      <w:r>
-        <w:rPr>
-          <w:b w:val="0"/>
-        </w:rPr>
-        <w:t>workloads.</w:t>
+          <w:b w:val="0"/>
+        </w:rPr>
+        <w:t>One shared pool ties two capacity decisions together</w:t>
       </w:r>
     </w:p>
     <w:p>
       <w:pPr>
-        <w:pStyle w:val="Heading1"/>
-      </w:pPr>
-      <w:r>
-        <w:t>Slide 19 — KAITO workload example</w:t>
+        <w:keepLines/>
+      </w:pPr>
+      <w:r>
+        <w:rPr>
+          <w:b w:val="0"/>
+        </w:rPr>
+        <w:t xml:space="preserve">A shared pool is simple, but prefill bursts compete with active decoding. </w:t>
+      </w:r>
+      <w:r>
+        <w:rPr>
+          <w:b/>
+        </w:rPr>
+        <w:t>Every worker handles both phases</w:t>
+      </w:r>
+      <w:r>
+        <w:rPr>
+          <w:b w:val="0"/>
+        </w:rPr>
+        <w:t>. One deployment scales both phases together.</w:t>
       </w:r>
     </w:p>
     <w:p>
@@ -1624,48 +1636,39 @@
         <w:rPr>
           <w:b w:val="0"/>
         </w:rPr>
-        <w:t xml:space="preserve">Here is a KAITO </w:t>
-      </w:r>
-      <w:r>
-        <w:rPr>
-          <w:b w:val="0"/>
-        </w:rPr>
-        <w:t xml:space="preserve">inference workload example, user only needs to </w:t>
-      </w:r>
-      <w:r>
-        <w:rPr>
-          <w:b w:val="0"/>
-        </w:rPr>
-        <w:t>specify the model name, GPU instance type and replica count.</w:t>
+        <w:t xml:space="preserve">Where is the trade-off? Prompt bursts can disrupt token delivery. </w:t>
+      </w:r>
+      <w:r>
+        <w:rPr>
+          <w:b w:val="0"/>
+        </w:rPr>
+        <w:t xml:space="preserve">We scale the whole replica, even when only prefill or decode needs more </w:t>
+      </w:r>
+      <w:r>
+        <w:rPr>
+          <w:b w:val="0"/>
+        </w:rPr>
+        <w:t>capacity.</w:t>
+      </w:r>
+      <w:r>
+        <w:rPr>
+          <w:b w:val="0"/>
+        </w:rPr>
+        <w:t>We</w:t>
+      </w:r>
+      <w:r>
+        <w:rPr>
+          <w:b w:val="0"/>
+        </w:rPr>
+        <w:t xml:space="preserve"> must decide how to run each phase and how much shared capacity to add. </w:t>
       </w:r>
     </w:p>
     <w:p>
       <w:pPr>
-        <w:keepLines/>
-      </w:pPr>
-      <w:r>
-        <w:rPr>
-          <w:b w:val="0"/>
-        </w:rPr>
-        <w:t xml:space="preserve">In this example, user specifies a qwen3 model name which is a </w:t>
-      </w:r>
-      <w:r>
-        <w:rPr>
-          <w:b w:val="0"/>
-        </w:rPr>
-        <w:t>huggingface</w:t>
-      </w:r>
-      <w:r>
-        <w:rPr>
-          <w:b w:val="0"/>
-        </w:rPr>
-        <w:t xml:space="preserve"> model id and specifies A100 GPU instance type with 3 replicas, </w:t>
-      </w:r>
-      <w:r>
-        <w:rPr>
-          <w:b/>
-        </w:rPr>
-        <w:t xml:space="preserve">three replicas does not necessarily mean three GPUs; each replica’s GPU and node needs depend on the model and runtime settings. </w:t>
+        <w:pStyle w:val="Heading1"/>
+      </w:pPr>
+      <w:r>
+        <w:t>Slide 20 — Why bring llm-d into KAITO?</w:t>
       </w:r>
     </w:p>
     <w:p>
@@ -1674,46 +1677,70 @@
       </w:pPr>
       <w:r>
         <w:rPr>
-          <w:b/>
-        </w:rPr>
-        <w:t xml:space="preserve">KAITO does all the rest of work, like provisioning the required GPU nodes </w:t>
-      </w:r>
-      <w:r>
-        <w:rPr>
-          <w:b/>
-        </w:rPr>
-        <w:t>to fit the model’s memory requirements, handles model setup and caching, manages inference workloads and rolling updates on Kubernetes.</w:t>
+          <w:b w:val="0"/>
+        </w:rPr>
+        <w:t xml:space="preserve">So why do we bring </w:t>
+      </w:r>
+      <w:r>
+        <w:rPr>
+          <w:b w:val="0"/>
+        </w:rPr>
+        <w:t>llm</w:t>
+      </w:r>
+      <w:r>
+        <w:rPr>
+          <w:b w:val="0"/>
+        </w:rPr>
+        <w:t>-d into KAITO?</w:t>
+      </w:r>
+      <w:r>
+        <w:rPr>
+          <w:b w:val="0"/>
+        </w:rPr>
+        <w:t xml:space="preserve"> </w:t>
       </w:r>
     </w:p>
     <w:p>
       <w:pPr>
-        <w:pStyle w:val="Heading1"/>
-      </w:pPr>
-      <w:r>
-        <w:t>Slide 20 — KAITO works out the initial GPU node count</w:t>
+        <w:keepLines/>
+      </w:pPr>
+      <w:r>
+        <w:rPr>
+          <w:b w:val="0"/>
+        </w:rPr>
+        <w:t xml:space="preserve">We want P/D routing without replacing KAITO’s Kubernetes operating model. KAITO manages deployment and lifecycle. </w:t>
+      </w:r>
+      <w:r>
+        <w:rPr>
+          <w:b w:val="0"/>
+        </w:rPr>
+        <w:t>llm</w:t>
+      </w:r>
+      <w:r>
+        <w:rPr>
+          <w:b w:val="0"/>
+        </w:rPr>
+        <w:t xml:space="preserve">-d adds endpoint selection and request routing. </w:t>
+      </w:r>
+      <w:r>
+        <w:rPr>
+          <w:b/>
+        </w:rPr>
+        <w:t>vLLM</w:t>
+      </w:r>
+      <w:r>
+        <w:rPr>
+          <w:b/>
+        </w:rPr>
+        <w:t xml:space="preserve"> runs the prefill and decode phases, and NIXL moves KV.</w:t>
       </w:r>
     </w:p>
     <w:p>
       <w:pPr>
-        <w:keepLines/>
-      </w:pPr>
-      <w:r>
-        <w:rPr>
-          <w:b/>
-        </w:rPr>
-        <w:t>This slide shows how KAITO do</w:t>
-      </w:r>
-      <w:r>
-        <w:rPr>
-          <w:b/>
-        </w:rPr>
-        <w:t>es</w:t>
-      </w:r>
-      <w:r>
-        <w:rPr>
-          <w:b/>
-        </w:rPr>
-        <w:t xml:space="preserve"> the math.</w:t>
+        <w:pStyle w:val="Heading1"/>
+      </w:pPr>
+      <w:r>
+        <w:t>Slide 21 — Where KAITO and llm-d fit</w:t>
       </w:r>
     </w:p>
     <w:p>
@@ -1724,13 +1751,37 @@
         <w:rPr>
           <w:b w:val="0"/>
         </w:rPr>
-        <w:t xml:space="preserve">User </w:t>
-      </w:r>
-      <w:r>
-        <w:rPr>
-          <w:b w:val="0"/>
-        </w:rPr>
-        <w:t>specifies a model name and GPU SKU. KAITO estimates how many nodes the model needs.</w:t>
+        <w:t xml:space="preserve">So where </w:t>
+      </w:r>
+      <w:r>
+        <w:rPr>
+          <w:b w:val="0"/>
+        </w:rPr>
+        <w:t>KAITO</w:t>
+      </w:r>
+      <w:r>
+        <w:rPr>
+          <w:b w:val="0"/>
+        </w:rPr>
+        <w:t xml:space="preserve"> and </w:t>
+      </w:r>
+      <w:r>
+        <w:rPr>
+          <w:b w:val="0"/>
+        </w:rPr>
+        <w:t>llm</w:t>
+      </w:r>
+      <w:r>
+        <w:rPr>
+          <w:b w:val="0"/>
+        </w:rPr>
+        <w:t>-d</w:t>
+      </w:r>
+      <w:r>
+        <w:rPr>
+          <w:b w:val="0"/>
+        </w:rPr>
+        <w:t xml:space="preserve"> fit.</w:t>
       </w:r>
     </w:p>
     <w:p>
@@ -1741,7 +1792,19 @@
         <w:rPr>
           <w:b w:val="0"/>
         </w:rPr>
-        <w:t>KAITO reserves memory for overhead and KV cache, then fits the weights into the remaining GPU memory.</w:t>
+        <w:t xml:space="preserve">This is a map of responsibilities, not a required installation checklist. Applications call the inference API. The gateway handles ingress, auth and traffic policy. KAITO manages lifecycle; </w:t>
+      </w:r>
+      <w:r>
+        <w:rPr>
+          <w:b w:val="0"/>
+        </w:rPr>
+        <w:t>llm</w:t>
+      </w:r>
+      <w:r>
+        <w:rPr>
+          <w:b w:val="0"/>
+        </w:rPr>
+        <w:t>-d selects endpoints.</w:t>
       </w:r>
     </w:p>
     <w:p>
@@ -1752,31 +1815,25 @@
         <w:rPr>
           <w:b w:val="0"/>
         </w:rPr>
-        <w:t xml:space="preserve">KAITO saves the result as </w:t>
-      </w:r>
-      <w:r>
-        <w:rPr>
-          <w:b w:val="0"/>
-        </w:rPr>
-        <w:t>status.targetNodeCount</w:t>
-      </w:r>
-      <w:r>
-        <w:rPr>
-          <w:b w:val="0"/>
-        </w:rPr>
-        <w:t xml:space="preserve">. This path uses tensor parallelism within nodes and pipeline parallelism across nodes. It sizes memory, </w:t>
-      </w:r>
-      <w:r>
-        <w:rPr>
-          <w:b w:val="0"/>
-        </w:rPr>
-        <w:t>not how much traffic it can handle.</w:t>
-      </w:r>
-      <w:r>
-        <w:rPr>
-          <w:b w:val="0"/>
-        </w:rPr>
-        <w:t xml:space="preserve"> </w:t>
+        <w:t>vLLM</w:t>
+      </w:r>
+      <w:r>
+        <w:rPr>
+          <w:b w:val="0"/>
+        </w:rPr>
+        <w:t xml:space="preserve"> runs prefill, decode and batching. NIXL moves KV; cache systems reuse or offload it. </w:t>
+      </w:r>
+      <w:r>
+        <w:rPr>
+          <w:b/>
+        </w:rPr>
+        <w:t>And we depend on Kubernetes to provide</w:t>
+      </w:r>
+      <w:r>
+        <w:rPr>
+          <w:b w:val="0"/>
+        </w:rPr>
+        <w:t xml:space="preserve"> the whole infrastructure to support the stack. We will follow the roles, request routing, KV transfer and capacity control.</w:t>
       </w:r>
     </w:p>
     <w:p>
@@ -1784,7 +1841,7 @@
         <w:pStyle w:val="Heading1"/>
       </w:pPr>
       <w:r>
-        <w:t>Slide 21 — Why bring llm-d into KAITO?</w:t>
+        <w:t>Slide 22 — One endpoint, three separate paths</w:t>
       </w:r>
     </w:p>
     <w:p>
@@ -1795,25 +1852,7 @@
         <w:rPr>
           <w:b w:val="0"/>
         </w:rPr>
-        <w:t xml:space="preserve">So why do we bring </w:t>
-      </w:r>
-      <w:r>
-        <w:rPr>
-          <w:b w:val="0"/>
-        </w:rPr>
-        <w:t>llm</w:t>
-      </w:r>
-      <w:r>
-        <w:rPr>
-          <w:b w:val="0"/>
-        </w:rPr>
-        <w:t>-d into KAITO?</w:t>
-      </w:r>
-      <w:r>
-        <w:rPr>
-          <w:b w:val="0"/>
-        </w:rPr>
-        <w:t xml:space="preserve"> </w:t>
+        <w:t xml:space="preserve">KAITO manages resources. HTTP carries requests. NIXL moves KV between runtimes. </w:t>
       </w:r>
     </w:p>
     <w:p>
@@ -1822,82 +1861,82 @@
       </w:pPr>
       <w:r>
         <w:rPr>
-          <w:b w:val="0"/>
-        </w:rPr>
-        <w:t xml:space="preserve">We want P/D routing without replacing KAITO’s Kubernetes operating model. KAITO manages deployment and lifecycle. </w:t>
-      </w:r>
-      <w:r>
-        <w:rPr>
-          <w:b w:val="0"/>
-        </w:rPr>
-        <w:t>llm</w:t>
-      </w:r>
-      <w:r>
-        <w:rPr>
-          <w:b w:val="0"/>
-        </w:rPr>
-        <w:t xml:space="preserve">-d adds endpoint selection and request routing. </w:t>
-      </w:r>
-      <w:r>
-        <w:rPr>
           <w:b/>
         </w:rPr>
-        <w:t>vLLM</w:t>
-      </w:r>
-      <w:r>
-        <w:rPr>
-          <w:b/>
-        </w:rPr>
-        <w:t xml:space="preserve"> runs the prefill and decode phases, and NIXL moves KV.</w:t>
+        <w:t>Start at the top</w:t>
+      </w:r>
+      <w:r>
+        <w:rPr>
+          <w:b w:val="0"/>
+        </w:rPr>
+        <w:t xml:space="preserve">: KAITO maintains the role </w:t>
+      </w:r>
+      <w:r>
+        <w:rPr>
+          <w:b w:val="0"/>
+        </w:rPr>
+        <w:t>InferenceSets</w:t>
+      </w:r>
+      <w:r>
+        <w:rPr>
+          <w:b w:val="0"/>
+        </w:rPr>
+        <w:t xml:space="preserve">, </w:t>
+      </w:r>
+      <w:r>
+        <w:rPr>
+          <w:b w:val="0"/>
+        </w:rPr>
+        <w:t>InferencePool</w:t>
+      </w:r>
+      <w:r>
+        <w:rPr>
+          <w:b w:val="0"/>
+        </w:rPr>
+        <w:t xml:space="preserve"> and runtime wiring.</w:t>
       </w:r>
     </w:p>
     <w:p>
       <w:pPr>
-        <w:pStyle w:val="Heading1"/>
-      </w:pPr>
-      <w:r>
-        <w:t>Slide 22 — Where KAITO and llm-d fit</w:t>
+        <w:keepLines/>
+      </w:pPr>
+      <w:r>
+        <w:rPr>
+          <w:b/>
+        </w:rPr>
+        <w:t xml:space="preserve">For a request, the gateway consults the EPP, then forwards to the selected decode sidecar. The sidecar calls remote prefill when needed and local decode. </w:t>
+      </w:r>
+      <w:r>
+        <w:rPr>
+          <w:b w:val="0"/>
+        </w:rPr>
+        <w:t xml:space="preserve">The client uses one endpoint. KV data bypasses the gateway, EPP and routing sidecar. </w:t>
+      </w:r>
+      <w:r>
+        <w:rPr>
+          <w:b/>
+        </w:rPr>
+        <w:t xml:space="preserve">NIXL would move KV data between prefill and decode </w:t>
+      </w:r>
+      <w:r>
+        <w:rPr>
+          <w:b/>
+        </w:rPr>
+        <w:t>vLLM</w:t>
+      </w:r>
+      <w:r>
+        <w:rPr>
+          <w:b/>
+        </w:rPr>
+        <w:t xml:space="preserve"> runtime directly.</w:t>
       </w:r>
     </w:p>
     <w:p>
       <w:pPr>
-        <w:keepLines/>
-      </w:pPr>
-      <w:r>
-        <w:rPr>
-          <w:b w:val="0"/>
-        </w:rPr>
-        <w:t xml:space="preserve">So where </w:t>
-      </w:r>
-      <w:r>
-        <w:rPr>
-          <w:b w:val="0"/>
-        </w:rPr>
-        <w:t>KAITO</w:t>
-      </w:r>
-      <w:r>
-        <w:rPr>
-          <w:b w:val="0"/>
-        </w:rPr>
-        <w:t xml:space="preserve"> and </w:t>
-      </w:r>
-      <w:r>
-        <w:rPr>
-          <w:b w:val="0"/>
-        </w:rPr>
-        <w:t>llm</w:t>
-      </w:r>
-      <w:r>
-        <w:rPr>
-          <w:b w:val="0"/>
-        </w:rPr>
-        <w:t>-d</w:t>
-      </w:r>
-      <w:r>
-        <w:rPr>
-          <w:b w:val="0"/>
-        </w:rPr>
-        <w:t xml:space="preserve"> fit.</w:t>
+        <w:pStyle w:val="Heading1"/>
+      </w:pPr>
+      <w:r>
+        <w:t>Slide 23 — One MultiRoleInference declares both roles</w:t>
       </w:r>
     </w:p>
     <w:p>
@@ -1908,19 +1947,31 @@
         <w:rPr>
           <w:b w:val="0"/>
         </w:rPr>
-        <w:t xml:space="preserve">This is a map of responsibilities, not a required installation checklist. Applications call the inference API. The gateway handles ingress, auth and traffic policy. KAITO manages lifecycle; </w:t>
-      </w:r>
-      <w:r>
-        <w:rPr>
-          <w:b w:val="0"/>
-        </w:rPr>
-        <w:t>llm</w:t>
-      </w:r>
-      <w:r>
-        <w:rPr>
-          <w:b w:val="0"/>
-        </w:rPr>
-        <w:t>-d selects endpoints.</w:t>
+        <w:t xml:space="preserve">One </w:t>
+      </w:r>
+      <w:r>
+        <w:rPr>
+          <w:b w:val="0"/>
+        </w:rPr>
+        <w:t>MultiRoleInference</w:t>
+      </w:r>
+      <w:r>
+        <w:rPr>
+          <w:b w:val="0"/>
+        </w:rPr>
+        <w:t xml:space="preserve"> declares both roles. This KAITO </w:t>
+      </w:r>
+      <w:r>
+        <w:rPr>
+          <w:b w:val="0"/>
+        </w:rPr>
+        <w:t>yaml</w:t>
+      </w:r>
+      <w:r>
+        <w:rPr>
+          <w:b w:val="0"/>
+        </w:rPr>
+        <w:t xml:space="preserve"> example sets one prefill replica on A100 and two decode replicas on H100</w:t>
       </w:r>
     </w:p>
     <w:p>
@@ -1931,25 +1982,43 @@
         <w:rPr>
           <w:b w:val="0"/>
         </w:rPr>
-        <w:t>vLLM</w:t>
-      </w:r>
-      <w:r>
-        <w:rPr>
-          <w:b w:val="0"/>
-        </w:rPr>
-        <w:t xml:space="preserve"> runs prefill, decode and batching. NIXL moves KV; cache systems reuse or offload it. </w:t>
+        <w:t xml:space="preserve">On the right, we still have one logical service and </w:t>
+      </w:r>
+      <w:r>
+        <w:rPr>
+          <w:b w:val="0"/>
+        </w:rPr>
+        <w:t>InferencePool</w:t>
+      </w:r>
+      <w:r>
+        <w:rPr>
+          <w:b w:val="0"/>
+        </w:rPr>
+        <w:t xml:space="preserve">. </w:t>
       </w:r>
       <w:r>
         <w:rPr>
           <w:b/>
         </w:rPr>
-        <w:t>And we depend on Kubernetes to provide</w:t>
-      </w:r>
-      <w:r>
-        <w:rPr>
-          <w:b w:val="0"/>
-        </w:rPr>
-        <w:t xml:space="preserve"> the whole infrastructure to support the stack. We will follow the roles, request routing, KV transfer and capacity control.</w:t>
+        <w:t xml:space="preserve">Both roles serve the same model. </w:t>
+      </w:r>
+      <w:r>
+        <w:rPr>
+          <w:b w:val="0"/>
+        </w:rPr>
+        <w:t xml:space="preserve">Each has its own </w:t>
+      </w:r>
+      <w:r>
+        <w:rPr>
+          <w:b w:val="0"/>
+        </w:rPr>
+        <w:t>InferenceSet</w:t>
+      </w:r>
+      <w:r>
+        <w:rPr>
+          <w:b w:val="0"/>
+        </w:rPr>
+        <w:t xml:space="preserve"> and capacity settings. </w:t>
       </w:r>
     </w:p>
     <w:p>
@@ -1957,7 +2026,7 @@
         <w:pStyle w:val="Heading1"/>
       </w:pPr>
       <w:r>
-        <w:t>Slide 23 — KAITO + llm-d: one service, two roles</w:t>
+        <w:t>Slide 24 — KAITO creates resources and keeps them aligned</w:t>
       </w:r>
     </w:p>
     <w:p>
@@ -1966,39 +2035,9 @@
       </w:pPr>
       <w:r>
         <w:rPr>
-          <w:b/>
-        </w:rPr>
-        <w:t xml:space="preserve">With KAITO and </w:t>
-      </w:r>
-      <w:r>
-        <w:rPr>
-          <w:b/>
-        </w:rPr>
-        <w:t>llm</w:t>
-      </w:r>
-      <w:r>
-        <w:rPr>
-          <w:b/>
-        </w:rPr>
-        <w:t>-d</w:t>
-      </w:r>
-      <w:r>
-        <w:rPr>
-          <w:b w:val="0"/>
-        </w:rPr>
-        <w:t xml:space="preserve">, we </w:t>
-      </w:r>
-      <w:r>
-        <w:rPr>
-          <w:b w:val="0"/>
-        </w:rPr>
-        <w:t>eeclare</w:t>
-      </w:r>
-      <w:r>
-        <w:rPr>
-          <w:b w:val="0"/>
-        </w:rPr>
-        <w:t xml:space="preserve"> both roles together. Keep orchestration separate from execution. Serve one model through one endpoint. Give prefill and decode their own placement and replica counts.</w:t>
+          <w:b w:val="0"/>
+        </w:rPr>
+        <w:t>KAITO creates resources and keeps them aligned</w:t>
       </w:r>
     </w:p>
     <w:p>
@@ -2009,19 +2048,25 @@
         <w:rPr>
           <w:b w:val="0"/>
         </w:rPr>
-        <w:t xml:space="preserve">KAITO maintains the role topology. </w:t>
-      </w:r>
-      <w:r>
-        <w:rPr>
-          <w:b w:val="0"/>
-        </w:rPr>
-        <w:t>InferencePool</w:t>
-      </w:r>
-      <w:r>
-        <w:rPr>
-          <w:b w:val="0"/>
-        </w:rPr>
-        <w:t xml:space="preserve"> links to the gateway. </w:t>
+        <w:t xml:space="preserve">KAITO turns the declared topology into workers, routing resources and runtime wiring. For prefill, KAITO set </w:t>
+      </w:r>
+      <w:r>
+        <w:rPr>
+          <w:b w:val="0"/>
+        </w:rPr>
+        <w:t>lm</w:t>
+      </w:r>
+      <w:r>
+        <w:rPr>
+          <w:b w:val="0"/>
+        </w:rPr>
+        <w:t xml:space="preserve">-d </w:t>
+      </w:r>
+      <w:r>
+        <w:rPr>
+          <w:b w:val="0"/>
+        </w:rPr>
+        <w:t xml:space="preserve">role labels and the NIXL host or Pod IP. For decode, KAITO injects the </w:t>
       </w:r>
       <w:r>
         <w:rPr>
@@ -2033,7 +2078,7 @@
         <w:rPr>
           <w:b w:val="0"/>
         </w:rPr>
-        <w:t xml:space="preserve">-d selects workers and coordinates requests. </w:t>
+        <w:t xml:space="preserve">-d sidecar. Align NIXL and </w:t>
       </w:r>
       <w:r>
         <w:rPr>
@@ -2045,15 +2090,54 @@
         <w:rPr>
           <w:b w:val="0"/>
         </w:rPr>
-        <w:t xml:space="preserve"> runs the prefill and decode phases; NIXL transfers KV. One service coordinates P/D requests, while each role keeps its own capacity settings.</w:t>
+        <w:t xml:space="preserve"> ports.</w:t>
       </w:r>
     </w:p>
     <w:p>
       <w:pPr>
-        <w:pStyle w:val="Heading1"/>
-      </w:pPr>
-      <w:r>
-        <w:t>Slide 24 — llm-d picks workers for each role</w:t>
+        <w:keepLines/>
+      </w:pPr>
+      <w:r>
+        <w:rPr>
+          <w:b w:val="0"/>
+        </w:rPr>
+        <w:t xml:space="preserve">For routing, </w:t>
+      </w:r>
+      <w:r>
+        <w:rPr>
+          <w:b w:val="0"/>
+        </w:rPr>
+        <w:t>llm</w:t>
+      </w:r>
+      <w:r>
+        <w:rPr>
+          <w:b w:val="0"/>
+        </w:rPr>
+        <w:t xml:space="preserve">-d connect Services, ports and endpoint selection. </w:t>
+      </w:r>
+      <w:r>
+        <w:rPr>
+          <w:b/>
+        </w:rPr>
+        <w:t xml:space="preserve">So with KAITO and </w:t>
+      </w:r>
+      <w:r>
+        <w:rPr>
+          <w:b/>
+        </w:rPr>
+        <w:t>llm</w:t>
+      </w:r>
+      <w:r>
+        <w:rPr>
+          <w:b/>
+        </w:rPr>
+        <w:t>-d</w:t>
+      </w:r>
+      <w:r>
+        <w:rPr>
+          <w:b w:val="0"/>
+        </w:rPr>
+        <w:t xml:space="preserve">, we keep ownership, roles, labels, ports and lifecycle consistent. </w:t>
       </w:r>
     </w:p>
     <w:p>
@@ -2064,18 +2148,15 @@
         <w:rPr>
           <w:b w:val="0"/>
         </w:rPr>
-        <w:t>Now that we have separate prefill and decode workers, the next question is: which workers should handle each request?</w:t>
+        <w:t>KAITO keeps the resources working together; it does not just generate YAML.</w:t>
       </w:r>
     </w:p>
     <w:p>
       <w:pPr>
-        <w:keepLines/>
-      </w:pPr>
-      <w:r>
-        <w:rPr>
-          <w:b/>
-        </w:rPr>
-        <w:t xml:space="preserve">That’s where llm-d’s Endpoint Picker, or EPP, comes in. </w:t>
+        <w:pStyle w:val="Heading1"/>
+      </w:pPr>
+      <w:r>
+        <w:t>Slide 25 — The decode sidecar coordinates the P/D request</w:t>
       </w:r>
     </w:p>
     <w:p>
@@ -2084,15 +2165,9 @@
       </w:pPr>
       <w:r>
         <w:rPr>
-          <w:b/>
-        </w:rPr>
-        <w:t>When there is a new request, t</w:t>
-      </w:r>
-      <w:r>
-        <w:rPr>
-          <w:b/>
-        </w:rPr>
-        <w:t>he gateway asks the EPP to choose a decode worker—and, when remote prefill is needed, a prefill worker as well.</w:t>
+          <w:b w:val="0"/>
+        </w:rPr>
+        <w:t>The decode sidecar coordinates the P/D request</w:t>
       </w:r>
     </w:p>
     <w:p>
@@ -2101,39 +2176,9 @@
       </w:pPr>
       <w:r>
         <w:rPr>
-          <w:b/>
-        </w:rPr>
-        <w:t xml:space="preserve">The selection logic is built from plugins. </w:t>
-      </w:r>
-      <w:r>
-        <w:rPr>
-          <w:b w:val="0"/>
-        </w:rPr>
-        <w:t xml:space="preserve">We can combine </w:t>
-      </w:r>
-      <w:r>
-        <w:rPr>
-          <w:b w:val="0"/>
-        </w:rPr>
-        <w:t xml:space="preserve">KV-aware and P/D-aware plugins, </w:t>
-      </w:r>
-      <w:r>
-        <w:rPr>
-          <w:b w:val="0"/>
-        </w:rPr>
-        <w:t xml:space="preserve">add new policies through </w:t>
-      </w:r>
-      <w:r>
-        <w:rPr>
-          <w:b w:val="0"/>
-        </w:rPr>
-        <w:t>plugins</w:t>
-      </w:r>
-      <w:r>
-        <w:rPr>
-          <w:b w:val="0"/>
-        </w:rPr>
-        <w:t>.</w:t>
+          <w:b w:val="0"/>
+        </w:rPr>
+        <w:t xml:space="preserve">The sidecar calls remote prefill when needed, then invokes local decode. </w:t>
       </w:r>
     </w:p>
     <w:p>
@@ -2142,21 +2187,9 @@
       </w:pPr>
       <w:r>
         <w:rPr>
-          <w:b w:val="0"/>
-        </w:rPr>
-        <w:t xml:space="preserve">KAITO reuses </w:t>
-      </w:r>
-      <w:r>
-        <w:rPr>
-          <w:b w:val="0"/>
-        </w:rPr>
-        <w:t>llm</w:t>
-      </w:r>
-      <w:r>
-        <w:rPr>
-          <w:b w:val="0"/>
-        </w:rPr>
-        <w:t>-d’s routing decisions instead of building a second routing engine.</w:t>
+          <w:b/>
+        </w:rPr>
+        <w:t>So here is the graph which shows the whole process.</w:t>
       </w:r>
     </w:p>
     <w:p>
@@ -2167,15 +2200,18 @@
         <w:rPr>
           <w:b/>
         </w:rPr>
-        <w:t>Next, let’s see how those choices fit into the full request path.</w:t>
+        <w:t>Starting with step one, the gateway sends the request to the decode sidecar.</w:t>
       </w:r>
     </w:p>
     <w:p>
       <w:pPr>
-        <w:pStyle w:val="Heading1"/>
-      </w:pPr>
-      <w:r>
-        <w:t>Slide 25 — One endpoint, three separate paths</w:t>
+        <w:keepLines/>
+      </w:pPr>
+      <w:r>
+        <w:rPr>
+          <w:b/>
+        </w:rPr>
+        <w:t>The sidecar calls the remote prefill worker to process the prompt. Prefill returns the KV cache metadata—not the actual KV data.</w:t>
       </w:r>
     </w:p>
     <w:p>
@@ -2184,9 +2220,9 @@
       </w:pPr>
       <w:r>
         <w:rPr>
-          <w:b w:val="0"/>
-        </w:rPr>
-        <w:t xml:space="preserve">KAITO manages resources. HTTP carries requests. NIXL moves KV between runtimes. </w:t>
+          <w:b/>
+        </w:rPr>
+        <w:t>The sidecar passes that metadata to the local decode worker, which uses NIXL to fetch the KV cache directly from prefill and generate the response.</w:t>
       </w:r>
     </w:p>
     <w:p>
@@ -2197,37 +2233,7 @@
         <w:rPr>
           <w:b/>
         </w:rPr>
-        <w:t>Start at the top</w:t>
-      </w:r>
-      <w:r>
-        <w:rPr>
-          <w:b w:val="0"/>
-        </w:rPr>
-        <w:t xml:space="preserve">: KAITO maintains the role </w:t>
-      </w:r>
-      <w:r>
-        <w:rPr>
-          <w:b w:val="0"/>
-        </w:rPr>
-        <w:t>InferenceSets</w:t>
-      </w:r>
-      <w:r>
-        <w:rPr>
-          <w:b w:val="0"/>
-        </w:rPr>
-        <w:t xml:space="preserve">, </w:t>
-      </w:r>
-      <w:r>
-        <w:rPr>
-          <w:b w:val="0"/>
-        </w:rPr>
-        <w:t>InferencePool</w:t>
-      </w:r>
-      <w:r>
-        <w:rPr>
-          <w:b w:val="0"/>
-        </w:rPr>
-        <w:t xml:space="preserve"> and runtime wiring.</w:t>
+        <w:t>The response then goes back through the sidecar and gateway to the client.</w:t>
       </w:r>
     </w:p>
     <w:p>
@@ -2238,31 +2244,7 @@
         <w:rPr>
           <w:b/>
         </w:rPr>
-        <w:t xml:space="preserve">For a request, the gateway consults the EPP, then forwards to the selected decode sidecar. The sidecar calls remote prefill when needed and local decode. </w:t>
-      </w:r>
-      <w:r>
-        <w:rPr>
-          <w:b w:val="0"/>
-        </w:rPr>
-        <w:t xml:space="preserve">The client uses one endpoint. KV data bypasses the gateway, EPP and routing sidecar. </w:t>
-      </w:r>
-      <w:r>
-        <w:rPr>
-          <w:b/>
-        </w:rPr>
-        <w:t xml:space="preserve">NIXL would move KV data between prefill and decode </w:t>
-      </w:r>
-      <w:r>
-        <w:rPr>
-          <w:b/>
-        </w:rPr>
-        <w:t>vLLM</w:t>
-      </w:r>
-      <w:r>
-        <w:rPr>
-          <w:b/>
-        </w:rPr>
-        <w:t xml:space="preserve"> runtime directly.</w:t>
+        <w:t>So, the sidecar coordinates the request, while the runtimes transfer the KV data directly.</w:t>
       </w:r>
     </w:p>
     <w:p>
@@ -2270,7 +2252,7 @@
         <w:pStyle w:val="Heading1"/>
       </w:pPr>
       <w:r>
-        <w:t>Slide 26 — One MultiRoleInference declares both roles</w:t>
+        <w:t>Slide 26 — KAITO Autoscaling: keda-kaito-scaler</w:t>
       </w:r>
     </w:p>
     <w:p>
@@ -2281,31 +2263,7 @@
         <w:rPr>
           <w:b w:val="0"/>
         </w:rPr>
-        <w:t xml:space="preserve">One </w:t>
-      </w:r>
-      <w:r>
-        <w:rPr>
-          <w:b w:val="0"/>
-        </w:rPr>
-        <w:t>MultiRoleInference</w:t>
-      </w:r>
-      <w:r>
-        <w:rPr>
-          <w:b w:val="0"/>
-        </w:rPr>
-        <w:t xml:space="preserve"> declares both roles. This KAITO </w:t>
-      </w:r>
-      <w:r>
-        <w:rPr>
-          <w:b w:val="0"/>
-        </w:rPr>
-        <w:t>yaml</w:t>
-      </w:r>
-      <w:r>
-        <w:rPr>
-          <w:b w:val="0"/>
-        </w:rPr>
-        <w:t xml:space="preserve"> example sets one prefill replica on A100 and two decode replicas on H100</w:t>
+        <w:t>Now, autoscaling. This is how KAITO changes the number of replicas as load moves. The component is keda-kaito-scaler.</w:t>
       </w:r>
     </w:p>
     <w:p>
@@ -2316,51 +2274,18 @@
         <w:rPr>
           <w:b w:val="0"/>
         </w:rPr>
-        <w:t xml:space="preserve">On the right, we still have one logical service and </w:t>
-      </w:r>
-      <w:r>
-        <w:rPr>
-          <w:b w:val="0"/>
-        </w:rPr>
-        <w:t>InferencePool</w:t>
-      </w:r>
-      <w:r>
-        <w:rPr>
-          <w:b w:val="0"/>
-        </w:rPr>
-        <w:t xml:space="preserve">. </w:t>
-      </w:r>
-      <w:r>
-        <w:rPr>
-          <w:b/>
-        </w:rPr>
-        <w:t xml:space="preserve">Both roles serve the same model. </w:t>
-      </w:r>
-      <w:r>
-        <w:rPr>
-          <w:b w:val="0"/>
-        </w:rPr>
-        <w:t xml:space="preserve">Each has its own </w:t>
-      </w:r>
-      <w:r>
-        <w:rPr>
-          <w:b w:val="0"/>
-        </w:rPr>
-        <w:t>InferenceSet</w:t>
-      </w:r>
-      <w:r>
-        <w:rPr>
-          <w:b w:val="0"/>
-        </w:rPr>
-        <w:t xml:space="preserve"> and capacity settings. </w:t>
+        <w:t>It builds on KEDA, but adds three things that matter for GPUs.</w:t>
       </w:r>
     </w:p>
     <w:p>
       <w:pPr>
-        <w:pStyle w:val="Heading1"/>
-      </w:pPr>
-      <w:r>
-        <w:t>Slide 27 — KAITO creates resources and keeps them aligned</w:t>
+        <w:keepLines/>
+      </w:pPr>
+      <w:r>
+        <w:rPr>
+          <w:b w:val="0"/>
+        </w:rPr>
+        <w:t>First, no extra dependencies - it does not need Prometheus. It reads metrics directly from vLLM, on each pod. Less to install, less to break.</w:t>
       </w:r>
     </w:p>
     <w:p>
@@ -2371,7 +2296,7 @@
         <w:rPr>
           <w:b w:val="0"/>
         </w:rPr>
-        <w:t>KAITO creates resources and keeps them aligned</w:t>
+        <w:t>Second, it is GPU-safe. GPU nodes are expensive and slow to start, so it moves gently - only one copy up or down at a time. That keeps things smooth and avoids waste.</w:t>
       </w:r>
     </w:p>
     <w:p>
@@ -2382,49 +2307,7 @@
         <w:rPr>
           <w:b w:val="0"/>
         </w:rPr>
-        <w:t xml:space="preserve">KAITO turns the declared topology into workers, routing resources and runtime wiring. For prefill, KAITO set </w:t>
-      </w:r>
-      <w:r>
-        <w:rPr>
-          <w:b w:val="0"/>
-        </w:rPr>
-        <w:t>lm</w:t>
-      </w:r>
-      <w:r>
-        <w:rPr>
-          <w:b w:val="0"/>
-        </w:rPr>
-        <w:t xml:space="preserve">-d </w:t>
-      </w:r>
-      <w:r>
-        <w:rPr>
-          <w:b w:val="0"/>
-        </w:rPr>
-        <w:t xml:space="preserve">role labels and the NIXL host or Pod IP. For decode, KAITO injects the </w:t>
-      </w:r>
-      <w:r>
-        <w:rPr>
-          <w:b w:val="0"/>
-        </w:rPr>
-        <w:t>llm</w:t>
-      </w:r>
-      <w:r>
-        <w:rPr>
-          <w:b w:val="0"/>
-        </w:rPr>
-        <w:t xml:space="preserve">-d sidecar. Align NIXL and </w:t>
-      </w:r>
-      <w:r>
-        <w:rPr>
-          <w:b w:val="0"/>
-        </w:rPr>
-        <w:t>vLLM</w:t>
-      </w:r>
-      <w:r>
-        <w:rPr>
-          <w:b w:val="0"/>
-        </w:rPr>
-        <w:t xml:space="preserve"> ports.</w:t>
+        <w:t>Third, it can watch more than one signal at once - like queue length and latency together - and it only scales up when both agree there is real pressure.</w:t>
       </w:r>
     </w:p>
     <w:p>
@@ -2435,62 +2318,26 @@
         <w:rPr>
           <w:b w:val="0"/>
         </w:rPr>
-        <w:t xml:space="preserve">For routing, </w:t>
-      </w:r>
-      <w:r>
-        <w:rPr>
-          <w:b w:val="0"/>
-        </w:rPr>
-        <w:t>llm</w:t>
-      </w:r>
-      <w:r>
-        <w:rPr>
-          <w:b w:val="0"/>
-        </w:rPr>
-        <w:t xml:space="preserve">-d connect Services, ports and endpoint selection. </w:t>
-      </w:r>
-      <w:r>
-        <w:rPr>
-          <w:b/>
-        </w:rPr>
-        <w:t xml:space="preserve">So with KAITO and </w:t>
-      </w:r>
-      <w:r>
-        <w:rPr>
-          <w:b/>
-        </w:rPr>
-        <w:t>llm</w:t>
-      </w:r>
-      <w:r>
-        <w:rPr>
-          <w:b/>
-        </w:rPr>
-        <w:t>-d</w:t>
-      </w:r>
-      <w:r>
-        <w:rPr>
-          <w:b w:val="0"/>
-        </w:rPr>
-        <w:t xml:space="preserve">, we keep ownership, roles, labels, ports and lifecycle consistent. </w:t>
+        <w:t>So it is autoscaling made for GPU inference: simple, safe on cost, driven by what the server really sees. Next, how does KAITO configures these signals.</w:t>
       </w:r>
     </w:p>
     <w:p>
       <w:pPr>
-        <w:keepLines/>
-      </w:pPr>
-      <w:r>
-        <w:rPr>
-          <w:b w:val="0"/>
-        </w:rPr>
-        <w:t>KAITO keeps the resources working together; it does not just generate YAML.</w:t>
+        <w:pStyle w:val="Heading1"/>
+      </w:pPr>
+      <w:r>
+        <w:t>Slide 27 — Let prefill and decode scale independently</w:t>
       </w:r>
     </w:p>
     <w:p>
       <w:pPr>
-        <w:pStyle w:val="Heading1"/>
-      </w:pPr>
-      <w:r>
-        <w:t>Slide 28 — The decode sidecar coordinates the P/D request</w:t>
+        <w:keepLines/>
+      </w:pPr>
+      <w:r>
+        <w:rPr>
+          <w:b/>
+        </w:rPr>
+        <w:t>And for p/d disaggregation mode, there is new problem.</w:t>
       </w:r>
     </w:p>
     <w:p>
@@ -2501,7 +2348,13 @@
         <w:rPr>
           <w:b w:val="0"/>
         </w:rPr>
-        <w:t>The decode sidecar coordinates the P/D request</w:t>
+        <w:t xml:space="preserve">We want to </w:t>
+      </w:r>
+      <w:r>
+        <w:rPr>
+          <w:b w:val="0"/>
+        </w:rPr>
+        <w:t>let prefill and decode scale independently.</w:t>
       </w:r>
     </w:p>
     <w:p>
@@ -2512,7 +2365,31 @@
         <w:rPr>
           <w:b w:val="0"/>
         </w:rPr>
-        <w:t xml:space="preserve">The sidecar calls remote prefill when needed, then invokes local decode. </w:t>
+        <w:t xml:space="preserve">Prefill watches waiting requests and scales prefill </w:t>
+      </w:r>
+      <w:r>
+        <w:rPr>
+          <w:b w:val="0"/>
+        </w:rPr>
+        <w:t>InferenceSet</w:t>
+      </w:r>
+      <w:r>
+        <w:rPr>
+          <w:b w:val="0"/>
+        </w:rPr>
+        <w:t xml:space="preserve">. Decode watches running requests and scales decode </w:t>
+      </w:r>
+      <w:r>
+        <w:rPr>
+          <w:b w:val="0"/>
+        </w:rPr>
+        <w:t>InferenceSet</w:t>
+      </w:r>
+      <w:r>
+        <w:rPr>
+          <w:b w:val="0"/>
+        </w:rPr>
+        <w:t>.</w:t>
       </w:r>
     </w:p>
     <w:p>
@@ -2521,9 +2398,9 @@
       </w:pPr>
       <w:r>
         <w:rPr>
-          <w:b/>
-        </w:rPr>
-        <w:t>So here is the graph which shows the whole process.</w:t>
+          <w:b w:val="0"/>
+        </w:rPr>
+        <w:t xml:space="preserve">Give each target one owner. Allow warm-up time, stabilize changes and scale down safely. </w:t>
       </w:r>
     </w:p>
     <w:p>
@@ -2534,18 +2411,15 @@
         <w:rPr>
           <w:b/>
         </w:rPr>
-        <w:t>Starting with step one, the gateway sends the request to the decode sidecar.</w:t>
+        <w:t>Independent capacity decisions are the goal; KEDA and HPA are the way to implement them.</w:t>
       </w:r>
     </w:p>
     <w:p>
       <w:pPr>
-        <w:keepLines/>
-      </w:pPr>
-      <w:r>
-        <w:rPr>
-          <w:b/>
-        </w:rPr>
-        <w:t>The sidecar calls the remote prefill worker to process the prompt. Prefill returns the KV cache metadata—not the actual KV data.</w:t>
+        <w:pStyle w:val="Heading1"/>
+      </w:pPr>
+      <w:r>
+        <w:t>Slide 28 — KAITO autoscaling example: scale prefill and decode separately</w:t>
       </w:r>
     </w:p>
     <w:p>
@@ -2554,9 +2428,15 @@
       </w:pPr>
       <w:r>
         <w:rPr>
-          <w:b/>
-        </w:rPr>
-        <w:t>The sidecar passes that metadata to the local decode worker, which uses NIXL to fetch the KV cache directly from prefill and generate the response.</w:t>
+          <w:b w:val="0"/>
+        </w:rPr>
+        <w:t xml:space="preserve">Here is the KAITO autoscaling example which could </w:t>
+      </w:r>
+      <w:r>
+        <w:rPr>
+          <w:b w:val="0"/>
+        </w:rPr>
+        <w:t>scale prefill and decode separately.</w:t>
       </w:r>
     </w:p>
     <w:p>
@@ -2565,9 +2445,63 @@
       </w:pPr>
       <w:r>
         <w:rPr>
-          <w:b/>
-        </w:rPr>
-        <w:t>The response then goes back through the sidecar and gateway to the client.</w:t>
+          <w:b w:val="0"/>
+        </w:rPr>
+        <w:t xml:space="preserve">In the </w:t>
+      </w:r>
+      <w:r>
+        <w:rPr>
+          <w:b w:val="0"/>
+        </w:rPr>
+        <w:t>yaml</w:t>
+      </w:r>
+      <w:r>
+        <w:rPr>
+          <w:b w:val="0"/>
+        </w:rPr>
+        <w:t xml:space="preserve"> config, we have set minimum replicas as 1, maximum replicas as 8 for prefill role, prefill would watch on </w:t>
+      </w:r>
+      <w:r>
+        <w:rPr>
+          <w:b w:val="0"/>
+        </w:rPr>
+        <w:t>vLLM</w:t>
+      </w:r>
+      <w:r>
+        <w:rPr>
+          <w:b w:val="0"/>
+        </w:rPr>
+        <w:t xml:space="preserve"> </w:t>
+      </w:r>
+      <w:r>
+        <w:rPr>
+          <w:b w:val="0"/>
+        </w:rPr>
+        <w:t xml:space="preserve">number of waiting requests metrics. And we have set </w:t>
+      </w:r>
+      <w:r>
+        <w:rPr>
+          <w:b w:val="0"/>
+        </w:rPr>
+        <w:t xml:space="preserve">minimum replicas as 2, maximum replicas as 16 for decode role, decode would watch on </w:t>
+      </w:r>
+      <w:r>
+        <w:rPr>
+          <w:b w:val="0"/>
+        </w:rPr>
+        <w:t>vLLM</w:t>
+      </w:r>
+      <w:r>
+        <w:rPr>
+          <w:b w:val="0"/>
+        </w:rPr>
+        <w:t xml:space="preserve"> </w:t>
+      </w:r>
+      <w:r>
+        <w:rPr>
+          <w:b w:val="0"/>
+        </w:rPr>
+        <w:t xml:space="preserve">number of running requests metrics. </w:t>
       </w:r>
     </w:p>
     <w:p>
@@ -2576,9 +2510,9 @@
       </w:pPr>
       <w:r>
         <w:rPr>
-          <w:b/>
-        </w:rPr>
-        <w:t>So, the sidecar coordinates the request, while the runtimes transfer the KV data directly.</w:t>
+          <w:b w:val="0"/>
+        </w:rPr>
+        <w:t>On the right side, if waiting requests is 12, running is 12, then prefill requests scale up, decode holds. And later on if running requests exceeds 24, decode can scale up on it’s own.</w:t>
       </w:r>
     </w:p>
     <w:p>
@@ -2586,7 +2520,7 @@
         <w:pStyle w:val="Heading1"/>
       </w:pPr>
       <w:r>
-        <w:t>Slide 29 — Scale the role that needs more capacity</w:t>
+        <w:t>Slide 29 — Use derived signals to explain the load</w:t>
       </w:r>
     </w:p>
     <w:p>
@@ -2597,36 +2531,69 @@
         <w:rPr>
           <w:b w:val="0"/>
         </w:rPr>
-        <w:t xml:space="preserve">Next  is how do we </w:t>
-      </w:r>
-      <w:r>
-        <w:rPr>
-          <w:b w:val="0"/>
-        </w:rPr>
-        <w:t>autoscale</w:t>
-      </w:r>
-      <w:r>
-        <w:rPr>
-          <w:b w:val="0"/>
-        </w:rPr>
-        <w:t xml:space="preserve"> in p/d disaggregation scenario.</w:t>
+        <w:t xml:space="preserve">Besides the former </w:t>
+      </w:r>
+      <w:r>
+        <w:rPr>
+          <w:b w:val="0"/>
+        </w:rPr>
+        <w:t>vLLM</w:t>
+      </w:r>
+      <w:r>
+        <w:rPr>
+          <w:b w:val="0"/>
+        </w:rPr>
+        <w:t xml:space="preserve"> number of waiting requests, number of running requests metrics, we have other </w:t>
+      </w:r>
+      <w:r>
+        <w:rPr>
+          <w:b w:val="0"/>
+        </w:rPr>
+        <w:t>vLL</w:t>
+      </w:r>
+      <w:r>
+        <w:rPr>
+          <w:b w:val="0"/>
+        </w:rPr>
+        <w:t>M</w:t>
+      </w:r>
+      <w:r>
+        <w:rPr>
+          <w:b w:val="0"/>
+        </w:rPr>
+        <w:t xml:space="preserve"> metrics, like </w:t>
+      </w:r>
+      <w:r>
+        <w:rPr>
+          <w:b w:val="0"/>
+        </w:rPr>
+        <w:t>kv_cache_usage_percentage</w:t>
+      </w:r>
+      <w:r>
+        <w:rPr>
+          <w:b w:val="0"/>
+        </w:rPr>
+        <w:t xml:space="preserve">,, and time to first token seconds which </w:t>
+      </w:r>
+      <w:r>
+        <w:rPr>
+          <w:b w:val="0"/>
+        </w:rPr>
+        <w:t>shows engine-side TTFT tails</w:t>
+      </w:r>
+      <w:r>
+        <w:rPr>
+          <w:b w:val="0"/>
+        </w:rPr>
+        <w:t>, and generation token total which shows the output rate. We could monitor on those metrics to write different autoscaling strategy for prefill and decode roles.</w:t>
       </w:r>
     </w:p>
     <w:p>
       <w:pPr>
-        <w:keepLines/>
-      </w:pPr>
-      <w:r>
-        <w:rPr>
-          <w:b w:val="0"/>
-        </w:rPr>
-        <w:t xml:space="preserve">We scale the role that needs more capacity and </w:t>
-      </w:r>
-      <w:r>
-        <w:rPr>
-          <w:b w:val="0"/>
-        </w:rPr>
-        <w:t>let prefill and decode make separate capacity decisions. Match signals to each role’s load. Tune thresholds against latency targets.</w:t>
+        <w:pStyle w:val="Heading1"/>
+      </w:pPr>
+      <w:r>
+        <w:t>Slide 30 — Where KAITO + llm-d goes next</w:t>
       </w:r>
     </w:p>
     <w:p>
@@ -2637,45 +2604,30 @@
         <w:rPr>
           <w:b w:val="0"/>
         </w:rPr>
-        <w:t xml:space="preserve">Prefill needs to protect time to first token. Start with </w:t>
-      </w:r>
-      <w:r>
-        <w:rPr>
-          <w:b w:val="0"/>
-        </w:rPr>
-        <w:t>vLLM</w:t>
-      </w:r>
-      <w:r>
-        <w:rPr>
-          <w:b w:val="0"/>
-        </w:rPr>
-        <w:t xml:space="preserve"> waiting requests. Decode needs to sustain steady token delivery, which is </w:t>
-      </w:r>
-      <w:r>
-        <w:rPr>
-          <w:b w:val="0"/>
-        </w:rPr>
-        <w:t xml:space="preserve">Inter-Token Latency, that is ITL. It starts with </w:t>
-      </w:r>
-      <w:r>
-        <w:rPr>
-          <w:b w:val="0"/>
-        </w:rPr>
-        <w:t>vLLM</w:t>
-      </w:r>
-      <w:r>
-        <w:rPr>
-          <w:b w:val="0"/>
-        </w:rPr>
-        <w:t xml:space="preserve"> running requests.</w:t>
+        <w:t xml:space="preserve">What’s the next plan for KAITO and </w:t>
+      </w:r>
+      <w:r>
+        <w:rPr>
+          <w:b w:val="0"/>
+        </w:rPr>
+        <w:t>llm</w:t>
+      </w:r>
+      <w:r>
+        <w:rPr>
+          <w:b w:val="0"/>
+        </w:rPr>
+        <w:t>-d integration.</w:t>
       </w:r>
     </w:p>
     <w:p>
       <w:pPr>
-        <w:pStyle w:val="Heading1"/>
-      </w:pPr>
-      <w:r>
-        <w:t>Slide 30 — KAITO Autoscaling: keda-kaito-scaler</w:t>
+        <w:keepLines/>
+      </w:pPr>
+      <w:r>
+        <w:rPr>
+          <w:b w:val="0"/>
+        </w:rPr>
+        <w:t>There are mainly three parts on the road map.</w:t>
       </w:r>
     </w:p>
     <w:p>
@@ -2686,7 +2638,19 @@
         <w:rPr>
           <w:b w:val="0"/>
         </w:rPr>
-        <w:t>Now, autoscaling. This is how KAITO changes the number of replicas as load moves. The component is keda-kaito-scaler.</w:t>
+        <w:t xml:space="preserve">First, we should enable precise cache aware severing, make KAITO route </w:t>
+      </w:r>
+      <w:r>
+        <w:rPr>
+          <w:b w:val="0"/>
+        </w:rPr>
+        <w:t xml:space="preserve">using KV cache events, and supports tier cache </w:t>
+      </w:r>
+      <w:r>
+        <w:rPr>
+          <w:b w:val="0"/>
+        </w:rPr>
+        <w:t>across HBM, CPU RAM</w:t>
       </w:r>
     </w:p>
     <w:p>
@@ -2697,7 +2661,7 @@
         <w:rPr>
           <w:b w:val="0"/>
         </w:rPr>
-        <w:t>It builds on KEDA, but adds three things that matter for GPUs.</w:t>
+        <w:t>and optional filesystems.</w:t>
       </w:r>
     </w:p>
     <w:p>
@@ -2708,7 +2672,19 @@
         <w:rPr>
           <w:b w:val="0"/>
         </w:rPr>
-        <w:t>First, no extra dependencies - it does not need Prometheus. It reads metrics directly from vLLM, on each pod. Less to install, less to break.</w:t>
+        <w:t xml:space="preserve">Second, </w:t>
+      </w:r>
+      <w:r>
+        <w:rPr>
+          <w:b w:val="0"/>
+        </w:rPr>
+        <w:t>Support Encode to Prefill / Decode, s</w:t>
+      </w:r>
+      <w:r>
+        <w:rPr>
+          <w:b w:val="0"/>
+        </w:rPr>
+        <w:t>upport more inference roles.</w:t>
       </w:r>
     </w:p>
     <w:p>
@@ -2719,18 +2695,21 @@
         <w:rPr>
           <w:b w:val="0"/>
         </w:rPr>
-        <w:t>Second, it is GPU-safe. GPU nodes are expensive and slow to start, so it moves gently - only one copy up or down at a time. That keeps things smooth and avoids waste.</w:t>
+        <w:t xml:space="preserve">Third, support explore wide expert parallelism, improve cross-node transport </w:t>
+      </w:r>
+      <w:r>
+        <w:rPr>
+          <w:b w:val="0"/>
+        </w:rPr>
+        <w:t>and communication.</w:t>
       </w:r>
     </w:p>
     <w:p>
       <w:pPr>
-        <w:keepLines/>
-      </w:pPr>
-      <w:r>
-        <w:rPr>
-          <w:b w:val="0"/>
-        </w:rPr>
-        <w:t>Third, it can watch more than one signal at once - like queue length and latency together - and it only scales up when both agree there is real pressure.</w:t>
+        <w:pStyle w:val="Heading1"/>
+      </w:pPr>
+      <w:r>
+        <w:t>Slide 31 — Resources</w:t>
       </w:r>
     </w:p>
     <w:p>
@@ -2741,15 +2720,66 @@
         <w:rPr>
           <w:b w:val="0"/>
         </w:rPr>
-        <w:t>So it is autoscaling made for GPU inference: simple, safe on cost, driven by what the server really sees. Next, how does KAITO configures these signals.</w:t>
+        <w:t xml:space="preserve">Explore the projects, then try the KAITO + </w:t>
+      </w:r>
+      <w:r>
+        <w:rPr>
+          <w:b w:val="0"/>
+        </w:rPr>
+        <w:t>llm</w:t>
+      </w:r>
+      <w:r>
+        <w:rPr>
+          <w:b w:val="0"/>
+        </w:rPr>
+        <w:t xml:space="preserve">-d P/D guide. </w:t>
+      </w:r>
+      <w:r>
+        <w:rPr>
+          <w:b w:val="0"/>
+        </w:rPr>
+        <w:t>llm</w:t>
+      </w:r>
+      <w:r>
+        <w:rPr>
+          <w:b w:val="0"/>
+        </w:rPr>
+        <w:t xml:space="preserve">-d and KAITO are both CNCF Sandbox projects. Start with their repositories for the code, check </w:t>
+      </w:r>
+      <w:r>
+        <w:rPr>
+          <w:b w:val="0"/>
+        </w:rPr>
+        <w:t>keda</w:t>
+      </w:r>
+      <w:r>
+        <w:rPr>
+          <w:b w:val="0"/>
+        </w:rPr>
+        <w:t>-</w:t>
+      </w:r>
+      <w:r>
+        <w:rPr>
+          <w:b w:val="0"/>
+        </w:rPr>
+        <w:t>kaito</w:t>
+      </w:r>
+      <w:r>
+        <w:rPr>
+          <w:b w:val="0"/>
+        </w:rPr>
+        <w:t>-scaler for scaling details, and use the P/D guide for prerequisites and configuration.</w:t>
       </w:r>
     </w:p>
     <w:p>
       <w:pPr>
-        <w:pStyle w:val="Heading1"/>
-      </w:pPr>
-      <w:r>
-        <w:t>Slide 31 — KAITO Autoscaling: Composite Metrics</w:t>
+        <w:keepLines/>
+      </w:pPr>
+      <w:r>
+        <w:rPr>
+          <w:b w:val="0"/>
+        </w:rPr>
+        <w:t>References</w:t>
       </w:r>
     </w:p>
     <w:p>
@@ -2760,31 +2790,7 @@
         <w:rPr>
           <w:b w:val="0"/>
         </w:rPr>
-        <w:t xml:space="preserve">Here is the example config about how KAITO configures autoscaling based on two </w:t>
-      </w:r>
-      <w:r>
-        <w:rPr>
-          <w:b w:val="0"/>
-        </w:rPr>
-        <w:t>vLLM</w:t>
-      </w:r>
-      <w:r>
-        <w:rPr>
-          <w:b w:val="0"/>
-        </w:rPr>
-        <w:t xml:space="preserve"> metrics, it’s all defined in the annotations of </w:t>
-      </w:r>
-      <w:r>
-        <w:rPr>
-          <w:b w:val="0"/>
-        </w:rPr>
-        <w:t>InferenceSet</w:t>
-      </w:r>
-      <w:r>
-        <w:rPr>
-          <w:b w:val="0"/>
-        </w:rPr>
-        <w:t>.</w:t>
+        <w:t>https://github.com/llm-d</w:t>
       </w:r>
     </w:p>
     <w:p>
@@ -2795,15 +2801,18 @@
         <w:rPr>
           <w:b w:val="0"/>
         </w:rPr>
-        <w:t>While this example only works for P/D aggregation mode.</w:t>
+        <w:t>https://github.com/kaito-project/kaito</w:t>
       </w:r>
     </w:p>
     <w:p>
       <w:pPr>
-        <w:pStyle w:val="Heading1"/>
-      </w:pPr>
-      <w:r>
-        <w:t>Slide 32 — Let prefill and decode scale independently</w:t>
+        <w:keepLines/>
+      </w:pPr>
+      <w:r>
+        <w:rPr>
+          <w:b w:val="0"/>
+        </w:rPr>
+        <w:t>https://kaito-project.github.io/kaito/docs/prefill-decode-disaggregation/</w:t>
       </w:r>
     </w:p>
     <w:p>
@@ -2812,9 +2821,9 @@
       </w:pPr>
       <w:r>
         <w:rPr>
-          <w:b/>
-        </w:rPr>
-        <w:t>And for p/d disaggregation mode, there is new problem.</w:t>
+          <w:b w:val="0"/>
+        </w:rPr>
+        <w:t>https://www.cncf.io/projects/llm-d/</w:t>
       </w:r>
     </w:p>
     <w:p>
@@ -2825,13 +2834,7 @@
         <w:rPr>
           <w:b w:val="0"/>
         </w:rPr>
-        <w:t xml:space="preserve">We want to </w:t>
-      </w:r>
-      <w:r>
-        <w:rPr>
-          <w:b w:val="0"/>
-        </w:rPr>
-        <w:t>let prefill and decode scale independently.</w:t>
+        <w:t>https://www.cncf.io/projects/kaito/</w:t>
       </w:r>
     </w:p>
     <w:p>
@@ -2842,42 +2845,15 @@
         <w:rPr>
           <w:b w:val="0"/>
         </w:rPr>
-        <w:t xml:space="preserve">Prefill watches waiting requests and scales prefill </w:t>
-      </w:r>
-      <w:r>
-        <w:rPr>
-          <w:b w:val="0"/>
-        </w:rPr>
-        <w:t>InferenceSet</w:t>
-      </w:r>
-      <w:r>
-        <w:rPr>
-          <w:b w:val="0"/>
-        </w:rPr>
-        <w:t xml:space="preserve">. Decode watches running requests and scales decode </w:t>
-      </w:r>
-      <w:r>
-        <w:rPr>
-          <w:b w:val="0"/>
-        </w:rPr>
-        <w:t>InferenceSet</w:t>
-      </w:r>
-      <w:r>
-        <w:rPr>
-          <w:b w:val="0"/>
-        </w:rPr>
-        <w:t>.</w:t>
+        <w:t>https://github.com/kaito-project/keda-kaito-scaler</w:t>
       </w:r>
     </w:p>
     <w:p>
       <w:pPr>
-        <w:keepLines/>
-      </w:pPr>
-      <w:r>
-        <w:rPr>
-          <w:b w:val="0"/>
-        </w:rPr>
-        <w:t xml:space="preserve">Give each target one owner. Allow warm-up time, stabilize changes and scale down safely. </w:t>
+        <w:pStyle w:val="Heading1"/>
+      </w:pPr>
+      <w:r>
+        <w:t>Slide 32 — Where can you find us</w:t>
       </w:r>
     </w:p>
     <w:p>
@@ -2886,9 +2862,15 @@
       </w:pPr>
       <w:r>
         <w:rPr>
-          <w:b/>
-        </w:rPr>
-        <w:t>Independent capacity decisions are the goal; KEDA and HPA are the way to implement them.</w:t>
+          <w:b w:val="0"/>
+        </w:rPr>
+        <w:t>All of these components are open. On the left, you can find the llm-d website, GitHub organization, and community Slack. On the right are the KAITO documentation and GitHub organization. We welcome you to try the well-lit paths, reproduce the experiments, and bring your real workloads and feedback back to the communities.</w:t>
+      </w:r>
+      <w:r>
+        <w:rPr>
+          <w:b w:val="0"/>
+        </w:rPr>
+        <w:br/>
       </w:r>
     </w:p>
     <w:p>
@@ -2896,527 +2878,7 @@
         <w:pStyle w:val="Heading1"/>
       </w:pPr>
       <w:r>
-        <w:t>Slide 33 — KAITO autoscaling example: scale prefill and decode separately</w:t>
-      </w:r>
-    </w:p>
-    <w:p>
-      <w:pPr>
-        <w:keepLines/>
-      </w:pPr>
-      <w:r>
-        <w:rPr>
-          <w:b w:val="0"/>
-        </w:rPr>
-        <w:t xml:space="preserve">Here is the KAITO autoscaling example which could </w:t>
-      </w:r>
-      <w:r>
-        <w:rPr>
-          <w:b w:val="0"/>
-        </w:rPr>
-        <w:t>scale prefill and decode separately.</w:t>
-      </w:r>
-    </w:p>
-    <w:p>
-      <w:pPr>
-        <w:keepLines/>
-      </w:pPr>
-      <w:r>
-        <w:rPr>
-          <w:b w:val="0"/>
-        </w:rPr>
-        <w:t xml:space="preserve">In the </w:t>
-      </w:r>
-      <w:r>
-        <w:rPr>
-          <w:b w:val="0"/>
-        </w:rPr>
-        <w:t>yaml</w:t>
-      </w:r>
-      <w:r>
-        <w:rPr>
-          <w:b w:val="0"/>
-        </w:rPr>
-        <w:t xml:space="preserve"> config, we have set minimum replicas as 1, maximum replicas as 8 for prefill role, prefill would watch on </w:t>
-      </w:r>
-      <w:r>
-        <w:rPr>
-          <w:b w:val="0"/>
-        </w:rPr>
-        <w:t>vLLM</w:t>
-      </w:r>
-      <w:r>
-        <w:rPr>
-          <w:b w:val="0"/>
-        </w:rPr>
-        <w:t xml:space="preserve"> </w:t>
-      </w:r>
-      <w:r>
-        <w:rPr>
-          <w:b w:val="0"/>
-        </w:rPr>
-        <w:t xml:space="preserve">number of waiting requests metrics. And we have set </w:t>
-      </w:r>
-      <w:r>
-        <w:rPr>
-          <w:b w:val="0"/>
-        </w:rPr>
-        <w:t xml:space="preserve">minimum replicas as 2, maximum replicas as 16 for decode role, decode would watch on </w:t>
-      </w:r>
-      <w:r>
-        <w:rPr>
-          <w:b w:val="0"/>
-        </w:rPr>
-        <w:t>vLLM</w:t>
-      </w:r>
-      <w:r>
-        <w:rPr>
-          <w:b w:val="0"/>
-        </w:rPr>
-        <w:t xml:space="preserve"> </w:t>
-      </w:r>
-      <w:r>
-        <w:rPr>
-          <w:b w:val="0"/>
-        </w:rPr>
-        <w:t xml:space="preserve">number of running requests metrics. </w:t>
-      </w:r>
-    </w:p>
-    <w:p>
-      <w:pPr>
-        <w:keepLines/>
-      </w:pPr>
-      <w:r>
-        <w:rPr>
-          <w:b w:val="0"/>
-        </w:rPr>
-        <w:t>On the right side, if waiting requests is 12, running is 12, then prefill requests scale up, decode holds. And later on if running requests exceeds 24, decode can scale up on it’s own.</w:t>
-      </w:r>
-    </w:p>
-    <w:p>
-      <w:pPr>
-        <w:pStyle w:val="Heading1"/>
-      </w:pPr>
-      <w:r>
-        <w:t>Slide 34 — Scale prefill and decode using separate metrics</w:t>
-      </w:r>
-    </w:p>
-    <w:p>
-      <w:pPr>
-        <w:keepLines/>
-      </w:pPr>
-      <w:r>
-        <w:rPr>
-          <w:b w:val="0"/>
-        </w:rPr>
-        <w:t xml:space="preserve">This slide just explains the former </w:t>
-      </w:r>
-      <w:r>
-        <w:rPr>
-          <w:b w:val="0"/>
-        </w:rPr>
-        <w:t>yaml</w:t>
-      </w:r>
-      <w:r>
-        <w:rPr>
-          <w:b w:val="0"/>
-        </w:rPr>
-        <w:t xml:space="preserve"> config, KAITO </w:t>
-      </w:r>
-      <w:r>
-        <w:rPr>
-          <w:b w:val="0"/>
-        </w:rPr>
-        <w:t>scales prefill and decode using separate metrics</w:t>
-      </w:r>
-      <w:r>
-        <w:rPr>
-          <w:b w:val="0"/>
-        </w:rPr>
-        <w:t xml:space="preserve">. </w:t>
-      </w:r>
-      <w:r>
-        <w:rPr>
-          <w:b w:val="0"/>
-        </w:rPr>
-        <w:t xml:space="preserve">Verify service-to-replica mapping before averaging each role’s load. </w:t>
-      </w:r>
-    </w:p>
-    <w:p>
-      <w:pPr>
-        <w:pStyle w:val="Heading1"/>
-      </w:pPr>
-      <w:r>
-        <w:t>Slide 35 — Use derived signals to explain the load</w:t>
-      </w:r>
-    </w:p>
-    <w:p>
-      <w:pPr>
-        <w:keepLines/>
-      </w:pPr>
-      <w:r>
-        <w:rPr>
-          <w:b w:val="0"/>
-        </w:rPr>
-        <w:t xml:space="preserve">Besides the former </w:t>
-      </w:r>
-      <w:r>
-        <w:rPr>
-          <w:b w:val="0"/>
-        </w:rPr>
-        <w:t>vLLM</w:t>
-      </w:r>
-      <w:r>
-        <w:rPr>
-          <w:b w:val="0"/>
-        </w:rPr>
-        <w:t xml:space="preserve"> number of waiting requests, number of running requests, we have other </w:t>
-      </w:r>
-      <w:r>
-        <w:rPr>
-          <w:b w:val="0"/>
-        </w:rPr>
-        <w:t>vLL</w:t>
-      </w:r>
-      <w:r>
-        <w:rPr>
-          <w:b w:val="0"/>
-        </w:rPr>
-        <w:t>M</w:t>
-      </w:r>
-      <w:r>
-        <w:rPr>
-          <w:b w:val="0"/>
-        </w:rPr>
-        <w:t xml:space="preserve"> metrics, like </w:t>
-      </w:r>
-      <w:r>
-        <w:rPr>
-          <w:b w:val="0"/>
-        </w:rPr>
-        <w:t>kv_cache_usage_percentage</w:t>
-      </w:r>
-      <w:r>
-        <w:rPr>
-          <w:b w:val="0"/>
-        </w:rPr>
-        <w:t xml:space="preserve">, which monitors the </w:t>
-      </w:r>
-      <w:r>
-        <w:rPr>
-          <w:b w:val="0"/>
-        </w:rPr>
-        <w:t>kv</w:t>
-      </w:r>
-      <w:r>
-        <w:rPr>
-          <w:b w:val="0"/>
-        </w:rPr>
-        <w:t xml:space="preserve"> cache usage, and time to first token seconds which </w:t>
-      </w:r>
-      <w:r>
-        <w:rPr>
-          <w:b w:val="0"/>
-        </w:rPr>
-        <w:t>shows engine-side TTFT tails</w:t>
-      </w:r>
-      <w:r>
-        <w:rPr>
-          <w:b w:val="0"/>
-        </w:rPr>
-        <w:t>, and generation token total which shows the output rate. We could monitor on those metrics to write different autoscaling strategy for prefill and decode roles.</w:t>
-      </w:r>
-    </w:p>
-    <w:p>
-      <w:pPr>
-        <w:pStyle w:val="Heading1"/>
-      </w:pPr>
-      <w:r>
-        <w:t>Slide 36 — Where KAITO + llm-d goes next</w:t>
-      </w:r>
-    </w:p>
-    <w:p>
-      <w:pPr>
-        <w:keepLines/>
-      </w:pPr>
-      <w:r>
-        <w:rPr>
-          <w:b w:val="0"/>
-        </w:rPr>
-        <w:t xml:space="preserve">What’s the next plan for KAITO and </w:t>
-      </w:r>
-      <w:r>
-        <w:rPr>
-          <w:b w:val="0"/>
-        </w:rPr>
-        <w:t>llm</w:t>
-      </w:r>
-      <w:r>
-        <w:rPr>
-          <w:b w:val="0"/>
-        </w:rPr>
-        <w:t>-d integration.</w:t>
-      </w:r>
-    </w:p>
-    <w:p>
-      <w:pPr>
-        <w:keepLines/>
-      </w:pPr>
-      <w:r>
-        <w:rPr>
-          <w:b w:val="0"/>
-        </w:rPr>
-        <w:t xml:space="preserve">There are mainly three parts. </w:t>
-      </w:r>
-    </w:p>
-    <w:p>
-      <w:pPr>
-        <w:keepLines/>
-      </w:pPr>
-      <w:r>
-        <w:rPr>
-          <w:b w:val="0"/>
-        </w:rPr>
-        <w:t xml:space="preserve">First, we should enable precise cache aware severing, make KAITO route </w:t>
-      </w:r>
-      <w:r>
-        <w:rPr>
-          <w:b w:val="0"/>
-        </w:rPr>
-        <w:t xml:space="preserve">using KV cache events, and supports tier cache </w:t>
-      </w:r>
-      <w:r>
-        <w:rPr>
-          <w:b w:val="0"/>
-        </w:rPr>
-        <w:t>across HBM, CPU RAM</w:t>
-      </w:r>
-    </w:p>
-    <w:p>
-      <w:pPr>
-        <w:keepLines/>
-      </w:pPr>
-      <w:r>
-        <w:rPr>
-          <w:b w:val="0"/>
-        </w:rPr>
-        <w:t>and optional filesystems.</w:t>
-      </w:r>
-    </w:p>
-    <w:p>
-      <w:pPr>
-        <w:keepLines/>
-      </w:pPr>
-      <w:r>
-        <w:rPr>
-          <w:b w:val="0"/>
-        </w:rPr>
-        <w:t xml:space="preserve">Second, </w:t>
-      </w:r>
-      <w:r>
-        <w:rPr>
-          <w:b w:val="0"/>
-        </w:rPr>
-        <w:t>add Encode to Prefill / Decode, s</w:t>
-      </w:r>
-      <w:r>
-        <w:rPr>
-          <w:b w:val="0"/>
-        </w:rPr>
-        <w:t>upport more inference roles.</w:t>
-      </w:r>
-    </w:p>
-    <w:p>
-      <w:pPr>
-        <w:keepLines/>
-      </w:pPr>
-      <w:r>
-        <w:rPr>
-          <w:b w:val="0"/>
-        </w:rPr>
-        <w:t xml:space="preserve">Third, support explore wide expert parallelism, improve cross-node transport </w:t>
-      </w:r>
-      <w:r>
-        <w:rPr>
-          <w:b w:val="0"/>
-        </w:rPr>
-        <w:t>and communication.</w:t>
-      </w:r>
-    </w:p>
-    <w:p>
-      <w:pPr>
-        <w:pStyle w:val="Heading1"/>
-      </w:pPr>
-      <w:r>
-        <w:t>Slide 37 — Resources</w:t>
-      </w:r>
-    </w:p>
-    <w:p>
-      <w:pPr>
-        <w:keepLines/>
-      </w:pPr>
-      <w:r>
-        <w:rPr>
-          <w:b w:val="0"/>
-        </w:rPr>
-        <w:t xml:space="preserve">Explore the projects, then try the KAITO + </w:t>
-      </w:r>
-      <w:r>
-        <w:rPr>
-          <w:b w:val="0"/>
-        </w:rPr>
-        <w:t>llm</w:t>
-      </w:r>
-      <w:r>
-        <w:rPr>
-          <w:b w:val="0"/>
-        </w:rPr>
-        <w:t xml:space="preserve">-d P/D guide. </w:t>
-      </w:r>
-      <w:r>
-        <w:rPr>
-          <w:b w:val="0"/>
-        </w:rPr>
-        <w:t>llm</w:t>
-      </w:r>
-      <w:r>
-        <w:rPr>
-          <w:b w:val="0"/>
-        </w:rPr>
-        <w:t xml:space="preserve">-d and KAITO are both CNCF Sandbox projects. Start with their repositories for the code, check </w:t>
-      </w:r>
-      <w:r>
-        <w:rPr>
-          <w:b w:val="0"/>
-        </w:rPr>
-        <w:t>keda</w:t>
-      </w:r>
-      <w:r>
-        <w:rPr>
-          <w:b w:val="0"/>
-        </w:rPr>
-        <w:t>-</w:t>
-      </w:r>
-      <w:r>
-        <w:rPr>
-          <w:b w:val="0"/>
-        </w:rPr>
-        <w:t>kaito</w:t>
-      </w:r>
-      <w:r>
-        <w:rPr>
-          <w:b w:val="0"/>
-        </w:rPr>
-        <w:t>-scaler for scaling details, and use the P/D guide for prerequisites and configuration.</w:t>
-      </w:r>
-    </w:p>
-    <w:p>
-      <w:pPr>
-        <w:keepLines/>
-      </w:pPr>
-      <w:r>
-        <w:rPr>
-          <w:b w:val="0"/>
-        </w:rPr>
-        <w:t>References</w:t>
-      </w:r>
-    </w:p>
-    <w:p>
-      <w:pPr>
-        <w:keepLines/>
-      </w:pPr>
-      <w:r>
-        <w:rPr>
-          <w:b w:val="0"/>
-        </w:rPr>
-        <w:t>https://github.com/llm-d</w:t>
-      </w:r>
-    </w:p>
-    <w:p>
-      <w:pPr>
-        <w:keepLines/>
-      </w:pPr>
-      <w:r>
-        <w:rPr>
-          <w:b w:val="0"/>
-        </w:rPr>
-        <w:t>https://github.com/kaito-project/kaito</w:t>
-      </w:r>
-    </w:p>
-    <w:p>
-      <w:pPr>
-        <w:keepLines/>
-      </w:pPr>
-      <w:r>
-        <w:rPr>
-          <w:b w:val="0"/>
-        </w:rPr>
-        <w:t>https://kaito-project.github.io/kaito/docs/prefill-decode-disaggregation/</w:t>
-      </w:r>
-    </w:p>
-    <w:p>
-      <w:pPr>
-        <w:keepLines/>
-      </w:pPr>
-      <w:r>
-        <w:rPr>
-          <w:b w:val="0"/>
-        </w:rPr>
-        <w:t>https://www.cncf.io/projects/llm-d/</w:t>
-      </w:r>
-    </w:p>
-    <w:p>
-      <w:pPr>
-        <w:keepLines/>
-      </w:pPr>
-      <w:r>
-        <w:rPr>
-          <w:b w:val="0"/>
-        </w:rPr>
-        <w:t>https://www.cncf.io/projects/kaito/</w:t>
-      </w:r>
-    </w:p>
-    <w:p>
-      <w:pPr>
-        <w:keepLines/>
-      </w:pPr>
-      <w:r>
-        <w:rPr>
-          <w:b w:val="0"/>
-        </w:rPr>
-        <w:t>https://github.com/kaito-project/keda-kaito-scaler</w:t>
-      </w:r>
-    </w:p>
-    <w:p>
-      <w:pPr>
-        <w:pStyle w:val="Heading1"/>
-      </w:pPr>
-      <w:r>
-        <w:t>Slide 38 — Where can you find us</w:t>
-      </w:r>
-    </w:p>
-    <w:p>
-      <w:pPr>
-        <w:keepLines/>
-      </w:pPr>
-      <w:r>
-        <w:rPr>
-          <w:b w:val="0"/>
-        </w:rPr>
-        <w:t>All of these components are open. On the left, you can find the llm-d website, GitHub organization, and community Slack. On the right are the KAITO documentation and GitHub organization. We welcome you to try the well-lit paths, reproduce the experiments, and bring your real workloads and feedback back to the communities.</w:t>
-      </w:r>
-      <w:r>
-        <w:rPr>
-          <w:b w:val="0"/>
-        </w:rPr>
-        <w:br/>
-      </w:r>
-    </w:p>
-    <w:p>
-      <w:pPr>
-        <w:pStyle w:val="Heading1"/>
-      </w:pPr>
-      <w:r>
-        <w:t>Slide 39 — Thank you</w:t>
+        <w:t>Slide 33 — Thank you</w:t>
       </w:r>
     </w:p>
     <w:p>

</xml_diff>